<commit_message>
Revert repository links back to the original GitHub URL
The new KirishaTharusan repo is a separate, code-only mirror (backend,
frontend, database, testing/postman) rather than the full project - so
this repo's own citations/links should keep pointing at the complete,
documented, CI-tracked TharusanK23 repository.

Co-Authored-By: Claude Sonnet 5 <noreply@anthropic.com>
</commit_message>
<xml_diff>
--- a/docs/ASSIGNMENT_REPORT.docx
+++ b/docs/ASSIGNMENT_REPORT.docx
@@ -2523,7 +2523,7 @@
       <w:r>
         <w:fldChar w:fldCharType="separate"/>
       </w:r>
-      <w:hyperlink w:anchor="_Toc238561750" w:history="1">
+      <w:hyperlink w:anchor="_Toc238562628" w:history="1">
         <w:r>
           <w:rPr>
             <w:rStyle w:val="Hyperlink"/>
@@ -2549,7 +2549,7 @@
           <w:rPr>
             <w:noProof/>
           </w:rPr>
-          <w:instrText xml:space="preserve"> PAGEREF _Toc238561750 \h </w:instrText>
+          <w:instrText xml:space="preserve"> PAGEREF _Toc238562628 \h </w:instrText>
         </w:r>
         <w:r>
           <w:rPr>
@@ -2586,7 +2586,7 @@
           <w:noProof/>
         </w:rPr>
       </w:pPr>
-      <w:hyperlink w:anchor="_Toc238561751" w:history="1">
+      <w:hyperlink w:anchor="_Toc238562629" w:history="1">
         <w:r>
           <w:rPr>
             <w:rStyle w:val="Hyperlink"/>
@@ -2612,7 +2612,7 @@
           <w:rPr>
             <w:noProof/>
           </w:rPr>
-          <w:instrText xml:space="preserve"> PAGEREF _Toc238561751 \h </w:instrText>
+          <w:instrText xml:space="preserve"> PAGEREF _Toc238562629 \h </w:instrText>
         </w:r>
         <w:r>
           <w:rPr>
@@ -2649,7 +2649,7 @@
           <w:noProof/>
         </w:rPr>
       </w:pPr>
-      <w:hyperlink w:anchor="_Toc238561752" w:history="1">
+      <w:hyperlink w:anchor="_Toc238562630" w:history="1">
         <w:r>
           <w:rPr>
             <w:rStyle w:val="Hyperlink"/>
@@ -2675,7 +2675,7 @@
           <w:rPr>
             <w:noProof/>
           </w:rPr>
-          <w:instrText xml:space="preserve"> PAGEREF _Toc238561752 \h </w:instrText>
+          <w:instrText xml:space="preserve"> PAGEREF _Toc238562630 \h </w:instrText>
         </w:r>
         <w:r>
           <w:rPr>
@@ -2712,7 +2712,7 @@
           <w:noProof/>
         </w:rPr>
       </w:pPr>
-      <w:hyperlink w:anchor="_Toc238561753" w:history="1">
+      <w:hyperlink w:anchor="_Toc238562631" w:history="1">
         <w:r>
           <w:rPr>
             <w:rStyle w:val="Hyperlink"/>
@@ -2738,7 +2738,7 @@
           <w:rPr>
             <w:noProof/>
           </w:rPr>
-          <w:instrText xml:space="preserve"> PAGEREF _Toc238561753 \h </w:instrText>
+          <w:instrText xml:space="preserve"> PAGEREF _Toc238562631 \h </w:instrText>
         </w:r>
         <w:r>
           <w:rPr>
@@ -2775,7 +2775,7 @@
           <w:noProof/>
         </w:rPr>
       </w:pPr>
-      <w:hyperlink w:anchor="_Toc238561754" w:history="1">
+      <w:hyperlink w:anchor="_Toc238562632" w:history="1">
         <w:r>
           <w:rPr>
             <w:rStyle w:val="Hyperlink"/>
@@ -2801,7 +2801,7 @@
           <w:rPr>
             <w:noProof/>
           </w:rPr>
-          <w:instrText xml:space="preserve"> PAGEREF _Toc238561754 \h </w:instrText>
+          <w:instrText xml:space="preserve"> PAGEREF _Toc238562632 \h </w:instrText>
         </w:r>
         <w:r>
           <w:rPr>
@@ -2838,7 +2838,7 @@
           <w:noProof/>
         </w:rPr>
       </w:pPr>
-      <w:hyperlink w:anchor="_Toc238561755" w:history="1">
+      <w:hyperlink w:anchor="_Toc238562633" w:history="1">
         <w:r>
           <w:rPr>
             <w:rStyle w:val="Hyperlink"/>
@@ -2864,7 +2864,7 @@
           <w:rPr>
             <w:noProof/>
           </w:rPr>
-          <w:instrText xml:space="preserve"> PAGEREF _Toc238561755 \h </w:instrText>
+          <w:instrText xml:space="preserve"> PAGEREF _Toc238562633 \h </w:instrText>
         </w:r>
         <w:r>
           <w:rPr>
@@ -2901,7 +2901,7 @@
           <w:noProof/>
         </w:rPr>
       </w:pPr>
-      <w:hyperlink w:anchor="_Toc238561756" w:history="1">
+      <w:hyperlink w:anchor="_Toc238562634" w:history="1">
         <w:r>
           <w:rPr>
             <w:rStyle w:val="Hyperlink"/>
@@ -2927,7 +2927,7 @@
           <w:rPr>
             <w:noProof/>
           </w:rPr>
-          <w:instrText xml:space="preserve"> PAGEREF _Toc238561756 \h </w:instrText>
+          <w:instrText xml:space="preserve"> PAGEREF _Toc238562634 \h </w:instrText>
         </w:r>
         <w:r>
           <w:rPr>
@@ -2964,7 +2964,7 @@
           <w:noProof/>
         </w:rPr>
       </w:pPr>
-      <w:hyperlink w:anchor="_Toc238561757" w:history="1">
+      <w:hyperlink w:anchor="_Toc238562635" w:history="1">
         <w:r>
           <w:rPr>
             <w:rStyle w:val="Hyperlink"/>
@@ -2990,7 +2990,7 @@
           <w:rPr>
             <w:noProof/>
           </w:rPr>
-          <w:instrText xml:space="preserve"> PAGEREF _Toc238561757 \h </w:instrText>
+          <w:instrText xml:space="preserve"> PAGEREF _Toc238562635 \h </w:instrText>
         </w:r>
         <w:r>
           <w:rPr>
@@ -3027,7 +3027,7 @@
           <w:noProof/>
         </w:rPr>
       </w:pPr>
-      <w:hyperlink w:anchor="_Toc238561758" w:history="1">
+      <w:hyperlink w:anchor="_Toc238562636" w:history="1">
         <w:r>
           <w:rPr>
             <w:rStyle w:val="Hyperlink"/>
@@ -3053,7 +3053,7 @@
           <w:rPr>
             <w:noProof/>
           </w:rPr>
-          <w:instrText xml:space="preserve"> PAGEREF _Toc238561758 \h </w:instrText>
+          <w:instrText xml:space="preserve"> PAGEREF _Toc238562636 \h </w:instrText>
         </w:r>
         <w:r>
           <w:rPr>
@@ -3090,7 +3090,7 @@
           <w:noProof/>
         </w:rPr>
       </w:pPr>
-      <w:hyperlink w:anchor="_Toc238561759" w:history="1">
+      <w:hyperlink w:anchor="_Toc238562637" w:history="1">
         <w:r>
           <w:rPr>
             <w:rStyle w:val="Hyperlink"/>
@@ -3116,7 +3116,7 @@
           <w:rPr>
             <w:noProof/>
           </w:rPr>
-          <w:instrText xml:space="preserve"> PAGEREF _Toc238561759 \h </w:instrText>
+          <w:instrText xml:space="preserve"> PAGEREF _Toc238562637 \h </w:instrText>
         </w:r>
         <w:r>
           <w:rPr>
@@ -3153,7 +3153,7 @@
           <w:noProof/>
         </w:rPr>
       </w:pPr>
-      <w:hyperlink w:anchor="_Toc238561760" w:history="1">
+      <w:hyperlink w:anchor="_Toc238562638" w:history="1">
         <w:r>
           <w:rPr>
             <w:rStyle w:val="Hyperlink"/>
@@ -3179,7 +3179,7 @@
           <w:rPr>
             <w:noProof/>
           </w:rPr>
-          <w:instrText xml:space="preserve"> PAGEREF _Toc238561760 \h </w:instrText>
+          <w:instrText xml:space="preserve"> PAGEREF _Toc238562638 \h </w:instrText>
         </w:r>
         <w:r>
           <w:rPr>
@@ -3216,7 +3216,7 @@
           <w:noProof/>
         </w:rPr>
       </w:pPr>
-      <w:hyperlink w:anchor="_Toc238561761" w:history="1">
+      <w:hyperlink w:anchor="_Toc238562639" w:history="1">
         <w:r>
           <w:rPr>
             <w:rStyle w:val="Hyperlink"/>
@@ -3242,7 +3242,7 @@
           <w:rPr>
             <w:noProof/>
           </w:rPr>
-          <w:instrText xml:space="preserve"> PAGEREF _Toc238561761 \h </w:instrText>
+          <w:instrText xml:space="preserve"> PAGEREF _Toc238562639 \h </w:instrText>
         </w:r>
         <w:r>
           <w:rPr>
@@ -3279,7 +3279,7 @@
           <w:noProof/>
         </w:rPr>
       </w:pPr>
-      <w:hyperlink w:anchor="_Toc238561762" w:history="1">
+      <w:hyperlink w:anchor="_Toc238562640" w:history="1">
         <w:r>
           <w:rPr>
             <w:rStyle w:val="Hyperlink"/>
@@ -3305,7 +3305,7 @@
           <w:rPr>
             <w:noProof/>
           </w:rPr>
-          <w:instrText xml:space="preserve"> PAGEREF _Toc238561762 \h </w:instrText>
+          <w:instrText xml:space="preserve"> PAGEREF _Toc238562640 \h </w:instrText>
         </w:r>
         <w:r>
           <w:rPr>
@@ -3342,7 +3342,7 @@
           <w:noProof/>
         </w:rPr>
       </w:pPr>
-      <w:hyperlink w:anchor="_Toc238561763" w:history="1">
+      <w:hyperlink w:anchor="_Toc238562641" w:history="1">
         <w:r>
           <w:rPr>
             <w:rStyle w:val="Hyperlink"/>
@@ -3368,7 +3368,7 @@
           <w:rPr>
             <w:noProof/>
           </w:rPr>
-          <w:instrText xml:space="preserve"> PAGEREF _Toc238561763 \h </w:instrText>
+          <w:instrText xml:space="preserve"> PAGEREF _Toc238562641 \h </w:instrText>
         </w:r>
         <w:r>
           <w:rPr>
@@ -3405,7 +3405,7 @@
           <w:noProof/>
         </w:rPr>
       </w:pPr>
-      <w:hyperlink w:anchor="_Toc238561764" w:history="1">
+      <w:hyperlink w:anchor="_Toc238562642" w:history="1">
         <w:r>
           <w:rPr>
             <w:rStyle w:val="Hyperlink"/>
@@ -3431,7 +3431,7 @@
           <w:rPr>
             <w:noProof/>
           </w:rPr>
-          <w:instrText xml:space="preserve"> PAGEREF _Toc238561764 \h </w:instrText>
+          <w:instrText xml:space="preserve"> PAGEREF _Toc238562642 \h </w:instrText>
         </w:r>
         <w:r>
           <w:rPr>
@@ -3468,7 +3468,7 @@
           <w:noProof/>
         </w:rPr>
       </w:pPr>
-      <w:hyperlink w:anchor="_Toc238561765" w:history="1">
+      <w:hyperlink w:anchor="_Toc238562643" w:history="1">
         <w:r>
           <w:rPr>
             <w:rStyle w:val="Hyperlink"/>
@@ -3523,7 +3523,7 @@
           <w:rPr>
             <w:noProof/>
           </w:rPr>
-          <w:instrText xml:space="preserve"> PAGEREF _Toc238561765 \h </w:instrText>
+          <w:instrText xml:space="preserve"> PAGEREF _Toc238562643 \h </w:instrText>
         </w:r>
         <w:r>
           <w:rPr>
@@ -3560,7 +3560,7 @@
           <w:noProof/>
         </w:rPr>
       </w:pPr>
-      <w:hyperlink w:anchor="_Toc238561766" w:history="1">
+      <w:hyperlink w:anchor="_Toc238562644" w:history="1">
         <w:r>
           <w:rPr>
             <w:rStyle w:val="Hyperlink"/>
@@ -3596,7 +3596,7 @@
           <w:rPr>
             <w:noProof/>
           </w:rPr>
-          <w:instrText xml:space="preserve"> PAGEREF _Toc238561766 \h </w:instrText>
+          <w:instrText xml:space="preserve"> PAGEREF _Toc238562644 \h </w:instrText>
         </w:r>
         <w:r>
           <w:rPr>
@@ -3633,7 +3633,7 @@
           <w:noProof/>
         </w:rPr>
       </w:pPr>
-      <w:hyperlink w:anchor="_Toc238561767" w:history="1">
+      <w:hyperlink w:anchor="_Toc238562645" w:history="1">
         <w:r>
           <w:rPr>
             <w:rStyle w:val="Hyperlink"/>
@@ -3669,7 +3669,7 @@
           <w:rPr>
             <w:noProof/>
           </w:rPr>
-          <w:instrText xml:space="preserve"> PAGEREF _Toc238561767 \h </w:instrText>
+          <w:instrText xml:space="preserve"> PAGEREF _Toc238562645 \h </w:instrText>
         </w:r>
         <w:r>
           <w:rPr>
@@ -3706,7 +3706,7 @@
           <w:noProof/>
         </w:rPr>
       </w:pPr>
-      <w:hyperlink w:anchor="_Toc238561768" w:history="1">
+      <w:hyperlink w:anchor="_Toc238562646" w:history="1">
         <w:r>
           <w:rPr>
             <w:rStyle w:val="Hyperlink"/>
@@ -3761,7 +3761,7 @@
           <w:rPr>
             <w:noProof/>
           </w:rPr>
-          <w:instrText xml:space="preserve"> PAGEREF _Toc238561768 \h </w:instrText>
+          <w:instrText xml:space="preserve"> PAGEREF _Toc238562646 \h </w:instrText>
         </w:r>
         <w:r>
           <w:rPr>
@@ -3798,7 +3798,7 @@
           <w:noProof/>
         </w:rPr>
       </w:pPr>
-      <w:hyperlink w:anchor="_Toc238561769" w:history="1">
+      <w:hyperlink w:anchor="_Toc238562647" w:history="1">
         <w:r>
           <w:rPr>
             <w:rStyle w:val="Hyperlink"/>
@@ -3853,7 +3853,7 @@
           <w:rPr>
             <w:noProof/>
           </w:rPr>
-          <w:instrText xml:space="preserve"> PAGEREF _Toc238561769 \h </w:instrText>
+          <w:instrText xml:space="preserve"> PAGEREF _Toc238562647 \h </w:instrText>
         </w:r>
         <w:r>
           <w:rPr>
@@ -3890,7 +3890,7 @@
           <w:noProof/>
         </w:rPr>
       </w:pPr>
-      <w:hyperlink w:anchor="_Toc238561770" w:history="1">
+      <w:hyperlink w:anchor="_Toc238562648" w:history="1">
         <w:r>
           <w:rPr>
             <w:rStyle w:val="Hyperlink"/>
@@ -3916,7 +3916,7 @@
           <w:rPr>
             <w:noProof/>
           </w:rPr>
-          <w:instrText xml:space="preserve"> PAGEREF _Toc238561770 \h </w:instrText>
+          <w:instrText xml:space="preserve"> PAGEREF _Toc238562648 \h </w:instrText>
         </w:r>
         <w:r>
           <w:rPr>
@@ -3953,7 +3953,7 @@
           <w:noProof/>
         </w:rPr>
       </w:pPr>
-      <w:hyperlink w:anchor="_Toc238561771" w:history="1">
+      <w:hyperlink w:anchor="_Toc238562649" w:history="1">
         <w:r>
           <w:rPr>
             <w:rStyle w:val="Hyperlink"/>
@@ -3979,7 +3979,7 @@
           <w:rPr>
             <w:noProof/>
           </w:rPr>
-          <w:instrText xml:space="preserve"> PAGEREF _Toc238561771 \h </w:instrText>
+          <w:instrText xml:space="preserve"> PAGEREF _Toc238562649 \h </w:instrText>
         </w:r>
         <w:r>
           <w:rPr>
@@ -4016,7 +4016,7 @@
           <w:noProof/>
         </w:rPr>
       </w:pPr>
-      <w:hyperlink w:anchor="_Toc238561772" w:history="1">
+      <w:hyperlink w:anchor="_Toc238562650" w:history="1">
         <w:r>
           <w:rPr>
             <w:rStyle w:val="Hyperlink"/>
@@ -4042,7 +4042,7 @@
           <w:rPr>
             <w:noProof/>
           </w:rPr>
-          <w:instrText xml:space="preserve"> PAGEREF _Toc238561772 \h </w:instrText>
+          <w:instrText xml:space="preserve"> PAGEREF _Toc238562650 \h </w:instrText>
         </w:r>
         <w:r>
           <w:rPr>
@@ -4079,7 +4079,7 @@
           <w:noProof/>
         </w:rPr>
       </w:pPr>
-      <w:hyperlink w:anchor="_Toc238561773" w:history="1">
+      <w:hyperlink w:anchor="_Toc238562651" w:history="1">
         <w:r>
           <w:rPr>
             <w:rStyle w:val="Hyperlink"/>
@@ -4105,7 +4105,7 @@
           <w:rPr>
             <w:noProof/>
           </w:rPr>
-          <w:instrText xml:space="preserve"> PAGEREF _Toc238561773 \h </w:instrText>
+          <w:instrText xml:space="preserve"> PAGEREF _Toc238562651 \h </w:instrText>
         </w:r>
         <w:r>
           <w:rPr>
@@ -4142,7 +4142,7 @@
           <w:noProof/>
         </w:rPr>
       </w:pPr>
-      <w:hyperlink w:anchor="_Toc238561774" w:history="1">
+      <w:hyperlink w:anchor="_Toc238562652" w:history="1">
         <w:r>
           <w:rPr>
             <w:rStyle w:val="Hyperlink"/>
@@ -4168,7 +4168,7 @@
           <w:rPr>
             <w:noProof/>
           </w:rPr>
-          <w:instrText xml:space="preserve"> PAGEREF _Toc238561774 \h </w:instrText>
+          <w:instrText xml:space="preserve"> PAGEREF _Toc238562652 \h </w:instrText>
         </w:r>
         <w:r>
           <w:rPr>
@@ -4205,7 +4205,7 @@
           <w:noProof/>
         </w:rPr>
       </w:pPr>
-      <w:hyperlink w:anchor="_Toc238561775" w:history="1">
+      <w:hyperlink w:anchor="_Toc238562653" w:history="1">
         <w:r>
           <w:rPr>
             <w:rStyle w:val="Hyperlink"/>
@@ -4231,7 +4231,7 @@
           <w:rPr>
             <w:noProof/>
           </w:rPr>
-          <w:instrText xml:space="preserve"> PAGEREF _Toc238561775 \h </w:instrText>
+          <w:instrText xml:space="preserve"> PAGEREF _Toc238562653 \h </w:instrText>
         </w:r>
         <w:r>
           <w:rPr>
@@ -4268,7 +4268,7 @@
           <w:noProof/>
         </w:rPr>
       </w:pPr>
-      <w:hyperlink w:anchor="_Toc238561776" w:history="1">
+      <w:hyperlink w:anchor="_Toc238562654" w:history="1">
         <w:r>
           <w:rPr>
             <w:rStyle w:val="Hyperlink"/>
@@ -4294,7 +4294,7 @@
           <w:rPr>
             <w:noProof/>
           </w:rPr>
-          <w:instrText xml:space="preserve"> PAGEREF _Toc238561776 \h </w:instrText>
+          <w:instrText xml:space="preserve"> PAGEREF _Toc238562654 \h </w:instrText>
         </w:r>
         <w:r>
           <w:rPr>
@@ -4331,7 +4331,7 @@
           <w:noProof/>
         </w:rPr>
       </w:pPr>
-      <w:hyperlink w:anchor="_Toc238561777" w:history="1">
+      <w:hyperlink w:anchor="_Toc238562655" w:history="1">
         <w:r>
           <w:rPr>
             <w:rStyle w:val="Hyperlink"/>
@@ -4357,7 +4357,7 @@
           <w:rPr>
             <w:noProof/>
           </w:rPr>
-          <w:instrText xml:space="preserve"> PAGEREF _Toc238561777 \h </w:instrText>
+          <w:instrText xml:space="preserve"> PAGEREF _Toc238562655 \h </w:instrText>
         </w:r>
         <w:r>
           <w:rPr>
@@ -4394,7 +4394,7 @@
           <w:noProof/>
         </w:rPr>
       </w:pPr>
-      <w:hyperlink w:anchor="_Toc238561778" w:history="1">
+      <w:hyperlink w:anchor="_Toc238562656" w:history="1">
         <w:r>
           <w:rPr>
             <w:rStyle w:val="Hyperlink"/>
@@ -4420,7 +4420,7 @@
           <w:rPr>
             <w:noProof/>
           </w:rPr>
-          <w:instrText xml:space="preserve"> PAGEREF _Toc238561778 \h </w:instrText>
+          <w:instrText xml:space="preserve"> PAGEREF _Toc238562656 \h </w:instrText>
         </w:r>
         <w:r>
           <w:rPr>
@@ -4457,7 +4457,7 @@
           <w:noProof/>
         </w:rPr>
       </w:pPr>
-      <w:hyperlink w:anchor="_Toc238561779" w:history="1">
+      <w:hyperlink w:anchor="_Toc238562657" w:history="1">
         <w:r>
           <w:rPr>
             <w:rStyle w:val="Hyperlink"/>
@@ -4483,7 +4483,7 @@
           <w:rPr>
             <w:noProof/>
           </w:rPr>
-          <w:instrText xml:space="preserve"> PAGEREF _Toc238561779 \h </w:instrText>
+          <w:instrText xml:space="preserve"> PAGEREF _Toc238562657 \h </w:instrText>
         </w:r>
         <w:r>
           <w:rPr>
@@ -4520,7 +4520,7 @@
           <w:noProof/>
         </w:rPr>
       </w:pPr>
-      <w:hyperlink w:anchor="_Toc238561780" w:history="1">
+      <w:hyperlink w:anchor="_Toc238562658" w:history="1">
         <w:r>
           <w:rPr>
             <w:rStyle w:val="Hyperlink"/>
@@ -4546,7 +4546,7 @@
           <w:rPr>
             <w:noProof/>
           </w:rPr>
-          <w:instrText xml:space="preserve"> PAGEREF _Toc238561780 \h </w:instrText>
+          <w:instrText xml:space="preserve"> PAGEREF _Toc238562658 \h </w:instrText>
         </w:r>
         <w:r>
           <w:rPr>
@@ -4583,7 +4583,7 @@
           <w:noProof/>
         </w:rPr>
       </w:pPr>
-      <w:hyperlink w:anchor="_Toc238561781" w:history="1">
+      <w:hyperlink w:anchor="_Toc238562659" w:history="1">
         <w:r>
           <w:rPr>
             <w:rStyle w:val="Hyperlink"/>
@@ -4609,7 +4609,7 @@
           <w:rPr>
             <w:noProof/>
           </w:rPr>
-          <w:instrText xml:space="preserve"> PAGEREF _Toc238561781 \h </w:instrText>
+          <w:instrText xml:space="preserve"> PAGEREF _Toc238562659 \h </w:instrText>
         </w:r>
         <w:r>
           <w:rPr>
@@ -4646,7 +4646,7 @@
           <w:noProof/>
         </w:rPr>
       </w:pPr>
-      <w:hyperlink w:anchor="_Toc238561782" w:history="1">
+      <w:hyperlink w:anchor="_Toc238562660" w:history="1">
         <w:r>
           <w:rPr>
             <w:rStyle w:val="Hyperlink"/>
@@ -4672,7 +4672,7 @@
           <w:rPr>
             <w:noProof/>
           </w:rPr>
-          <w:instrText xml:space="preserve"> PAGEREF _Toc238561782 \h </w:instrText>
+          <w:instrText xml:space="preserve"> PAGEREF _Toc238562660 \h </w:instrText>
         </w:r>
         <w:r>
           <w:rPr>
@@ -4709,7 +4709,7 @@
           <w:noProof/>
         </w:rPr>
       </w:pPr>
-      <w:hyperlink w:anchor="_Toc238561783" w:history="1">
+      <w:hyperlink w:anchor="_Toc238562661" w:history="1">
         <w:r>
           <w:rPr>
             <w:rStyle w:val="Hyperlink"/>
@@ -4735,7 +4735,7 @@
           <w:rPr>
             <w:noProof/>
           </w:rPr>
-          <w:instrText xml:space="preserve"> PAGEREF _Toc238561783 \h </w:instrText>
+          <w:instrText xml:space="preserve"> PAGEREF _Toc238562661 \h </w:instrText>
         </w:r>
         <w:r>
           <w:rPr>
@@ -4772,7 +4772,7 @@
           <w:noProof/>
         </w:rPr>
       </w:pPr>
-      <w:hyperlink w:anchor="_Toc238561784" w:history="1">
+      <w:hyperlink w:anchor="_Toc238562662" w:history="1">
         <w:r>
           <w:rPr>
             <w:rStyle w:val="Hyperlink"/>
@@ -4798,7 +4798,7 @@
           <w:rPr>
             <w:noProof/>
           </w:rPr>
-          <w:instrText xml:space="preserve"> PAGEREF _Toc238561784 \h </w:instrText>
+          <w:instrText xml:space="preserve"> PAGEREF _Toc238562662 \h </w:instrText>
         </w:r>
         <w:r>
           <w:rPr>
@@ -4835,7 +4835,7 @@
           <w:noProof/>
         </w:rPr>
       </w:pPr>
-      <w:hyperlink w:anchor="_Toc238561785" w:history="1">
+      <w:hyperlink w:anchor="_Toc238562663" w:history="1">
         <w:r>
           <w:rPr>
             <w:rStyle w:val="Hyperlink"/>
@@ -4861,7 +4861,7 @@
           <w:rPr>
             <w:noProof/>
           </w:rPr>
-          <w:instrText xml:space="preserve"> PAGEREF _Toc238561785 \h </w:instrText>
+          <w:instrText xml:space="preserve"> PAGEREF _Toc238562663 \h </w:instrText>
         </w:r>
         <w:r>
           <w:rPr>
@@ -4898,7 +4898,7 @@
           <w:noProof/>
         </w:rPr>
       </w:pPr>
-      <w:hyperlink w:anchor="_Toc238561786" w:history="1">
+      <w:hyperlink w:anchor="_Toc238562664" w:history="1">
         <w:r>
           <w:rPr>
             <w:rStyle w:val="Hyperlink"/>
@@ -4924,7 +4924,7 @@
           <w:rPr>
             <w:noProof/>
           </w:rPr>
-          <w:instrText xml:space="preserve"> PAGEREF _Toc238561786 \h </w:instrText>
+          <w:instrText xml:space="preserve"> PAGEREF _Toc238562664 \h </w:instrText>
         </w:r>
         <w:r>
           <w:rPr>
@@ -4961,7 +4961,7 @@
           <w:noProof/>
         </w:rPr>
       </w:pPr>
-      <w:hyperlink w:anchor="_Toc238561787" w:history="1">
+      <w:hyperlink w:anchor="_Toc238562665" w:history="1">
         <w:r>
           <w:rPr>
             <w:rStyle w:val="Hyperlink"/>
@@ -4987,7 +4987,7 @@
           <w:rPr>
             <w:noProof/>
           </w:rPr>
-          <w:instrText xml:space="preserve"> PAGEREF _Toc238561787 \h </w:instrText>
+          <w:instrText xml:space="preserve"> PAGEREF _Toc238562665 \h </w:instrText>
         </w:r>
         <w:r>
           <w:rPr>
@@ -5113,7 +5113,7 @@
             <w:color w:val="0B3954"/>
             <w:u w:val="single"/>
           </w:rPr>
-          <w:t>https://github.com/KirishaTharusan/sunrise-dental-clinic</w:t>
+          <w:t>https://github.com/TharusanK23/sunrise-dental-clinic</w:t>
         </w:r>
       </w:hyperlink>
     </w:p>
@@ -5225,7 +5225,7 @@
         <w:pStyle w:val="Heading2"/>
         <w:spacing w:before="240" w:after="120" w:line="360" w:lineRule="auto"/>
       </w:pPr>
-      <w:bookmarkStart w:id="0" w:name="_Toc238561750"/>
+      <w:bookmarkStart w:id="0" w:name="_Toc238562628"/>
       <w:r>
         <w:rPr>
           <w:b/>
@@ -5267,7 +5267,7 @@
         <w:pStyle w:val="Heading3"/>
         <w:spacing w:before="240" w:after="120" w:line="360" w:lineRule="auto"/>
       </w:pPr>
-      <w:bookmarkStart w:id="1" w:name="_Toc238561751"/>
+      <w:bookmarkStart w:id="1" w:name="_Toc238562629"/>
       <w:r>
         <w:rPr>
           <w:b/>
@@ -5389,7 +5389,7 @@
         <w:pStyle w:val="Heading3"/>
         <w:spacing w:before="240" w:after="120" w:line="360" w:lineRule="auto"/>
       </w:pPr>
-      <w:bookmarkStart w:id="2" w:name="_Toc238561752"/>
+      <w:bookmarkStart w:id="2" w:name="_Toc238562630"/>
       <w:r>
         <w:rPr>
           <w:b/>
@@ -5463,7 +5463,7 @@
         <w:pStyle w:val="Heading2"/>
         <w:spacing w:before="240" w:after="120" w:line="360" w:lineRule="auto"/>
       </w:pPr>
-      <w:bookmarkStart w:id="3" w:name="_Toc238561753"/>
+      <w:bookmarkStart w:id="3" w:name="_Toc238562631"/>
       <w:r>
         <w:rPr>
           <w:b/>
@@ -5516,7 +5516,7 @@
         <w:pStyle w:val="Heading3"/>
         <w:spacing w:before="240" w:after="120" w:line="360" w:lineRule="auto"/>
       </w:pPr>
-      <w:bookmarkStart w:id="4" w:name="_Toc238561754"/>
+      <w:bookmarkStart w:id="4" w:name="_Toc238562632"/>
       <w:r>
         <w:rPr>
           <w:b/>
@@ -5539,7 +5539,7 @@
         </w:rPr>
         <w:lastRenderedPageBreak/>
         <w:drawing>
-          <wp:inline distT="0" distB="0" distL="0" distR="0" wp14:anchorId="0313D8A9" wp14:editId="2B6B7B80">
+          <wp:inline distT="0" distB="0" distL="0" distR="0" wp14:anchorId="22468E0B" wp14:editId="07C41218">
             <wp:extent cx="5334000" cy="4486275"/>
             <wp:effectExtent l="0" t="0" r="0" b="0"/>
             <wp:docPr id="1" name="Picture 1"/>
@@ -5786,7 +5786,7 @@
         <w:pStyle w:val="Heading3"/>
         <w:spacing w:before="240" w:after="120" w:line="360" w:lineRule="auto"/>
       </w:pPr>
-      <w:bookmarkStart w:id="5" w:name="_Toc238561755"/>
+      <w:bookmarkStart w:id="5" w:name="_Toc238562633"/>
       <w:r>
         <w:rPr>
           <w:b/>
@@ -5808,10 +5808,10 @@
           <w:noProof/>
         </w:rPr>
         <w:drawing>
-          <wp:inline distT="0" distB="0" distL="0" distR="0" wp14:anchorId="556DA881" wp14:editId="6AE646E2">
+          <wp:inline distT="0" distB="0" distL="0" distR="0" wp14:anchorId="07F6CAE2" wp14:editId="21D2015E">
             <wp:extent cx="5334000" cy="3057525"/>
             <wp:effectExtent l="0" t="0" r="0" b="0"/>
-            <wp:docPr id="505833246" name="Picture 505833246"/>
+            <wp:docPr id="1354579079" name="Picture 1354579079"/>
             <wp:cNvGraphicFramePr>
               <a:graphicFrameLocks xmlns:a="http://schemas.openxmlformats.org/drawingml/2006/main" noChangeAspect="1"/>
             </wp:cNvGraphicFramePr>
@@ -6201,7 +6201,7 @@
         <w:pStyle w:val="Heading3"/>
         <w:spacing w:before="240" w:after="120" w:line="360" w:lineRule="auto"/>
       </w:pPr>
-      <w:bookmarkStart w:id="6" w:name="_Toc238561756"/>
+      <w:bookmarkStart w:id="6" w:name="_Toc238562634"/>
       <w:r>
         <w:rPr>
           <w:b/>
@@ -6446,10 +6446,10 @@
         </w:rPr>
         <w:lastRenderedPageBreak/>
         <w:drawing>
-          <wp:inline distT="0" distB="0" distL="0" distR="0" wp14:anchorId="1F3A4D21" wp14:editId="1AADBCBD">
+          <wp:inline distT="0" distB="0" distL="0" distR="0" wp14:anchorId="108B2EA5" wp14:editId="46892BF5">
             <wp:extent cx="5334000" cy="2933700"/>
             <wp:effectExtent l="0" t="0" r="0" b="0"/>
-            <wp:docPr id="223483030" name="Picture 223483030"/>
+            <wp:docPr id="1138712380" name="Picture 1138712380"/>
             <wp:cNvGraphicFramePr>
               <a:graphicFrameLocks xmlns:a="http://schemas.openxmlformats.org/drawingml/2006/main" noChangeAspect="1"/>
             </wp:cNvGraphicFramePr>
@@ -6510,10 +6510,10 @@
           <w:noProof/>
         </w:rPr>
         <w:drawing>
-          <wp:inline distT="0" distB="0" distL="0" distR="0" wp14:anchorId="162E58A8" wp14:editId="0B0BEF24">
+          <wp:inline distT="0" distB="0" distL="0" distR="0" wp14:anchorId="176842CD" wp14:editId="15D7826D">
             <wp:extent cx="5334000" cy="3686175"/>
             <wp:effectExtent l="0" t="0" r="0" b="0"/>
-            <wp:docPr id="1003334436" name="Picture 1003334436"/>
+            <wp:docPr id="330572062" name="Picture 330572062"/>
             <wp:cNvGraphicFramePr>
               <a:graphicFrameLocks xmlns:a="http://schemas.openxmlformats.org/drawingml/2006/main" noChangeAspect="1"/>
             </wp:cNvGraphicFramePr>
@@ -6575,10 +6575,10 @@
         </w:rPr>
         <w:lastRenderedPageBreak/>
         <w:drawing>
-          <wp:inline distT="0" distB="0" distL="0" distR="0" wp14:anchorId="63E1DDD7" wp14:editId="6B086FEC">
+          <wp:inline distT="0" distB="0" distL="0" distR="0" wp14:anchorId="07B33BCF" wp14:editId="020A2E1F">
             <wp:extent cx="5334000" cy="3086100"/>
             <wp:effectExtent l="0" t="0" r="0" b="0"/>
-            <wp:docPr id="1582138120" name="Picture 1582138120"/>
+            <wp:docPr id="1867379640" name="Picture 1867379640"/>
             <wp:cNvGraphicFramePr>
               <a:graphicFrameLocks xmlns:a="http://schemas.openxmlformats.org/drawingml/2006/main" noChangeAspect="1"/>
             </wp:cNvGraphicFramePr>
@@ -6634,7 +6634,7 @@
         <w:pStyle w:val="Heading3"/>
         <w:spacing w:before="240" w:after="120" w:line="360" w:lineRule="auto"/>
       </w:pPr>
-      <w:bookmarkStart w:id="7" w:name="_Toc238561757"/>
+      <w:bookmarkStart w:id="7" w:name="_Toc238562635"/>
       <w:r>
         <w:rPr>
           <w:b/>
@@ -6657,10 +6657,10 @@
         </w:rPr>
         <w:lastRenderedPageBreak/>
         <w:drawing>
-          <wp:inline distT="0" distB="0" distL="0" distR="0" wp14:anchorId="3DBAA360" wp14:editId="3C1A706B">
+          <wp:inline distT="0" distB="0" distL="0" distR="0" wp14:anchorId="5B981E65" wp14:editId="75D2FF4D">
             <wp:extent cx="5334000" cy="6229350"/>
             <wp:effectExtent l="0" t="0" r="0" b="0"/>
-            <wp:docPr id="1268883537" name="Picture 1268883537"/>
+            <wp:docPr id="516096787" name="Picture 516096787"/>
             <wp:cNvGraphicFramePr>
               <a:graphicFrameLocks xmlns:a="http://schemas.openxmlformats.org/drawingml/2006/main" noChangeAspect="1"/>
             </wp:cNvGraphicFramePr>
@@ -6737,7 +6737,7 @@
         <w:pStyle w:val="Heading3"/>
         <w:spacing w:before="240" w:after="120" w:line="360" w:lineRule="auto"/>
       </w:pPr>
-      <w:bookmarkStart w:id="8" w:name="_Toc238561758"/>
+      <w:bookmarkStart w:id="8" w:name="_Toc238562636"/>
       <w:r>
         <w:rPr>
           <w:b/>
@@ -6788,7 +6788,7 @@
         <w:pStyle w:val="Heading3"/>
         <w:spacing w:before="240" w:after="120" w:line="360" w:lineRule="auto"/>
       </w:pPr>
-      <w:bookmarkStart w:id="9" w:name="_Toc238561759"/>
+      <w:bookmarkStart w:id="9" w:name="_Toc238562637"/>
       <w:r>
         <w:rPr>
           <w:b/>
@@ -6861,10 +6861,10 @@
           <w:noProof/>
         </w:rPr>
         <w:drawing>
-          <wp:inline distT="0" distB="0" distL="0" distR="0" wp14:anchorId="5D578AD7" wp14:editId="02764F5F">
+          <wp:inline distT="0" distB="0" distL="0" distR="0" wp14:anchorId="3A99326C" wp14:editId="2230200B">
             <wp:extent cx="5334000" cy="2714625"/>
             <wp:effectExtent l="0" t="0" r="0" b="0"/>
-            <wp:docPr id="13259608" name="Picture 13259608"/>
+            <wp:docPr id="371851070" name="Picture 371851070"/>
             <wp:cNvGraphicFramePr>
               <a:graphicFrameLocks xmlns:a="http://schemas.openxmlformats.org/drawingml/2006/main" noChangeAspect="1"/>
             </wp:cNvGraphicFramePr>
@@ -6968,7 +6968,7 @@
         <w:pStyle w:val="Heading2"/>
         <w:spacing w:before="240" w:after="120" w:line="360" w:lineRule="auto"/>
       </w:pPr>
-      <w:bookmarkStart w:id="10" w:name="_Toc238561760"/>
+      <w:bookmarkStart w:id="10" w:name="_Toc238562638"/>
       <w:r>
         <w:rPr>
           <w:b/>
@@ -6985,7 +6985,7 @@
         <w:pStyle w:val="Heading3"/>
         <w:spacing w:before="240" w:after="120" w:line="360" w:lineRule="auto"/>
       </w:pPr>
-      <w:bookmarkStart w:id="11" w:name="_Toc238561761"/>
+      <w:bookmarkStart w:id="11" w:name="_Toc238562639"/>
       <w:r>
         <w:rPr>
           <w:b/>
@@ -7132,7 +7132,7 @@
         <w:pStyle w:val="Heading3"/>
         <w:spacing w:before="240" w:after="120" w:line="360" w:lineRule="auto"/>
       </w:pPr>
-      <w:bookmarkStart w:id="12" w:name="_Toc238561762"/>
+      <w:bookmarkStart w:id="12" w:name="_Toc238562640"/>
       <w:r>
         <w:rPr>
           <w:b/>
@@ -7259,7 +7259,7 @@
         <w:pStyle w:val="Heading4"/>
         <w:spacing w:before="240" w:after="120" w:line="360" w:lineRule="auto"/>
       </w:pPr>
-      <w:bookmarkStart w:id="13" w:name="_Toc238561763"/>
+      <w:bookmarkStart w:id="13" w:name="_Toc238562641"/>
       <w:r>
         <w:rPr>
           <w:b/>
@@ -7309,10 +7309,10 @@
         </w:rPr>
         <w:lastRenderedPageBreak/>
         <w:drawing>
-          <wp:inline distT="0" distB="0" distL="0" distR="0" wp14:anchorId="0FCFAD42" wp14:editId="2D3663DE">
+          <wp:inline distT="0" distB="0" distL="0" distR="0" wp14:anchorId="2B4A126D" wp14:editId="53B19D90">
             <wp:extent cx="5334000" cy="5181600"/>
             <wp:effectExtent l="0" t="0" r="0" b="0"/>
-            <wp:docPr id="1872290202" name="Picture 1872290202"/>
+            <wp:docPr id="585580651" name="Picture 585580651"/>
             <wp:cNvGraphicFramePr>
               <a:graphicFrameLocks xmlns:a="http://schemas.openxmlformats.org/drawingml/2006/main" noChangeAspect="1"/>
             </wp:cNvGraphicFramePr>
@@ -7556,10 +7556,10 @@
         </w:rPr>
         <w:lastRenderedPageBreak/>
         <w:drawing>
-          <wp:inline distT="0" distB="0" distL="0" distR="0" wp14:anchorId="1AA2108B" wp14:editId="5661769E">
+          <wp:inline distT="0" distB="0" distL="0" distR="0" wp14:anchorId="5FF67F78" wp14:editId="0E84F67D">
             <wp:extent cx="5334000" cy="5181600"/>
             <wp:effectExtent l="0" t="0" r="0" b="0"/>
-            <wp:docPr id="583387861" name="Picture 583387861"/>
+            <wp:docPr id="885982686" name="Picture 885982686"/>
             <wp:cNvGraphicFramePr>
               <a:graphicFrameLocks xmlns:a="http://schemas.openxmlformats.org/drawingml/2006/main" noChangeAspect="1"/>
             </wp:cNvGraphicFramePr>
@@ -7666,10 +7666,10 @@
         </w:rPr>
         <w:lastRenderedPageBreak/>
         <w:drawing>
-          <wp:inline distT="0" distB="0" distL="0" distR="0" wp14:anchorId="7410683B" wp14:editId="347BA1A9">
+          <wp:inline distT="0" distB="0" distL="0" distR="0" wp14:anchorId="1DF0CF5C" wp14:editId="3A4FCDDF">
             <wp:extent cx="5334000" cy="5181600"/>
             <wp:effectExtent l="0" t="0" r="0" b="0"/>
-            <wp:docPr id="978543244" name="Picture 978543244"/>
+            <wp:docPr id="349411157" name="Picture 349411157"/>
             <wp:cNvGraphicFramePr>
               <a:graphicFrameLocks xmlns:a="http://schemas.openxmlformats.org/drawingml/2006/main" noChangeAspect="1"/>
             </wp:cNvGraphicFramePr>
@@ -7817,10 +7817,10 @@
         </w:rPr>
         <w:lastRenderedPageBreak/>
         <w:drawing>
-          <wp:inline distT="0" distB="0" distL="0" distR="0" wp14:anchorId="05F59E8C" wp14:editId="3AD025A5">
+          <wp:inline distT="0" distB="0" distL="0" distR="0" wp14:anchorId="2299A880" wp14:editId="7BE1EAB9">
             <wp:extent cx="5334000" cy="5181600"/>
             <wp:effectExtent l="0" t="0" r="0" b="0"/>
-            <wp:docPr id="14361081" name="Picture 14361081"/>
+            <wp:docPr id="958046930" name="Picture 958046930"/>
             <wp:cNvGraphicFramePr>
               <a:graphicFrameLocks xmlns:a="http://schemas.openxmlformats.org/drawingml/2006/main" noChangeAspect="1"/>
             </wp:cNvGraphicFramePr>
@@ -7912,7 +7912,7 @@
         <w:pStyle w:val="Heading3"/>
         <w:spacing w:before="240" w:after="120" w:line="360" w:lineRule="auto"/>
       </w:pPr>
-      <w:bookmarkStart w:id="14" w:name="_Toc238561764"/>
+      <w:bookmarkStart w:id="14" w:name="_Toc238562642"/>
       <w:r>
         <w:rPr>
           <w:b/>
@@ -7938,7 +7938,7 @@
         <w:pStyle w:val="Heading4"/>
         <w:spacing w:before="240" w:after="120" w:line="360" w:lineRule="auto"/>
       </w:pPr>
-      <w:bookmarkStart w:id="15" w:name="_Toc238561765"/>
+      <w:bookmarkStart w:id="15" w:name="_Toc238562643"/>
       <w:r>
         <w:rPr>
           <w:b/>
@@ -8217,7 +8217,7 @@
         <w:pStyle w:val="Heading4"/>
         <w:spacing w:before="240" w:after="120" w:line="360" w:lineRule="auto"/>
       </w:pPr>
-      <w:bookmarkStart w:id="16" w:name="_Toc238561766"/>
+      <w:bookmarkStart w:id="16" w:name="_Toc238562644"/>
       <w:r>
         <w:rPr>
           <w:b/>
@@ -8418,7 +8418,7 @@
         <w:pStyle w:val="Heading4"/>
         <w:spacing w:before="240" w:after="120" w:line="360" w:lineRule="auto"/>
       </w:pPr>
-      <w:bookmarkStart w:id="17" w:name="_Toc238561767"/>
+      <w:bookmarkStart w:id="17" w:name="_Toc238562645"/>
       <w:r>
         <w:rPr>
           <w:b/>
@@ -8605,7 +8605,7 @@
         <w:pStyle w:val="Heading4"/>
         <w:spacing w:before="240" w:after="120" w:line="360" w:lineRule="auto"/>
       </w:pPr>
-      <w:bookmarkStart w:id="18" w:name="_Toc238561768"/>
+      <w:bookmarkStart w:id="18" w:name="_Toc238562646"/>
       <w:r>
         <w:rPr>
           <w:b/>
@@ -8834,7 +8834,7 @@
         <w:pStyle w:val="Heading4"/>
         <w:spacing w:before="240" w:after="120" w:line="360" w:lineRule="auto"/>
       </w:pPr>
-      <w:bookmarkStart w:id="19" w:name="_Toc238561769"/>
+      <w:bookmarkStart w:id="19" w:name="_Toc238562647"/>
       <w:r>
         <w:rPr>
           <w:b/>
@@ -9106,7 +9106,7 @@
         <w:pStyle w:val="Heading4"/>
         <w:spacing w:before="240" w:after="120" w:line="360" w:lineRule="auto"/>
       </w:pPr>
-      <w:bookmarkStart w:id="20" w:name="_Toc238561770"/>
+      <w:bookmarkStart w:id="20" w:name="_Toc238562648"/>
       <w:r>
         <w:rPr>
           <w:b/>
@@ -9225,7 +9225,7 @@
         <w:pStyle w:val="Heading3"/>
         <w:spacing w:before="240" w:after="120" w:line="360" w:lineRule="auto"/>
       </w:pPr>
-      <w:bookmarkStart w:id="21" w:name="_Toc238561771"/>
+      <w:bookmarkStart w:id="21" w:name="_Toc238562649"/>
       <w:r>
         <w:rPr>
           <w:b/>
@@ -9588,7 +9588,7 @@
         <w:pStyle w:val="Heading3"/>
         <w:spacing w:before="240" w:after="120" w:line="360" w:lineRule="auto"/>
       </w:pPr>
-      <w:bookmarkStart w:id="22" w:name="_Toc238561772"/>
+      <w:bookmarkStart w:id="22" w:name="_Toc238562650"/>
       <w:r>
         <w:rPr>
           <w:b/>
@@ -9816,7 +9816,7 @@
         <w:pStyle w:val="Heading3"/>
         <w:spacing w:before="240" w:after="120" w:line="360" w:lineRule="auto"/>
       </w:pPr>
-      <w:bookmarkStart w:id="23" w:name="_Toc238561773"/>
+      <w:bookmarkStart w:id="23" w:name="_Toc238562651"/>
       <w:r>
         <w:rPr>
           <w:b/>
@@ -10256,7 +10256,7 @@
         <w:pStyle w:val="Heading3"/>
         <w:spacing w:before="240" w:after="120" w:line="360" w:lineRule="auto"/>
       </w:pPr>
-      <w:bookmarkStart w:id="24" w:name="_Toc238561774"/>
+      <w:bookmarkStart w:id="24" w:name="_Toc238562652"/>
       <w:r>
         <w:rPr>
           <w:b/>
@@ -10319,10 +10319,10 @@
         </w:rPr>
         <w:lastRenderedPageBreak/>
         <w:drawing>
-          <wp:inline distT="0" distB="0" distL="0" distR="0" wp14:anchorId="5E40FB0A" wp14:editId="7DEB8F23">
+          <wp:inline distT="0" distB="0" distL="0" distR="0" wp14:anchorId="24F6AC33" wp14:editId="2638F712">
             <wp:extent cx="5334000" cy="3333750"/>
             <wp:effectExtent l="0" t="0" r="0" b="0"/>
-            <wp:docPr id="1276834498" name="Picture 1276834498"/>
+            <wp:docPr id="1053777944" name="Picture 1053777944"/>
             <wp:cNvGraphicFramePr>
               <a:graphicFrameLocks xmlns:a="http://schemas.openxmlformats.org/drawingml/2006/main" noChangeAspect="1"/>
             </wp:cNvGraphicFramePr>
@@ -10383,10 +10383,10 @@
           <w:noProof/>
         </w:rPr>
         <w:drawing>
-          <wp:inline distT="0" distB="0" distL="0" distR="0" wp14:anchorId="50DF301E" wp14:editId="1D45D939">
+          <wp:inline distT="0" distB="0" distL="0" distR="0" wp14:anchorId="726B3F82" wp14:editId="1770537E">
             <wp:extent cx="5334000" cy="3333750"/>
             <wp:effectExtent l="0" t="0" r="0" b="0"/>
-            <wp:docPr id="1763560782" name="Picture 1763560782"/>
+            <wp:docPr id="1129067165" name="Picture 1129067165"/>
             <wp:cNvGraphicFramePr>
               <a:graphicFrameLocks xmlns:a="http://schemas.openxmlformats.org/drawingml/2006/main" noChangeAspect="1"/>
             </wp:cNvGraphicFramePr>
@@ -10448,10 +10448,10 @@
         </w:rPr>
         <w:lastRenderedPageBreak/>
         <w:drawing>
-          <wp:inline distT="0" distB="0" distL="0" distR="0" wp14:anchorId="1BAB2FE2" wp14:editId="1158B238">
+          <wp:inline distT="0" distB="0" distL="0" distR="0" wp14:anchorId="4B3FC697" wp14:editId="68B26313">
             <wp:extent cx="5334000" cy="3333750"/>
             <wp:effectExtent l="0" t="0" r="0" b="0"/>
-            <wp:docPr id="346383336" name="Picture 346383336"/>
+            <wp:docPr id="735754704" name="Picture 735754704"/>
             <wp:cNvGraphicFramePr>
               <a:graphicFrameLocks xmlns:a="http://schemas.openxmlformats.org/drawingml/2006/main" noChangeAspect="1"/>
             </wp:cNvGraphicFramePr>
@@ -10512,10 +10512,10 @@
           <w:noProof/>
         </w:rPr>
         <w:drawing>
-          <wp:inline distT="0" distB="0" distL="0" distR="0" wp14:anchorId="12B9BBE7" wp14:editId="7A6A512D">
+          <wp:inline distT="0" distB="0" distL="0" distR="0" wp14:anchorId="1E8FB00A" wp14:editId="096124D6">
             <wp:extent cx="5334000" cy="3333750"/>
             <wp:effectExtent l="0" t="0" r="0" b="0"/>
-            <wp:docPr id="1372421702" name="Picture 1372421702"/>
+            <wp:docPr id="1419674590" name="Picture 1419674590"/>
             <wp:cNvGraphicFramePr>
               <a:graphicFrameLocks xmlns:a="http://schemas.openxmlformats.org/drawingml/2006/main" noChangeAspect="1"/>
             </wp:cNvGraphicFramePr>
@@ -10577,10 +10577,10 @@
         </w:rPr>
         <w:lastRenderedPageBreak/>
         <w:drawing>
-          <wp:inline distT="0" distB="0" distL="0" distR="0" wp14:anchorId="5BB91765" wp14:editId="66C354D5">
+          <wp:inline distT="0" distB="0" distL="0" distR="0" wp14:anchorId="6ECED7DE" wp14:editId="103C4D59">
             <wp:extent cx="5334000" cy="3333750"/>
             <wp:effectExtent l="0" t="0" r="0" b="0"/>
-            <wp:docPr id="1659232358" name="Picture 1659232358"/>
+            <wp:docPr id="1007231374" name="Picture 1007231374"/>
             <wp:cNvGraphicFramePr>
               <a:graphicFrameLocks xmlns:a="http://schemas.openxmlformats.org/drawingml/2006/main" noChangeAspect="1"/>
             </wp:cNvGraphicFramePr>
@@ -10641,10 +10641,10 @@
           <w:noProof/>
         </w:rPr>
         <w:drawing>
-          <wp:inline distT="0" distB="0" distL="0" distR="0" wp14:anchorId="6E9A52BB" wp14:editId="3164CA98">
+          <wp:inline distT="0" distB="0" distL="0" distR="0" wp14:anchorId="746FFFCF" wp14:editId="07B5960C">
             <wp:extent cx="5334000" cy="3333750"/>
             <wp:effectExtent l="0" t="0" r="0" b="0"/>
-            <wp:docPr id="832674022" name="Picture 832674022"/>
+            <wp:docPr id="1504655634" name="Picture 1504655634"/>
             <wp:cNvGraphicFramePr>
               <a:graphicFrameLocks xmlns:a="http://schemas.openxmlformats.org/drawingml/2006/main" noChangeAspect="1"/>
             </wp:cNvGraphicFramePr>
@@ -10706,10 +10706,10 @@
         </w:rPr>
         <w:lastRenderedPageBreak/>
         <w:drawing>
-          <wp:inline distT="0" distB="0" distL="0" distR="0" wp14:anchorId="02BCEA09" wp14:editId="246B1351">
+          <wp:inline distT="0" distB="0" distL="0" distR="0" wp14:anchorId="5C4A08EC" wp14:editId="1F453947">
             <wp:extent cx="5334000" cy="3333750"/>
             <wp:effectExtent l="0" t="0" r="0" b="0"/>
-            <wp:docPr id="1219557107" name="Picture 1219557107"/>
+            <wp:docPr id="22724603" name="Picture 22724603"/>
             <wp:cNvGraphicFramePr>
               <a:graphicFrameLocks xmlns:a="http://schemas.openxmlformats.org/drawingml/2006/main" noChangeAspect="1"/>
             </wp:cNvGraphicFramePr>
@@ -10774,7 +10774,7 @@
         <w:pStyle w:val="Heading4"/>
         <w:spacing w:before="240" w:after="120" w:line="360" w:lineRule="auto"/>
       </w:pPr>
-      <w:bookmarkStart w:id="25" w:name="_Toc238561775"/>
+      <w:bookmarkStart w:id="25" w:name="_Toc238562653"/>
       <w:r>
         <w:rPr>
           <w:b/>
@@ -10910,10 +10910,10 @@
         </w:rPr>
         <w:lastRenderedPageBreak/>
         <w:drawing>
-          <wp:inline distT="0" distB="0" distL="0" distR="0" wp14:anchorId="3AD0DF2C" wp14:editId="7A0E762B">
+          <wp:inline distT="0" distB="0" distL="0" distR="0" wp14:anchorId="3DB30FB7" wp14:editId="196EBECB">
             <wp:extent cx="5334000" cy="3333750"/>
             <wp:effectExtent l="0" t="0" r="0" b="0"/>
-            <wp:docPr id="1977902055" name="Picture 1977902055"/>
+            <wp:docPr id="7559673" name="Picture 7559673"/>
             <wp:cNvGraphicFramePr>
               <a:graphicFrameLocks xmlns:a="http://schemas.openxmlformats.org/drawingml/2006/main" noChangeAspect="1"/>
             </wp:cNvGraphicFramePr>
@@ -10974,10 +10974,10 @@
           <w:noProof/>
         </w:rPr>
         <w:drawing>
-          <wp:inline distT="0" distB="0" distL="0" distR="0" wp14:anchorId="17D85200" wp14:editId="60CE7F92">
+          <wp:inline distT="0" distB="0" distL="0" distR="0" wp14:anchorId="489A2705" wp14:editId="5CD7CA46">
             <wp:extent cx="5334000" cy="3333750"/>
             <wp:effectExtent l="0" t="0" r="0" b="0"/>
-            <wp:docPr id="1719997869" name="Picture 1719997869"/>
+            <wp:docPr id="58812264" name="Picture 58812264"/>
             <wp:cNvGraphicFramePr>
               <a:graphicFrameLocks xmlns:a="http://schemas.openxmlformats.org/drawingml/2006/main" noChangeAspect="1"/>
             </wp:cNvGraphicFramePr>
@@ -11142,7 +11142,7 @@
         <w:pStyle w:val="Heading2"/>
         <w:spacing w:before="240" w:after="120" w:line="360" w:lineRule="auto"/>
       </w:pPr>
-      <w:bookmarkStart w:id="26" w:name="_Toc238561776"/>
+      <w:bookmarkStart w:id="26" w:name="_Toc238562654"/>
       <w:r>
         <w:rPr>
           <w:b/>
@@ -11186,7 +11186,7 @@
         <w:pStyle w:val="Heading3"/>
         <w:spacing w:before="240" w:after="120" w:line="360" w:lineRule="auto"/>
       </w:pPr>
-      <w:bookmarkStart w:id="27" w:name="_Toc238561777"/>
+      <w:bookmarkStart w:id="27" w:name="_Toc238562655"/>
       <w:r>
         <w:rPr>
           <w:b/>
@@ -11270,7 +11270,7 @@
         <w:pStyle w:val="Heading3"/>
         <w:spacing w:before="240" w:after="120" w:line="360" w:lineRule="auto"/>
       </w:pPr>
-      <w:bookmarkStart w:id="28" w:name="_Toc238561778"/>
+      <w:bookmarkStart w:id="28" w:name="_Toc238562656"/>
       <w:r>
         <w:rPr>
           <w:b/>
@@ -11488,10 +11488,10 @@
           <w:noProof/>
         </w:rPr>
         <w:drawing>
-          <wp:inline distT="0" distB="0" distL="0" distR="0" wp14:anchorId="6D00FF5E" wp14:editId="5A51B89A">
+          <wp:inline distT="0" distB="0" distL="0" distR="0" wp14:anchorId="5D77C901" wp14:editId="57670294">
             <wp:extent cx="5334000" cy="3857625"/>
             <wp:effectExtent l="0" t="0" r="0" b="0"/>
-            <wp:docPr id="781187091" name="Picture 781187091"/>
+            <wp:docPr id="1123319777" name="Picture 1123319777"/>
             <wp:cNvGraphicFramePr>
               <a:graphicFrameLocks xmlns:a="http://schemas.openxmlformats.org/drawingml/2006/main" noChangeAspect="1"/>
             </wp:cNvGraphicFramePr>
@@ -11547,7 +11547,7 @@
         <w:pStyle w:val="Heading3"/>
         <w:spacing w:before="240" w:after="120" w:line="360" w:lineRule="auto"/>
       </w:pPr>
-      <w:bookmarkStart w:id="29" w:name="_Toc238561779"/>
+      <w:bookmarkStart w:id="29" w:name="_Toc238562657"/>
       <w:r>
         <w:rPr>
           <w:b/>
@@ -11635,7 +11635,7 @@
         <w:pStyle w:val="Heading3"/>
         <w:spacing w:before="240" w:after="120" w:line="360" w:lineRule="auto"/>
       </w:pPr>
-      <w:bookmarkStart w:id="30" w:name="_Toc238561780"/>
+      <w:bookmarkStart w:id="30" w:name="_Toc238562658"/>
       <w:r>
         <w:rPr>
           <w:b/>
@@ -11882,7 +11882,7 @@
         <w:pStyle w:val="Heading3"/>
         <w:spacing w:before="240" w:after="120" w:line="360" w:lineRule="auto"/>
       </w:pPr>
-      <w:bookmarkStart w:id="31" w:name="_Toc238561781"/>
+      <w:bookmarkStart w:id="31" w:name="_Toc238562659"/>
       <w:r>
         <w:rPr>
           <w:b/>
@@ -11928,7 +11928,7 @@
         <w:pStyle w:val="Heading2"/>
         <w:spacing w:before="240" w:after="120" w:line="360" w:lineRule="auto"/>
       </w:pPr>
-      <w:bookmarkStart w:id="32" w:name="_Toc238561782"/>
+      <w:bookmarkStart w:id="32" w:name="_Toc238562660"/>
       <w:r>
         <w:rPr>
           <w:b/>
@@ -12226,7 +12226,7 @@
             <w:color w:val="0B3954"/>
             <w:u w:val="single"/>
           </w:rPr>
-          <w:t>https://github.com/KirishaTharusan/sunrise-dental-clinic</w:t>
+          <w:t>https://github.com/TharusanK23/sunrise-dental-clinic</w:t>
         </w:r>
       </w:hyperlink>
       <w:r>
@@ -12271,10 +12271,10 @@
         </w:rPr>
         <w:lastRenderedPageBreak/>
         <w:drawing>
-          <wp:inline distT="0" distB="0" distL="0" distR="0" wp14:anchorId="0C23C4BD" wp14:editId="533F4380">
+          <wp:inline distT="0" distB="0" distL="0" distR="0" wp14:anchorId="25DAD217" wp14:editId="56BA8C87">
             <wp:extent cx="5334000" cy="3705225"/>
             <wp:effectExtent l="0" t="0" r="0" b="0"/>
-            <wp:docPr id="474253119" name="Picture 474253119"/>
+            <wp:docPr id="199256812" name="Picture 199256812"/>
             <wp:cNvGraphicFramePr>
               <a:graphicFrameLocks xmlns:a="http://schemas.openxmlformats.org/drawingml/2006/main" noChangeAspect="1"/>
             </wp:cNvGraphicFramePr>
@@ -12335,10 +12335,10 @@
           <w:noProof/>
         </w:rPr>
         <w:drawing>
-          <wp:inline distT="0" distB="0" distL="0" distR="0" wp14:anchorId="3D0D7239" wp14:editId="47E3BDB0">
+          <wp:inline distT="0" distB="0" distL="0" distR="0" wp14:anchorId="4DADFE85" wp14:editId="270A083D">
             <wp:extent cx="5334000" cy="3705225"/>
             <wp:effectExtent l="0" t="0" r="0" b="0"/>
-            <wp:docPr id="1411079922" name="Picture 1411079922"/>
+            <wp:docPr id="1217102686" name="Picture 1217102686"/>
             <wp:cNvGraphicFramePr>
               <a:graphicFrameLocks xmlns:a="http://schemas.openxmlformats.org/drawingml/2006/main" noChangeAspect="1"/>
             </wp:cNvGraphicFramePr>
@@ -12402,7 +12402,7 @@
         <w:pStyle w:val="Heading2"/>
         <w:spacing w:before="240" w:after="120" w:line="360" w:lineRule="auto"/>
       </w:pPr>
-      <w:bookmarkStart w:id="33" w:name="_Toc238561783"/>
+      <w:bookmarkStart w:id="33" w:name="_Toc238562661"/>
       <w:r>
         <w:rPr>
           <w:b/>
@@ -12429,11 +12429,11 @@
           <w:left w:w="10" w:type="dxa"/>
           <w:right w:w="10" w:type="dxa"/>
         </w:tblCellMar>
-        <w:tblLook w:val="0000" w:firstRow="0" w:lastRow="0" w:firstColumn="0" w:lastColumn="0" w:noHBand="0" w:noVBand="0"/>
+        <w:tblLook w:val="04A0" w:firstRow="1" w:lastRow="0" w:firstColumn="1" w:lastColumn="0" w:noHBand="0" w:noVBand="1"/>
       </w:tblPr>
       <w:tblGrid>
-        <w:gridCol w:w="3295"/>
-        <w:gridCol w:w="5003"/>
+        <w:gridCol w:w="3447"/>
+        <w:gridCol w:w="4851"/>
       </w:tblGrid>
       <w:tr>
         <w:tblPrEx>
@@ -13122,7 +13122,6 @@
               <w:spacing w:line="360" w:lineRule="auto"/>
             </w:pPr>
             <w:r>
-              <w:lastRenderedPageBreak/>
               <w:t>Devised/derived test data; test plan produced and applied</w:t>
             </w:r>
           </w:p>
@@ -13181,6 +13180,7 @@
               <w:spacing w:line="360" w:lineRule="auto"/>
             </w:pPr>
             <w:r>
+              <w:lastRenderedPageBreak/>
               <w:t>Test classes created; relevant tests carried out and documented</w:t>
             </w:r>
           </w:p>
@@ -13627,7 +13627,7 @@
                   <w:color w:val="0B3954"/>
                   <w:u w:val="single"/>
                 </w:rPr>
-                <w:t>https://github.com/KirishaTharusan/sunrise-dental-clinic</w:t>
+                <w:t>https://github.com/TharusanK23/sunrise-dental-clinic</w:t>
               </w:r>
             </w:hyperlink>
             <w:r>
@@ -13655,7 +13655,7 @@
         <w:pStyle w:val="Heading2"/>
         <w:spacing w:before="240" w:after="120" w:line="360" w:lineRule="auto"/>
       </w:pPr>
-      <w:bookmarkStart w:id="34" w:name="_Toc238561784"/>
+      <w:bookmarkStart w:id="34" w:name="_Toc238562662"/>
       <w:r>
         <w:rPr>
           <w:b/>
@@ -13677,14 +13677,17 @@
           <w:b/>
           <w:bCs/>
         </w:rPr>
+        <w:t>Ethical.</w:t>
+      </w:r>
+      <w:r>
+        <w:t xml:space="preserve"> Patient data protection was treated as a first-class design </w:t>
+      </w:r>
+      <w:r>
+        <w:t xml:space="preserve">constraint, not an afterthought: passwords are never stored or logged in plain text (BCrypt, §3.6); the authentication token is delivered as an HttpOnly cookie specifically so client-side JavaScript — including any third-party script that might be compromised — cannot </w:t>
+      </w:r>
+      <w:r>
         <w:lastRenderedPageBreak/>
-        <w:t>Ethical.</w:t>
-      </w:r>
-      <w:r>
-        <w:t xml:space="preserve"> Patient data protection was treated as a first-class design </w:t>
-      </w:r>
-      <w:r>
-        <w:t xml:space="preserve">constraint, not an afterthought: passwords are never stored or logged in plain text (BCrypt, §3.6); the authentication token is delivered as an HttpOnly cookie specifically so client-side JavaScript — including any third-party script that might be compromised — cannot read it; and every input is validated server-side even though the client also validates, because client-side checks are trivially bypassable and cannot be the sole safeguard for a system handling patients' contact details and (implicitly) </w:t>
+        <w:t xml:space="preserve">read it; and every input is validated server-side even though the client also validates, because client-side checks are trivially bypassable and cannot be the sole safeguard for a system handling patients' contact details and (implicitly) </w:t>
       </w:r>
       <w:r>
         <w:t>health-adjacent treatment history.</w:t>
@@ -13796,7 +13799,7 @@
         <w:pStyle w:val="Heading2"/>
         <w:spacing w:before="240" w:after="120" w:line="360" w:lineRule="auto"/>
       </w:pPr>
-      <w:bookmarkStart w:id="35" w:name="_Toc238561785"/>
+      <w:bookmarkStart w:id="35" w:name="_Toc238562663"/>
       <w:r>
         <w:rPr>
           <w:b/>
@@ -13814,32 +13817,32 @@
         <w:jc w:val="both"/>
       </w:pPr>
       <w:r>
-        <w:t xml:space="preserve">This project delivers a complete, working, three-tier dental-clinic appointment and billing system that fulfils every functional requirement in the assignment brief's scenario, five deliberately-justified design patterns plus the Repository pattern, a </w:t>
+        <w:t xml:space="preserve">This project delivers a complete, working, three-tier dental-clinic appointment and billing system that fulfils every functional requirement in the assignment brief's scenario, five deliberately-justified design patterns plus the Repository pattern, a MySQL database exercising triggers/a stored procedure/views beyond basic CRUD, a documented and </w:t>
+      </w:r>
+      <w:r>
+        <w:t xml:space="preserve">partially test-driven automated test suite with genuine, recorded lessons learned, and a </w:t>
+      </w:r>
+      <w:r>
+        <w:rPr>
+          <w:shd w:val="solid" w:color="F2F2F2" w:fill="F2F2F2"/>
+        </w:rPr>
+        <w:t>dev</w:t>
+      </w:r>
+      <w:r>
+        <w:t>/</w:t>
+      </w:r>
+      <w:r>
+        <w:rPr>
+          <w:shd w:val="solid" w:color="F2F2F2" w:fill="F2F2F2"/>
+        </w:rPr>
+        <w:t>release</w:t>
+      </w:r>
+      <w:r>
+        <w:t xml:space="preserve"> Git/GitHub workflow with CI wired in from the first push. The most significant honest limitation is scope, not correctness: the domain model </w:t>
       </w:r>
       <w:r>
         <w:lastRenderedPageBreak/>
-        <w:t xml:space="preserve">MySQL database exercising triggers/a stored procedure/views beyond basic CRUD, a documented and </w:t>
-      </w:r>
-      <w:r>
-        <w:t xml:space="preserve">partially test-driven automated test suite with genuine, recorded lessons learned, and a </w:t>
-      </w:r>
-      <w:r>
-        <w:rPr>
-          <w:shd w:val="solid" w:color="F2F2F2" w:fill="F2F2F2"/>
-        </w:rPr>
-        <w:t>dev</w:t>
-      </w:r>
-      <w:r>
-        <w:t>/</w:t>
-      </w:r>
-      <w:r>
-        <w:rPr>
-          <w:shd w:val="solid" w:color="F2F2F2" w:fill="F2F2F2"/>
-        </w:rPr>
-        <w:t>release</w:t>
-      </w:r>
-      <w:r>
-        <w:t xml:space="preserve"> Git/GitHub workflow with CI wired in from the first push. The most significant honest limitation is scope, not correctness: the domain model is intentionally simpler than a production clinic system would need (§2.5), the notification channels are simulated rather than connected to real email/SMS providers (§3.3.5), and the Git commit history was necessarily created in one development session rather </w:t>
+        <w:t xml:space="preserve">is intentionally simpler than a production clinic system would need (§2.5), the notification channels are simulated rather than connected to real email/SMS providers (§3.3.5), and the Git commit history was necessarily created in one development session rather </w:t>
       </w:r>
       <w:r>
         <w:t xml:space="preserve">than genuinely across several calendar days — each of these is disclosed explicitly rather than concealed, and each has a clear, stated path to being extended (§5, </w:t>
@@ -13870,7 +13873,7 @@
         <w:pStyle w:val="Heading2"/>
         <w:spacing w:before="240" w:after="120" w:line="360" w:lineRule="auto"/>
       </w:pPr>
-      <w:bookmarkStart w:id="36" w:name="_Toc238561786"/>
+      <w:bookmarkStart w:id="36" w:name="_Toc238562664"/>
       <w:r>
         <w:rPr>
           <w:b/>
@@ -14064,7 +14067,6 @@
         <w:jc w:val="both"/>
       </w:pPr>
       <w:r>
-        <w:lastRenderedPageBreak/>
         <w:t xml:space="preserve">OWASP Foundation (2021) </w:t>
       </w:r>
       <w:r>
@@ -14096,6 +14098,7 @@
         <w:jc w:val="both"/>
       </w:pPr>
       <w:r>
+        <w:lastRenderedPageBreak/>
         <w:t xml:space="preserve">Spring.io (2024) </w:t>
       </w:r>
       <w:r>
@@ -14165,7 +14168,7 @@
         <w:pStyle w:val="Heading2"/>
         <w:spacing w:before="240" w:after="120" w:line="360" w:lineRule="auto"/>
       </w:pPr>
-      <w:bookmarkStart w:id="37" w:name="_Toc238561787"/>
+      <w:bookmarkStart w:id="37" w:name="_Toc238562665"/>
       <w:r>
         <w:rPr>
           <w:b/>
@@ -14442,10 +14445,10 @@
 <file path=word/numbering.xml><?xml version="1.0" encoding="utf-8"?>
 <w:numbering xmlns:wpc="http://schemas.microsoft.com/office/word/2010/wordprocessingCanvas" xmlns:cx="http://schemas.microsoft.com/office/drawing/2014/chartex" xmlns:cx1="http://schemas.microsoft.com/office/drawing/2015/9/8/chartex" xmlns:cx2="http://schemas.microsoft.com/office/drawing/2015/10/21/chartex" xmlns:cx3="http://schemas.microsoft.com/office/drawing/2016/5/9/chartex" xmlns:cx4="http://schemas.microsoft.com/office/drawing/2016/5/10/chartex" xmlns:cx5="http://schemas.microsoft.com/office/drawing/2016/5/11/chartex" xmlns:cx6="http://schemas.microsoft.com/office/drawing/2016/5/12/chartex" xmlns:cx7="http://schemas.microsoft.com/office/drawing/2016/5/13/chartex" xmlns:cx8="http://schemas.microsoft.com/office/drawing/2016/5/14/chartex" xmlns:mc="http://schemas.openxmlformats.org/markup-compatibility/2006" xmlns:aink="http://schemas.microsoft.com/office/drawing/2016/ink" xmlns:am3d="http://schemas.microsoft.com/office/drawing/2017/model3d" xmlns:o="urn:schemas-microsoft-com:office:office" xmlns:oel="http://schemas.microsoft.com/office/2019/extlst" xmlns:r="http://schemas.openxmlformats.org/officeDocument/2006/relationships" xmlns:m="http://schemas.openxmlformats.org/officeDocument/2006/math" xmlns:v="urn:schemas-microsoft-com:vml" xmlns:wp14="http://schemas.microsoft.com/office/word/2010/wordprocessingDrawing" xmlns:wp="http://schemas.openxmlformats.org/drawingml/2006/wordprocessingDrawing" xmlns:w10="urn:schemas-microsoft-com:office:word" xmlns:w="http://schemas.openxmlformats.org/wordprocessingml/2006/main" xmlns:w14="http://schemas.microsoft.com/office/word/2010/wordml" xmlns:w15="http://schemas.microsoft.com/office/word/2012/wordml" xmlns:w16cex="http://schemas.microsoft.com/office/word/2018/wordml/cex" xmlns:w16cid="http://schemas.microsoft.com/office/word/2016/wordml/cid" xmlns:w16="http://schemas.microsoft.com/office/word/2018/wordml" xmlns:w16du="http://schemas.microsoft.com/office/word/2023/wordml/word16du" xmlns:w16sdtdh="http://schemas.microsoft.com/office/word/2020/wordml/sdtdatahash" xmlns:w16sdtfl="http://schemas.microsoft.com/office/word/2024/wordml/sdtformatlock" xmlns:w16se="http://schemas.microsoft.com/office/word/2015/wordml/symex" xmlns:wpg="http://schemas.microsoft.com/office/word/2010/wordprocessingGroup" xmlns:wpi="http://schemas.microsoft.com/office/word/2010/wordprocessingInk" xmlns:wne="http://schemas.microsoft.com/office/word/2006/wordml" xmlns:wps="http://schemas.microsoft.com/office/word/2010/wordprocessingShape" mc:Ignorable="w14 w15 w16se w16cid w16 w16cex w16sdtdh w16sdtfl w16du wp14">
   <w:abstractNum w:abstractNumId="0" w15:restartNumberingAfterBreak="0">
-    <w:nsid w:val="35703B9E"/>
+    <w:nsid w:val="735C7158"/>
     <w:multiLevelType w:val="hybridMultilevel"/>
-    <w:tmpl w:val="316C5CEC"/>
-    <w:lvl w:ilvl="0" w:tplc="3C60B966">
+    <w:tmpl w:val="3B78D030"/>
+    <w:lvl w:ilvl="0" w:tplc="77348238">
       <w:start w:val="1"/>
       <w:numFmt w:val="bullet"/>
       <w:lvlText w:val="●"/>
@@ -14454,7 +14457,7 @@
         <w:ind w:left="720" w:hanging="360"/>
       </w:pPr>
     </w:lvl>
-    <w:lvl w:ilvl="1" w:tplc="F5704F7C">
+    <w:lvl w:ilvl="1" w:tplc="07BC25F2">
       <w:start w:val="1"/>
       <w:numFmt w:val="bullet"/>
       <w:lvlText w:val="○"/>
@@ -14463,7 +14466,7 @@
         <w:ind w:left="1440" w:hanging="360"/>
       </w:pPr>
     </w:lvl>
-    <w:lvl w:ilvl="2" w:tplc="CD04CBCA">
+    <w:lvl w:ilvl="2" w:tplc="3C10B75A">
       <w:start w:val="1"/>
       <w:numFmt w:val="bullet"/>
       <w:lvlText w:val="■"/>
@@ -14472,7 +14475,7 @@
         <w:ind w:left="2160" w:hanging="360"/>
       </w:pPr>
     </w:lvl>
-    <w:lvl w:ilvl="3" w:tplc="864488EE">
+    <w:lvl w:ilvl="3" w:tplc="78A00278">
       <w:start w:val="1"/>
       <w:numFmt w:val="bullet"/>
       <w:lvlText w:val="●"/>
@@ -14481,7 +14484,7 @@
         <w:ind w:left="2880" w:hanging="360"/>
       </w:pPr>
     </w:lvl>
-    <w:lvl w:ilvl="4" w:tplc="8976D6BA">
+    <w:lvl w:ilvl="4" w:tplc="F2F0963C">
       <w:start w:val="1"/>
       <w:numFmt w:val="bullet"/>
       <w:lvlText w:val="○"/>
@@ -14490,7 +14493,7 @@
         <w:ind w:left="3600" w:hanging="360"/>
       </w:pPr>
     </w:lvl>
-    <w:lvl w:ilvl="5" w:tplc="47BA38E4">
+    <w:lvl w:ilvl="5" w:tplc="F5BE3152">
       <w:start w:val="1"/>
       <w:numFmt w:val="bullet"/>
       <w:lvlText w:val="■"/>
@@ -14499,7 +14502,7 @@
         <w:ind w:left="4320" w:hanging="360"/>
       </w:pPr>
     </w:lvl>
-    <w:lvl w:ilvl="6" w:tplc="DCD8C2FC">
+    <w:lvl w:ilvl="6" w:tplc="7FC4F664">
       <w:start w:val="1"/>
       <w:numFmt w:val="bullet"/>
       <w:lvlText w:val="●"/>
@@ -14508,7 +14511,7 @@
         <w:ind w:left="5040" w:hanging="360"/>
       </w:pPr>
     </w:lvl>
-    <w:lvl w:ilvl="7" w:tplc="DAB27D02">
+    <w:lvl w:ilvl="7" w:tplc="062AB760">
       <w:start w:val="1"/>
       <w:numFmt w:val="bullet"/>
       <w:lvlText w:val="●"/>
@@ -14517,7 +14520,7 @@
         <w:ind w:left="5760" w:hanging="360"/>
       </w:pPr>
     </w:lvl>
-    <w:lvl w:ilvl="8" w:tplc="1CE6FA84">
+    <w:lvl w:ilvl="8" w:tplc="81F03208">
       <w:start w:val="1"/>
       <w:numFmt w:val="bullet"/>
       <w:lvlText w:val="●"/>
@@ -14527,7 +14530,7 @@
       </w:pPr>
     </w:lvl>
   </w:abstractNum>
-  <w:num w:numId="1" w16cid:durableId="252051675">
+  <w:num w:numId="1" w16cid:durableId="1119028359">
     <w:abstractNumId w:val="0"/>
     <w:lvlOverride w:ilvl="0">
       <w:startOverride w:val="1"/>
@@ -15133,7 +15136,7 @@
     <w:basedOn w:val="Normal"/>
     <w:uiPriority w:val="1"/>
     <w:qFormat/>
-    <w:rsid w:val="00B977BD"/>
+    <w:rsid w:val="00764C14"/>
     <w:pPr>
       <w:spacing w:after="160" w:line="279" w:lineRule="auto"/>
     </w:pPr>
@@ -15151,7 +15154,7 @@
     <w:autoRedefine/>
     <w:uiPriority w:val="39"/>
     <w:unhideWhenUsed/>
-    <w:rsid w:val="00B977BD"/>
+    <w:rsid w:val="00764C14"/>
     <w:pPr>
       <w:spacing w:after="100"/>
       <w:ind w:left="240"/>
@@ -15164,7 +15167,7 @@
     <w:autoRedefine/>
     <w:uiPriority w:val="39"/>
     <w:unhideWhenUsed/>
-    <w:rsid w:val="00B977BD"/>
+    <w:rsid w:val="00764C14"/>
     <w:pPr>
       <w:spacing w:after="100"/>
       <w:ind w:left="480"/>
@@ -15177,7 +15180,7 @@
     <w:autoRedefine/>
     <w:uiPriority w:val="39"/>
     <w:unhideWhenUsed/>
-    <w:rsid w:val="00B977BD"/>
+    <w:rsid w:val="00764C14"/>
     <w:pPr>
       <w:spacing w:after="100"/>
       <w:ind w:left="720"/>

</xml_diff>

<commit_message>
Point repository links at the new GitHub URL
README, the assignment report, the assessment summary, and
GIT_WORKFLOW.md now link to https://github.com/KirishaTharusan/
sunrise-dental-clinic - DOCX/PDF exports regenerated so the link is
baked into the actual submission files too, not just the Markdown
source.

Co-Authored-By: Claude Sonnet 5 <noreply@anthropic.com>
</commit_message>
<xml_diff>
--- a/docs/ASSIGNMENT_REPORT.docx
+++ b/docs/ASSIGNMENT_REPORT.docx
@@ -2523,7 +2523,7 @@
       <w:r>
         <w:fldChar w:fldCharType="separate"/>
       </w:r>
-      <w:hyperlink w:anchor="_Toc238562628" w:history="1">
+      <w:hyperlink w:anchor="_Toc238563292" w:history="1">
         <w:r>
           <w:rPr>
             <w:rStyle w:val="Hyperlink"/>
@@ -2549,7 +2549,7 @@
           <w:rPr>
             <w:noProof/>
           </w:rPr>
-          <w:instrText xml:space="preserve"> PAGEREF _Toc238562628 \h </w:instrText>
+          <w:instrText xml:space="preserve"> PAGEREF _Toc238563292 \h </w:instrText>
         </w:r>
         <w:r>
           <w:rPr>
@@ -2586,7 +2586,7 @@
           <w:noProof/>
         </w:rPr>
       </w:pPr>
-      <w:hyperlink w:anchor="_Toc238562629" w:history="1">
+      <w:hyperlink w:anchor="_Toc238563293" w:history="1">
         <w:r>
           <w:rPr>
             <w:rStyle w:val="Hyperlink"/>
@@ -2612,7 +2612,7 @@
           <w:rPr>
             <w:noProof/>
           </w:rPr>
-          <w:instrText xml:space="preserve"> PAGEREF _Toc238562629 \h </w:instrText>
+          <w:instrText xml:space="preserve"> PAGEREF _Toc238563293 \h </w:instrText>
         </w:r>
         <w:r>
           <w:rPr>
@@ -2649,7 +2649,7 @@
           <w:noProof/>
         </w:rPr>
       </w:pPr>
-      <w:hyperlink w:anchor="_Toc238562630" w:history="1">
+      <w:hyperlink w:anchor="_Toc238563294" w:history="1">
         <w:r>
           <w:rPr>
             <w:rStyle w:val="Hyperlink"/>
@@ -2675,7 +2675,7 @@
           <w:rPr>
             <w:noProof/>
           </w:rPr>
-          <w:instrText xml:space="preserve"> PAGEREF _Toc238562630 \h </w:instrText>
+          <w:instrText xml:space="preserve"> PAGEREF _Toc238563294 \h </w:instrText>
         </w:r>
         <w:r>
           <w:rPr>
@@ -2712,7 +2712,7 @@
           <w:noProof/>
         </w:rPr>
       </w:pPr>
-      <w:hyperlink w:anchor="_Toc238562631" w:history="1">
+      <w:hyperlink w:anchor="_Toc238563295" w:history="1">
         <w:r>
           <w:rPr>
             <w:rStyle w:val="Hyperlink"/>
@@ -2738,7 +2738,7 @@
           <w:rPr>
             <w:noProof/>
           </w:rPr>
-          <w:instrText xml:space="preserve"> PAGEREF _Toc238562631 \h </w:instrText>
+          <w:instrText xml:space="preserve"> PAGEREF _Toc238563295 \h </w:instrText>
         </w:r>
         <w:r>
           <w:rPr>
@@ -2775,7 +2775,7 @@
           <w:noProof/>
         </w:rPr>
       </w:pPr>
-      <w:hyperlink w:anchor="_Toc238562632" w:history="1">
+      <w:hyperlink w:anchor="_Toc238563296" w:history="1">
         <w:r>
           <w:rPr>
             <w:rStyle w:val="Hyperlink"/>
@@ -2801,7 +2801,7 @@
           <w:rPr>
             <w:noProof/>
           </w:rPr>
-          <w:instrText xml:space="preserve"> PAGEREF _Toc238562632 \h </w:instrText>
+          <w:instrText xml:space="preserve"> PAGEREF _Toc238563296 \h </w:instrText>
         </w:r>
         <w:r>
           <w:rPr>
@@ -2838,7 +2838,7 @@
           <w:noProof/>
         </w:rPr>
       </w:pPr>
-      <w:hyperlink w:anchor="_Toc238562633" w:history="1">
+      <w:hyperlink w:anchor="_Toc238563297" w:history="1">
         <w:r>
           <w:rPr>
             <w:rStyle w:val="Hyperlink"/>
@@ -2864,7 +2864,7 @@
           <w:rPr>
             <w:noProof/>
           </w:rPr>
-          <w:instrText xml:space="preserve"> PAGEREF _Toc238562633 \h </w:instrText>
+          <w:instrText xml:space="preserve"> PAGEREF _Toc238563297 \h </w:instrText>
         </w:r>
         <w:r>
           <w:rPr>
@@ -2901,7 +2901,7 @@
           <w:noProof/>
         </w:rPr>
       </w:pPr>
-      <w:hyperlink w:anchor="_Toc238562634" w:history="1">
+      <w:hyperlink w:anchor="_Toc238563298" w:history="1">
         <w:r>
           <w:rPr>
             <w:rStyle w:val="Hyperlink"/>
@@ -2927,7 +2927,7 @@
           <w:rPr>
             <w:noProof/>
           </w:rPr>
-          <w:instrText xml:space="preserve"> PAGEREF _Toc238562634 \h </w:instrText>
+          <w:instrText xml:space="preserve"> PAGEREF _Toc238563298 \h </w:instrText>
         </w:r>
         <w:r>
           <w:rPr>
@@ -2964,7 +2964,7 @@
           <w:noProof/>
         </w:rPr>
       </w:pPr>
-      <w:hyperlink w:anchor="_Toc238562635" w:history="1">
+      <w:hyperlink w:anchor="_Toc238563299" w:history="1">
         <w:r>
           <w:rPr>
             <w:rStyle w:val="Hyperlink"/>
@@ -2990,7 +2990,7 @@
           <w:rPr>
             <w:noProof/>
           </w:rPr>
-          <w:instrText xml:space="preserve"> PAGEREF _Toc238562635 \h </w:instrText>
+          <w:instrText xml:space="preserve"> PAGEREF _Toc238563299 \h </w:instrText>
         </w:r>
         <w:r>
           <w:rPr>
@@ -3027,7 +3027,7 @@
           <w:noProof/>
         </w:rPr>
       </w:pPr>
-      <w:hyperlink w:anchor="_Toc238562636" w:history="1">
+      <w:hyperlink w:anchor="_Toc238563300" w:history="1">
         <w:r>
           <w:rPr>
             <w:rStyle w:val="Hyperlink"/>
@@ -3053,7 +3053,7 @@
           <w:rPr>
             <w:noProof/>
           </w:rPr>
-          <w:instrText xml:space="preserve"> PAGEREF _Toc238562636 \h </w:instrText>
+          <w:instrText xml:space="preserve"> PAGEREF _Toc238563300 \h </w:instrText>
         </w:r>
         <w:r>
           <w:rPr>
@@ -3090,7 +3090,7 @@
           <w:noProof/>
         </w:rPr>
       </w:pPr>
-      <w:hyperlink w:anchor="_Toc238562637" w:history="1">
+      <w:hyperlink w:anchor="_Toc238563301" w:history="1">
         <w:r>
           <w:rPr>
             <w:rStyle w:val="Hyperlink"/>
@@ -3116,7 +3116,7 @@
           <w:rPr>
             <w:noProof/>
           </w:rPr>
-          <w:instrText xml:space="preserve"> PAGEREF _Toc238562637 \h </w:instrText>
+          <w:instrText xml:space="preserve"> PAGEREF _Toc238563301 \h </w:instrText>
         </w:r>
         <w:r>
           <w:rPr>
@@ -3153,7 +3153,7 @@
           <w:noProof/>
         </w:rPr>
       </w:pPr>
-      <w:hyperlink w:anchor="_Toc238562638" w:history="1">
+      <w:hyperlink w:anchor="_Toc238563302" w:history="1">
         <w:r>
           <w:rPr>
             <w:rStyle w:val="Hyperlink"/>
@@ -3179,7 +3179,7 @@
           <w:rPr>
             <w:noProof/>
           </w:rPr>
-          <w:instrText xml:space="preserve"> PAGEREF _Toc238562638 \h </w:instrText>
+          <w:instrText xml:space="preserve"> PAGEREF _Toc238563302 \h </w:instrText>
         </w:r>
         <w:r>
           <w:rPr>
@@ -3216,7 +3216,7 @@
           <w:noProof/>
         </w:rPr>
       </w:pPr>
-      <w:hyperlink w:anchor="_Toc238562639" w:history="1">
+      <w:hyperlink w:anchor="_Toc238563303" w:history="1">
         <w:r>
           <w:rPr>
             <w:rStyle w:val="Hyperlink"/>
@@ -3242,7 +3242,7 @@
           <w:rPr>
             <w:noProof/>
           </w:rPr>
-          <w:instrText xml:space="preserve"> PAGEREF _Toc238562639 \h </w:instrText>
+          <w:instrText xml:space="preserve"> PAGEREF _Toc238563303 \h </w:instrText>
         </w:r>
         <w:r>
           <w:rPr>
@@ -3279,7 +3279,7 @@
           <w:noProof/>
         </w:rPr>
       </w:pPr>
-      <w:hyperlink w:anchor="_Toc238562640" w:history="1">
+      <w:hyperlink w:anchor="_Toc238563304" w:history="1">
         <w:r>
           <w:rPr>
             <w:rStyle w:val="Hyperlink"/>
@@ -3305,7 +3305,7 @@
           <w:rPr>
             <w:noProof/>
           </w:rPr>
-          <w:instrText xml:space="preserve"> PAGEREF _Toc238562640 \h </w:instrText>
+          <w:instrText xml:space="preserve"> PAGEREF _Toc238563304 \h </w:instrText>
         </w:r>
         <w:r>
           <w:rPr>
@@ -3342,7 +3342,7 @@
           <w:noProof/>
         </w:rPr>
       </w:pPr>
-      <w:hyperlink w:anchor="_Toc238562641" w:history="1">
+      <w:hyperlink w:anchor="_Toc238563305" w:history="1">
         <w:r>
           <w:rPr>
             <w:rStyle w:val="Hyperlink"/>
@@ -3368,7 +3368,7 @@
           <w:rPr>
             <w:noProof/>
           </w:rPr>
-          <w:instrText xml:space="preserve"> PAGEREF _Toc238562641 \h </w:instrText>
+          <w:instrText xml:space="preserve"> PAGEREF _Toc238563305 \h </w:instrText>
         </w:r>
         <w:r>
           <w:rPr>
@@ -3405,7 +3405,7 @@
           <w:noProof/>
         </w:rPr>
       </w:pPr>
-      <w:hyperlink w:anchor="_Toc238562642" w:history="1">
+      <w:hyperlink w:anchor="_Toc238563306" w:history="1">
         <w:r>
           <w:rPr>
             <w:rStyle w:val="Hyperlink"/>
@@ -3431,7 +3431,7 @@
           <w:rPr>
             <w:noProof/>
           </w:rPr>
-          <w:instrText xml:space="preserve"> PAGEREF _Toc238562642 \h </w:instrText>
+          <w:instrText xml:space="preserve"> PAGEREF _Toc238563306 \h </w:instrText>
         </w:r>
         <w:r>
           <w:rPr>
@@ -3468,7 +3468,7 @@
           <w:noProof/>
         </w:rPr>
       </w:pPr>
-      <w:hyperlink w:anchor="_Toc238562643" w:history="1">
+      <w:hyperlink w:anchor="_Toc238563307" w:history="1">
         <w:r>
           <w:rPr>
             <w:rStyle w:val="Hyperlink"/>
@@ -3523,7 +3523,7 @@
           <w:rPr>
             <w:noProof/>
           </w:rPr>
-          <w:instrText xml:space="preserve"> PAGEREF _Toc238562643 \h </w:instrText>
+          <w:instrText xml:space="preserve"> PAGEREF _Toc238563307 \h </w:instrText>
         </w:r>
         <w:r>
           <w:rPr>
@@ -3560,7 +3560,7 @@
           <w:noProof/>
         </w:rPr>
       </w:pPr>
-      <w:hyperlink w:anchor="_Toc238562644" w:history="1">
+      <w:hyperlink w:anchor="_Toc238563308" w:history="1">
         <w:r>
           <w:rPr>
             <w:rStyle w:val="Hyperlink"/>
@@ -3596,7 +3596,7 @@
           <w:rPr>
             <w:noProof/>
           </w:rPr>
-          <w:instrText xml:space="preserve"> PAGEREF _Toc238562644 \h </w:instrText>
+          <w:instrText xml:space="preserve"> PAGEREF _Toc238563308 \h </w:instrText>
         </w:r>
         <w:r>
           <w:rPr>
@@ -3633,7 +3633,7 @@
           <w:noProof/>
         </w:rPr>
       </w:pPr>
-      <w:hyperlink w:anchor="_Toc238562645" w:history="1">
+      <w:hyperlink w:anchor="_Toc238563309" w:history="1">
         <w:r>
           <w:rPr>
             <w:rStyle w:val="Hyperlink"/>
@@ -3669,7 +3669,7 @@
           <w:rPr>
             <w:noProof/>
           </w:rPr>
-          <w:instrText xml:space="preserve"> PAGEREF _Toc238562645 \h </w:instrText>
+          <w:instrText xml:space="preserve"> PAGEREF _Toc238563309 \h </w:instrText>
         </w:r>
         <w:r>
           <w:rPr>
@@ -3706,7 +3706,7 @@
           <w:noProof/>
         </w:rPr>
       </w:pPr>
-      <w:hyperlink w:anchor="_Toc238562646" w:history="1">
+      <w:hyperlink w:anchor="_Toc238563310" w:history="1">
         <w:r>
           <w:rPr>
             <w:rStyle w:val="Hyperlink"/>
@@ -3761,7 +3761,7 @@
           <w:rPr>
             <w:noProof/>
           </w:rPr>
-          <w:instrText xml:space="preserve"> PAGEREF _Toc238562646 \h </w:instrText>
+          <w:instrText xml:space="preserve"> PAGEREF _Toc238563310 \h </w:instrText>
         </w:r>
         <w:r>
           <w:rPr>
@@ -3798,7 +3798,7 @@
           <w:noProof/>
         </w:rPr>
       </w:pPr>
-      <w:hyperlink w:anchor="_Toc238562647" w:history="1">
+      <w:hyperlink w:anchor="_Toc238563311" w:history="1">
         <w:r>
           <w:rPr>
             <w:rStyle w:val="Hyperlink"/>
@@ -3853,7 +3853,7 @@
           <w:rPr>
             <w:noProof/>
           </w:rPr>
-          <w:instrText xml:space="preserve"> PAGEREF _Toc238562647 \h </w:instrText>
+          <w:instrText xml:space="preserve"> PAGEREF _Toc238563311 \h </w:instrText>
         </w:r>
         <w:r>
           <w:rPr>
@@ -3890,7 +3890,7 @@
           <w:noProof/>
         </w:rPr>
       </w:pPr>
-      <w:hyperlink w:anchor="_Toc238562648" w:history="1">
+      <w:hyperlink w:anchor="_Toc238563312" w:history="1">
         <w:r>
           <w:rPr>
             <w:rStyle w:val="Hyperlink"/>
@@ -3916,7 +3916,7 @@
           <w:rPr>
             <w:noProof/>
           </w:rPr>
-          <w:instrText xml:space="preserve"> PAGEREF _Toc238562648 \h </w:instrText>
+          <w:instrText xml:space="preserve"> PAGEREF _Toc238563312 \h </w:instrText>
         </w:r>
         <w:r>
           <w:rPr>
@@ -3953,7 +3953,7 @@
           <w:noProof/>
         </w:rPr>
       </w:pPr>
-      <w:hyperlink w:anchor="_Toc238562649" w:history="1">
+      <w:hyperlink w:anchor="_Toc238563313" w:history="1">
         <w:r>
           <w:rPr>
             <w:rStyle w:val="Hyperlink"/>
@@ -3979,7 +3979,7 @@
           <w:rPr>
             <w:noProof/>
           </w:rPr>
-          <w:instrText xml:space="preserve"> PAGEREF _Toc238562649 \h </w:instrText>
+          <w:instrText xml:space="preserve"> PAGEREF _Toc238563313 \h </w:instrText>
         </w:r>
         <w:r>
           <w:rPr>
@@ -4016,7 +4016,7 @@
           <w:noProof/>
         </w:rPr>
       </w:pPr>
-      <w:hyperlink w:anchor="_Toc238562650" w:history="1">
+      <w:hyperlink w:anchor="_Toc238563314" w:history="1">
         <w:r>
           <w:rPr>
             <w:rStyle w:val="Hyperlink"/>
@@ -4042,7 +4042,7 @@
           <w:rPr>
             <w:noProof/>
           </w:rPr>
-          <w:instrText xml:space="preserve"> PAGEREF _Toc238562650 \h </w:instrText>
+          <w:instrText xml:space="preserve"> PAGEREF _Toc238563314 \h </w:instrText>
         </w:r>
         <w:r>
           <w:rPr>
@@ -4079,7 +4079,7 @@
           <w:noProof/>
         </w:rPr>
       </w:pPr>
-      <w:hyperlink w:anchor="_Toc238562651" w:history="1">
+      <w:hyperlink w:anchor="_Toc238563315" w:history="1">
         <w:r>
           <w:rPr>
             <w:rStyle w:val="Hyperlink"/>
@@ -4105,7 +4105,7 @@
           <w:rPr>
             <w:noProof/>
           </w:rPr>
-          <w:instrText xml:space="preserve"> PAGEREF _Toc238562651 \h </w:instrText>
+          <w:instrText xml:space="preserve"> PAGEREF _Toc238563315 \h </w:instrText>
         </w:r>
         <w:r>
           <w:rPr>
@@ -4142,7 +4142,7 @@
           <w:noProof/>
         </w:rPr>
       </w:pPr>
-      <w:hyperlink w:anchor="_Toc238562652" w:history="1">
+      <w:hyperlink w:anchor="_Toc238563316" w:history="1">
         <w:r>
           <w:rPr>
             <w:rStyle w:val="Hyperlink"/>
@@ -4168,7 +4168,7 @@
           <w:rPr>
             <w:noProof/>
           </w:rPr>
-          <w:instrText xml:space="preserve"> PAGEREF _Toc238562652 \h </w:instrText>
+          <w:instrText xml:space="preserve"> PAGEREF _Toc238563316 \h </w:instrText>
         </w:r>
         <w:r>
           <w:rPr>
@@ -4205,7 +4205,7 @@
           <w:noProof/>
         </w:rPr>
       </w:pPr>
-      <w:hyperlink w:anchor="_Toc238562653" w:history="1">
+      <w:hyperlink w:anchor="_Toc238563317" w:history="1">
         <w:r>
           <w:rPr>
             <w:rStyle w:val="Hyperlink"/>
@@ -4231,7 +4231,7 @@
           <w:rPr>
             <w:noProof/>
           </w:rPr>
-          <w:instrText xml:space="preserve"> PAGEREF _Toc238562653 \h </w:instrText>
+          <w:instrText xml:space="preserve"> PAGEREF _Toc238563317 \h </w:instrText>
         </w:r>
         <w:r>
           <w:rPr>
@@ -4268,7 +4268,7 @@
           <w:noProof/>
         </w:rPr>
       </w:pPr>
-      <w:hyperlink w:anchor="_Toc238562654" w:history="1">
+      <w:hyperlink w:anchor="_Toc238563318" w:history="1">
         <w:r>
           <w:rPr>
             <w:rStyle w:val="Hyperlink"/>
@@ -4294,7 +4294,7 @@
           <w:rPr>
             <w:noProof/>
           </w:rPr>
-          <w:instrText xml:space="preserve"> PAGEREF _Toc238562654 \h </w:instrText>
+          <w:instrText xml:space="preserve"> PAGEREF _Toc238563318 \h </w:instrText>
         </w:r>
         <w:r>
           <w:rPr>
@@ -4331,7 +4331,7 @@
           <w:noProof/>
         </w:rPr>
       </w:pPr>
-      <w:hyperlink w:anchor="_Toc238562655" w:history="1">
+      <w:hyperlink w:anchor="_Toc238563319" w:history="1">
         <w:r>
           <w:rPr>
             <w:rStyle w:val="Hyperlink"/>
@@ -4357,7 +4357,7 @@
           <w:rPr>
             <w:noProof/>
           </w:rPr>
-          <w:instrText xml:space="preserve"> PAGEREF _Toc238562655 \h </w:instrText>
+          <w:instrText xml:space="preserve"> PAGEREF _Toc238563319 \h </w:instrText>
         </w:r>
         <w:r>
           <w:rPr>
@@ -4394,7 +4394,7 @@
           <w:noProof/>
         </w:rPr>
       </w:pPr>
-      <w:hyperlink w:anchor="_Toc238562656" w:history="1">
+      <w:hyperlink w:anchor="_Toc238563320" w:history="1">
         <w:r>
           <w:rPr>
             <w:rStyle w:val="Hyperlink"/>
@@ -4420,7 +4420,7 @@
           <w:rPr>
             <w:noProof/>
           </w:rPr>
-          <w:instrText xml:space="preserve"> PAGEREF _Toc238562656 \h </w:instrText>
+          <w:instrText xml:space="preserve"> PAGEREF _Toc238563320 \h </w:instrText>
         </w:r>
         <w:r>
           <w:rPr>
@@ -4457,7 +4457,7 @@
           <w:noProof/>
         </w:rPr>
       </w:pPr>
-      <w:hyperlink w:anchor="_Toc238562657" w:history="1">
+      <w:hyperlink w:anchor="_Toc238563321" w:history="1">
         <w:r>
           <w:rPr>
             <w:rStyle w:val="Hyperlink"/>
@@ -4483,7 +4483,7 @@
           <w:rPr>
             <w:noProof/>
           </w:rPr>
-          <w:instrText xml:space="preserve"> PAGEREF _Toc238562657 \h </w:instrText>
+          <w:instrText xml:space="preserve"> PAGEREF _Toc238563321 \h </w:instrText>
         </w:r>
         <w:r>
           <w:rPr>
@@ -4520,7 +4520,7 @@
           <w:noProof/>
         </w:rPr>
       </w:pPr>
-      <w:hyperlink w:anchor="_Toc238562658" w:history="1">
+      <w:hyperlink w:anchor="_Toc238563322" w:history="1">
         <w:r>
           <w:rPr>
             <w:rStyle w:val="Hyperlink"/>
@@ -4546,7 +4546,7 @@
           <w:rPr>
             <w:noProof/>
           </w:rPr>
-          <w:instrText xml:space="preserve"> PAGEREF _Toc238562658 \h </w:instrText>
+          <w:instrText xml:space="preserve"> PAGEREF _Toc238563322 \h </w:instrText>
         </w:r>
         <w:r>
           <w:rPr>
@@ -4583,7 +4583,7 @@
           <w:noProof/>
         </w:rPr>
       </w:pPr>
-      <w:hyperlink w:anchor="_Toc238562659" w:history="1">
+      <w:hyperlink w:anchor="_Toc238563323" w:history="1">
         <w:r>
           <w:rPr>
             <w:rStyle w:val="Hyperlink"/>
@@ -4609,7 +4609,7 @@
           <w:rPr>
             <w:noProof/>
           </w:rPr>
-          <w:instrText xml:space="preserve"> PAGEREF _Toc238562659 \h </w:instrText>
+          <w:instrText xml:space="preserve"> PAGEREF _Toc238563323 \h </w:instrText>
         </w:r>
         <w:r>
           <w:rPr>
@@ -4646,7 +4646,7 @@
           <w:noProof/>
         </w:rPr>
       </w:pPr>
-      <w:hyperlink w:anchor="_Toc238562660" w:history="1">
+      <w:hyperlink w:anchor="_Toc238563324" w:history="1">
         <w:r>
           <w:rPr>
             <w:rStyle w:val="Hyperlink"/>
@@ -4672,7 +4672,7 @@
           <w:rPr>
             <w:noProof/>
           </w:rPr>
-          <w:instrText xml:space="preserve"> PAGEREF _Toc238562660 \h </w:instrText>
+          <w:instrText xml:space="preserve"> PAGEREF _Toc238563324 \h </w:instrText>
         </w:r>
         <w:r>
           <w:rPr>
@@ -4709,7 +4709,7 @@
           <w:noProof/>
         </w:rPr>
       </w:pPr>
-      <w:hyperlink w:anchor="_Toc238562661" w:history="1">
+      <w:hyperlink w:anchor="_Toc238563325" w:history="1">
         <w:r>
           <w:rPr>
             <w:rStyle w:val="Hyperlink"/>
@@ -4735,7 +4735,7 @@
           <w:rPr>
             <w:noProof/>
           </w:rPr>
-          <w:instrText xml:space="preserve"> PAGEREF _Toc238562661 \h </w:instrText>
+          <w:instrText xml:space="preserve"> PAGEREF _Toc238563325 \h </w:instrText>
         </w:r>
         <w:r>
           <w:rPr>
@@ -4772,7 +4772,7 @@
           <w:noProof/>
         </w:rPr>
       </w:pPr>
-      <w:hyperlink w:anchor="_Toc238562662" w:history="1">
+      <w:hyperlink w:anchor="_Toc238563326" w:history="1">
         <w:r>
           <w:rPr>
             <w:rStyle w:val="Hyperlink"/>
@@ -4798,7 +4798,7 @@
           <w:rPr>
             <w:noProof/>
           </w:rPr>
-          <w:instrText xml:space="preserve"> PAGEREF _Toc238562662 \h </w:instrText>
+          <w:instrText xml:space="preserve"> PAGEREF _Toc238563326 \h </w:instrText>
         </w:r>
         <w:r>
           <w:rPr>
@@ -4835,7 +4835,7 @@
           <w:noProof/>
         </w:rPr>
       </w:pPr>
-      <w:hyperlink w:anchor="_Toc238562663" w:history="1">
+      <w:hyperlink w:anchor="_Toc238563327" w:history="1">
         <w:r>
           <w:rPr>
             <w:rStyle w:val="Hyperlink"/>
@@ -4861,7 +4861,7 @@
           <w:rPr>
             <w:noProof/>
           </w:rPr>
-          <w:instrText xml:space="preserve"> PAGEREF _Toc238562663 \h </w:instrText>
+          <w:instrText xml:space="preserve"> PAGEREF _Toc238563327 \h </w:instrText>
         </w:r>
         <w:r>
           <w:rPr>
@@ -4898,7 +4898,7 @@
           <w:noProof/>
         </w:rPr>
       </w:pPr>
-      <w:hyperlink w:anchor="_Toc238562664" w:history="1">
+      <w:hyperlink w:anchor="_Toc238563328" w:history="1">
         <w:r>
           <w:rPr>
             <w:rStyle w:val="Hyperlink"/>
@@ -4924,7 +4924,7 @@
           <w:rPr>
             <w:noProof/>
           </w:rPr>
-          <w:instrText xml:space="preserve"> PAGEREF _Toc238562664 \h </w:instrText>
+          <w:instrText xml:space="preserve"> PAGEREF _Toc238563328 \h </w:instrText>
         </w:r>
         <w:r>
           <w:rPr>
@@ -4961,7 +4961,7 @@
           <w:noProof/>
         </w:rPr>
       </w:pPr>
-      <w:hyperlink w:anchor="_Toc238562665" w:history="1">
+      <w:hyperlink w:anchor="_Toc238563329" w:history="1">
         <w:r>
           <w:rPr>
             <w:rStyle w:val="Hyperlink"/>
@@ -4987,7 +4987,7 @@
           <w:rPr>
             <w:noProof/>
           </w:rPr>
-          <w:instrText xml:space="preserve"> PAGEREF _Toc238562665 \h </w:instrText>
+          <w:instrText xml:space="preserve"> PAGEREF _Toc238563329 \h </w:instrText>
         </w:r>
         <w:r>
           <w:rPr>
@@ -5113,7 +5113,7 @@
             <w:color w:val="0B3954"/>
             <w:u w:val="single"/>
           </w:rPr>
-          <w:t>https://github.com/TharusanK23/sunrise-dental-clinic</w:t>
+          <w:t>https://github.com/KirishaTharusan/sunrise-dental-clinic</w:t>
         </w:r>
       </w:hyperlink>
     </w:p>
@@ -5225,7 +5225,7 @@
         <w:pStyle w:val="Heading2"/>
         <w:spacing w:before="240" w:after="120" w:line="360" w:lineRule="auto"/>
       </w:pPr>
-      <w:bookmarkStart w:id="0" w:name="_Toc238562628"/>
+      <w:bookmarkStart w:id="0" w:name="_Toc238563292"/>
       <w:r>
         <w:rPr>
           <w:b/>
@@ -5267,7 +5267,7 @@
         <w:pStyle w:val="Heading3"/>
         <w:spacing w:before="240" w:after="120" w:line="360" w:lineRule="auto"/>
       </w:pPr>
-      <w:bookmarkStart w:id="1" w:name="_Toc238562629"/>
+      <w:bookmarkStart w:id="1" w:name="_Toc238563293"/>
       <w:r>
         <w:rPr>
           <w:b/>
@@ -5389,7 +5389,7 @@
         <w:pStyle w:val="Heading3"/>
         <w:spacing w:before="240" w:after="120" w:line="360" w:lineRule="auto"/>
       </w:pPr>
-      <w:bookmarkStart w:id="2" w:name="_Toc238562630"/>
+      <w:bookmarkStart w:id="2" w:name="_Toc238563294"/>
       <w:r>
         <w:rPr>
           <w:b/>
@@ -5463,7 +5463,7 @@
         <w:pStyle w:val="Heading2"/>
         <w:spacing w:before="240" w:after="120" w:line="360" w:lineRule="auto"/>
       </w:pPr>
-      <w:bookmarkStart w:id="3" w:name="_Toc238562631"/>
+      <w:bookmarkStart w:id="3" w:name="_Toc238563295"/>
       <w:r>
         <w:rPr>
           <w:b/>
@@ -5516,7 +5516,7 @@
         <w:pStyle w:val="Heading3"/>
         <w:spacing w:before="240" w:after="120" w:line="360" w:lineRule="auto"/>
       </w:pPr>
-      <w:bookmarkStart w:id="4" w:name="_Toc238562632"/>
+      <w:bookmarkStart w:id="4" w:name="_Toc238563296"/>
       <w:r>
         <w:rPr>
           <w:b/>
@@ -5539,7 +5539,7 @@
         </w:rPr>
         <w:lastRenderedPageBreak/>
         <w:drawing>
-          <wp:inline distT="0" distB="0" distL="0" distR="0" wp14:anchorId="22468E0B" wp14:editId="07C41218">
+          <wp:inline distT="0" distB="0" distL="0" distR="0" wp14:anchorId="39D1918A" wp14:editId="37C93EB7">
             <wp:extent cx="5334000" cy="4486275"/>
             <wp:effectExtent l="0" t="0" r="0" b="0"/>
             <wp:docPr id="1" name="Picture 1"/>
@@ -5786,7 +5786,7 @@
         <w:pStyle w:val="Heading3"/>
         <w:spacing w:before="240" w:after="120" w:line="360" w:lineRule="auto"/>
       </w:pPr>
-      <w:bookmarkStart w:id="5" w:name="_Toc238562633"/>
+      <w:bookmarkStart w:id="5" w:name="_Toc238563297"/>
       <w:r>
         <w:rPr>
           <w:b/>
@@ -5808,10 +5808,10 @@
           <w:noProof/>
         </w:rPr>
         <w:drawing>
-          <wp:inline distT="0" distB="0" distL="0" distR="0" wp14:anchorId="07F6CAE2" wp14:editId="21D2015E">
+          <wp:inline distT="0" distB="0" distL="0" distR="0" wp14:anchorId="3E77B551" wp14:editId="1173BF2B">
             <wp:extent cx="5334000" cy="3057525"/>
             <wp:effectExtent l="0" t="0" r="0" b="0"/>
-            <wp:docPr id="1354579079" name="Picture 1354579079"/>
+            <wp:docPr id="1589980260" name="Picture 1589980260"/>
             <wp:cNvGraphicFramePr>
               <a:graphicFrameLocks xmlns:a="http://schemas.openxmlformats.org/drawingml/2006/main" noChangeAspect="1"/>
             </wp:cNvGraphicFramePr>
@@ -6201,7 +6201,7 @@
         <w:pStyle w:val="Heading3"/>
         <w:spacing w:before="240" w:after="120" w:line="360" w:lineRule="auto"/>
       </w:pPr>
-      <w:bookmarkStart w:id="6" w:name="_Toc238562634"/>
+      <w:bookmarkStart w:id="6" w:name="_Toc238563298"/>
       <w:r>
         <w:rPr>
           <w:b/>
@@ -6446,10 +6446,10 @@
         </w:rPr>
         <w:lastRenderedPageBreak/>
         <w:drawing>
-          <wp:inline distT="0" distB="0" distL="0" distR="0" wp14:anchorId="108B2EA5" wp14:editId="46892BF5">
+          <wp:inline distT="0" distB="0" distL="0" distR="0" wp14:anchorId="207986D3" wp14:editId="71361AF3">
             <wp:extent cx="5334000" cy="2933700"/>
             <wp:effectExtent l="0" t="0" r="0" b="0"/>
-            <wp:docPr id="1138712380" name="Picture 1138712380"/>
+            <wp:docPr id="1836401961" name="Picture 1836401961"/>
             <wp:cNvGraphicFramePr>
               <a:graphicFrameLocks xmlns:a="http://schemas.openxmlformats.org/drawingml/2006/main" noChangeAspect="1"/>
             </wp:cNvGraphicFramePr>
@@ -6510,10 +6510,10 @@
           <w:noProof/>
         </w:rPr>
         <w:drawing>
-          <wp:inline distT="0" distB="0" distL="0" distR="0" wp14:anchorId="176842CD" wp14:editId="15D7826D">
+          <wp:inline distT="0" distB="0" distL="0" distR="0" wp14:anchorId="43B4D55D" wp14:editId="0B6A18A5">
             <wp:extent cx="5334000" cy="3686175"/>
             <wp:effectExtent l="0" t="0" r="0" b="0"/>
-            <wp:docPr id="330572062" name="Picture 330572062"/>
+            <wp:docPr id="734758428" name="Picture 734758428"/>
             <wp:cNvGraphicFramePr>
               <a:graphicFrameLocks xmlns:a="http://schemas.openxmlformats.org/drawingml/2006/main" noChangeAspect="1"/>
             </wp:cNvGraphicFramePr>
@@ -6575,10 +6575,10 @@
         </w:rPr>
         <w:lastRenderedPageBreak/>
         <w:drawing>
-          <wp:inline distT="0" distB="0" distL="0" distR="0" wp14:anchorId="07B33BCF" wp14:editId="020A2E1F">
+          <wp:inline distT="0" distB="0" distL="0" distR="0" wp14:anchorId="00402CD7" wp14:editId="3904DEBE">
             <wp:extent cx="5334000" cy="3086100"/>
             <wp:effectExtent l="0" t="0" r="0" b="0"/>
-            <wp:docPr id="1867379640" name="Picture 1867379640"/>
+            <wp:docPr id="192592541" name="Picture 192592541"/>
             <wp:cNvGraphicFramePr>
               <a:graphicFrameLocks xmlns:a="http://schemas.openxmlformats.org/drawingml/2006/main" noChangeAspect="1"/>
             </wp:cNvGraphicFramePr>
@@ -6634,7 +6634,7 @@
         <w:pStyle w:val="Heading3"/>
         <w:spacing w:before="240" w:after="120" w:line="360" w:lineRule="auto"/>
       </w:pPr>
-      <w:bookmarkStart w:id="7" w:name="_Toc238562635"/>
+      <w:bookmarkStart w:id="7" w:name="_Toc238563299"/>
       <w:r>
         <w:rPr>
           <w:b/>
@@ -6657,10 +6657,10 @@
         </w:rPr>
         <w:lastRenderedPageBreak/>
         <w:drawing>
-          <wp:inline distT="0" distB="0" distL="0" distR="0" wp14:anchorId="5B981E65" wp14:editId="75D2FF4D">
+          <wp:inline distT="0" distB="0" distL="0" distR="0" wp14:anchorId="0AE1E011" wp14:editId="165DA127">
             <wp:extent cx="5334000" cy="6229350"/>
             <wp:effectExtent l="0" t="0" r="0" b="0"/>
-            <wp:docPr id="516096787" name="Picture 516096787"/>
+            <wp:docPr id="222874648" name="Picture 222874648"/>
             <wp:cNvGraphicFramePr>
               <a:graphicFrameLocks xmlns:a="http://schemas.openxmlformats.org/drawingml/2006/main" noChangeAspect="1"/>
             </wp:cNvGraphicFramePr>
@@ -6737,7 +6737,7 @@
         <w:pStyle w:val="Heading3"/>
         <w:spacing w:before="240" w:after="120" w:line="360" w:lineRule="auto"/>
       </w:pPr>
-      <w:bookmarkStart w:id="8" w:name="_Toc238562636"/>
+      <w:bookmarkStart w:id="8" w:name="_Toc238563300"/>
       <w:r>
         <w:rPr>
           <w:b/>
@@ -6788,7 +6788,7 @@
         <w:pStyle w:val="Heading3"/>
         <w:spacing w:before="240" w:after="120" w:line="360" w:lineRule="auto"/>
       </w:pPr>
-      <w:bookmarkStart w:id="9" w:name="_Toc238562637"/>
+      <w:bookmarkStart w:id="9" w:name="_Toc238563301"/>
       <w:r>
         <w:rPr>
           <w:b/>
@@ -6861,10 +6861,10 @@
           <w:noProof/>
         </w:rPr>
         <w:drawing>
-          <wp:inline distT="0" distB="0" distL="0" distR="0" wp14:anchorId="3A99326C" wp14:editId="2230200B">
+          <wp:inline distT="0" distB="0" distL="0" distR="0" wp14:anchorId="20FC18C1" wp14:editId="024E77D0">
             <wp:extent cx="5334000" cy="2714625"/>
             <wp:effectExtent l="0" t="0" r="0" b="0"/>
-            <wp:docPr id="371851070" name="Picture 371851070"/>
+            <wp:docPr id="1460181137" name="Picture 1460181137"/>
             <wp:cNvGraphicFramePr>
               <a:graphicFrameLocks xmlns:a="http://schemas.openxmlformats.org/drawingml/2006/main" noChangeAspect="1"/>
             </wp:cNvGraphicFramePr>
@@ -6968,7 +6968,7 @@
         <w:pStyle w:val="Heading2"/>
         <w:spacing w:before="240" w:after="120" w:line="360" w:lineRule="auto"/>
       </w:pPr>
-      <w:bookmarkStart w:id="10" w:name="_Toc238562638"/>
+      <w:bookmarkStart w:id="10" w:name="_Toc238563302"/>
       <w:r>
         <w:rPr>
           <w:b/>
@@ -6985,7 +6985,7 @@
         <w:pStyle w:val="Heading3"/>
         <w:spacing w:before="240" w:after="120" w:line="360" w:lineRule="auto"/>
       </w:pPr>
-      <w:bookmarkStart w:id="11" w:name="_Toc238562639"/>
+      <w:bookmarkStart w:id="11" w:name="_Toc238563303"/>
       <w:r>
         <w:rPr>
           <w:b/>
@@ -7132,7 +7132,7 @@
         <w:pStyle w:val="Heading3"/>
         <w:spacing w:before="240" w:after="120" w:line="360" w:lineRule="auto"/>
       </w:pPr>
-      <w:bookmarkStart w:id="12" w:name="_Toc238562640"/>
+      <w:bookmarkStart w:id="12" w:name="_Toc238563304"/>
       <w:r>
         <w:rPr>
           <w:b/>
@@ -7259,7 +7259,7 @@
         <w:pStyle w:val="Heading4"/>
         <w:spacing w:before="240" w:after="120" w:line="360" w:lineRule="auto"/>
       </w:pPr>
-      <w:bookmarkStart w:id="13" w:name="_Toc238562641"/>
+      <w:bookmarkStart w:id="13" w:name="_Toc238563305"/>
       <w:r>
         <w:rPr>
           <w:b/>
@@ -7309,10 +7309,10 @@
         </w:rPr>
         <w:lastRenderedPageBreak/>
         <w:drawing>
-          <wp:inline distT="0" distB="0" distL="0" distR="0" wp14:anchorId="2B4A126D" wp14:editId="53B19D90">
+          <wp:inline distT="0" distB="0" distL="0" distR="0" wp14:anchorId="175715EC" wp14:editId="02F0AA6D">
             <wp:extent cx="5334000" cy="5181600"/>
             <wp:effectExtent l="0" t="0" r="0" b="0"/>
-            <wp:docPr id="585580651" name="Picture 585580651"/>
+            <wp:docPr id="855567310" name="Picture 855567310"/>
             <wp:cNvGraphicFramePr>
               <a:graphicFrameLocks xmlns:a="http://schemas.openxmlformats.org/drawingml/2006/main" noChangeAspect="1"/>
             </wp:cNvGraphicFramePr>
@@ -7556,10 +7556,10 @@
         </w:rPr>
         <w:lastRenderedPageBreak/>
         <w:drawing>
-          <wp:inline distT="0" distB="0" distL="0" distR="0" wp14:anchorId="5FF67F78" wp14:editId="0E84F67D">
+          <wp:inline distT="0" distB="0" distL="0" distR="0" wp14:anchorId="65C6B7BD" wp14:editId="1383CAF2">
             <wp:extent cx="5334000" cy="5181600"/>
             <wp:effectExtent l="0" t="0" r="0" b="0"/>
-            <wp:docPr id="885982686" name="Picture 885982686"/>
+            <wp:docPr id="427415505" name="Picture 427415505"/>
             <wp:cNvGraphicFramePr>
               <a:graphicFrameLocks xmlns:a="http://schemas.openxmlformats.org/drawingml/2006/main" noChangeAspect="1"/>
             </wp:cNvGraphicFramePr>
@@ -7666,10 +7666,10 @@
         </w:rPr>
         <w:lastRenderedPageBreak/>
         <w:drawing>
-          <wp:inline distT="0" distB="0" distL="0" distR="0" wp14:anchorId="1DF0CF5C" wp14:editId="3A4FCDDF">
+          <wp:inline distT="0" distB="0" distL="0" distR="0" wp14:anchorId="420D6501" wp14:editId="16E8AEF5">
             <wp:extent cx="5334000" cy="5181600"/>
             <wp:effectExtent l="0" t="0" r="0" b="0"/>
-            <wp:docPr id="349411157" name="Picture 349411157"/>
+            <wp:docPr id="1503523617" name="Picture 1503523617"/>
             <wp:cNvGraphicFramePr>
               <a:graphicFrameLocks xmlns:a="http://schemas.openxmlformats.org/drawingml/2006/main" noChangeAspect="1"/>
             </wp:cNvGraphicFramePr>
@@ -7817,10 +7817,10 @@
         </w:rPr>
         <w:lastRenderedPageBreak/>
         <w:drawing>
-          <wp:inline distT="0" distB="0" distL="0" distR="0" wp14:anchorId="2299A880" wp14:editId="7BE1EAB9">
+          <wp:inline distT="0" distB="0" distL="0" distR="0" wp14:anchorId="778CAD70" wp14:editId="6AE6A9FB">
             <wp:extent cx="5334000" cy="5181600"/>
             <wp:effectExtent l="0" t="0" r="0" b="0"/>
-            <wp:docPr id="958046930" name="Picture 958046930"/>
+            <wp:docPr id="1263094314" name="Picture 1263094314"/>
             <wp:cNvGraphicFramePr>
               <a:graphicFrameLocks xmlns:a="http://schemas.openxmlformats.org/drawingml/2006/main" noChangeAspect="1"/>
             </wp:cNvGraphicFramePr>
@@ -7912,7 +7912,7 @@
         <w:pStyle w:val="Heading3"/>
         <w:spacing w:before="240" w:after="120" w:line="360" w:lineRule="auto"/>
       </w:pPr>
-      <w:bookmarkStart w:id="14" w:name="_Toc238562642"/>
+      <w:bookmarkStart w:id="14" w:name="_Toc238563306"/>
       <w:r>
         <w:rPr>
           <w:b/>
@@ -7938,7 +7938,7 @@
         <w:pStyle w:val="Heading4"/>
         <w:spacing w:before="240" w:after="120" w:line="360" w:lineRule="auto"/>
       </w:pPr>
-      <w:bookmarkStart w:id="15" w:name="_Toc238562643"/>
+      <w:bookmarkStart w:id="15" w:name="_Toc238563307"/>
       <w:r>
         <w:rPr>
           <w:b/>
@@ -8217,7 +8217,7 @@
         <w:pStyle w:val="Heading4"/>
         <w:spacing w:before="240" w:after="120" w:line="360" w:lineRule="auto"/>
       </w:pPr>
-      <w:bookmarkStart w:id="16" w:name="_Toc238562644"/>
+      <w:bookmarkStart w:id="16" w:name="_Toc238563308"/>
       <w:r>
         <w:rPr>
           <w:b/>
@@ -8418,7 +8418,7 @@
         <w:pStyle w:val="Heading4"/>
         <w:spacing w:before="240" w:after="120" w:line="360" w:lineRule="auto"/>
       </w:pPr>
-      <w:bookmarkStart w:id="17" w:name="_Toc238562645"/>
+      <w:bookmarkStart w:id="17" w:name="_Toc238563309"/>
       <w:r>
         <w:rPr>
           <w:b/>
@@ -8605,7 +8605,7 @@
         <w:pStyle w:val="Heading4"/>
         <w:spacing w:before="240" w:after="120" w:line="360" w:lineRule="auto"/>
       </w:pPr>
-      <w:bookmarkStart w:id="18" w:name="_Toc238562646"/>
+      <w:bookmarkStart w:id="18" w:name="_Toc238563310"/>
       <w:r>
         <w:rPr>
           <w:b/>
@@ -8834,7 +8834,7 @@
         <w:pStyle w:val="Heading4"/>
         <w:spacing w:before="240" w:after="120" w:line="360" w:lineRule="auto"/>
       </w:pPr>
-      <w:bookmarkStart w:id="19" w:name="_Toc238562647"/>
+      <w:bookmarkStart w:id="19" w:name="_Toc238563311"/>
       <w:r>
         <w:rPr>
           <w:b/>
@@ -9106,7 +9106,7 @@
         <w:pStyle w:val="Heading4"/>
         <w:spacing w:before="240" w:after="120" w:line="360" w:lineRule="auto"/>
       </w:pPr>
-      <w:bookmarkStart w:id="20" w:name="_Toc238562648"/>
+      <w:bookmarkStart w:id="20" w:name="_Toc238563312"/>
       <w:r>
         <w:rPr>
           <w:b/>
@@ -9225,7 +9225,7 @@
         <w:pStyle w:val="Heading3"/>
         <w:spacing w:before="240" w:after="120" w:line="360" w:lineRule="auto"/>
       </w:pPr>
-      <w:bookmarkStart w:id="21" w:name="_Toc238562649"/>
+      <w:bookmarkStart w:id="21" w:name="_Toc238563313"/>
       <w:r>
         <w:rPr>
           <w:b/>
@@ -9588,7 +9588,7 @@
         <w:pStyle w:val="Heading3"/>
         <w:spacing w:before="240" w:after="120" w:line="360" w:lineRule="auto"/>
       </w:pPr>
-      <w:bookmarkStart w:id="22" w:name="_Toc238562650"/>
+      <w:bookmarkStart w:id="22" w:name="_Toc238563314"/>
       <w:r>
         <w:rPr>
           <w:b/>
@@ -9816,7 +9816,7 @@
         <w:pStyle w:val="Heading3"/>
         <w:spacing w:before="240" w:after="120" w:line="360" w:lineRule="auto"/>
       </w:pPr>
-      <w:bookmarkStart w:id="23" w:name="_Toc238562651"/>
+      <w:bookmarkStart w:id="23" w:name="_Toc238563315"/>
       <w:r>
         <w:rPr>
           <w:b/>
@@ -10256,7 +10256,7 @@
         <w:pStyle w:val="Heading3"/>
         <w:spacing w:before="240" w:after="120" w:line="360" w:lineRule="auto"/>
       </w:pPr>
-      <w:bookmarkStart w:id="24" w:name="_Toc238562652"/>
+      <w:bookmarkStart w:id="24" w:name="_Toc238563316"/>
       <w:r>
         <w:rPr>
           <w:b/>
@@ -10319,10 +10319,10 @@
         </w:rPr>
         <w:lastRenderedPageBreak/>
         <w:drawing>
-          <wp:inline distT="0" distB="0" distL="0" distR="0" wp14:anchorId="24F6AC33" wp14:editId="2638F712">
+          <wp:inline distT="0" distB="0" distL="0" distR="0" wp14:anchorId="2E13EB9C" wp14:editId="4D428907">
             <wp:extent cx="5334000" cy="3333750"/>
             <wp:effectExtent l="0" t="0" r="0" b="0"/>
-            <wp:docPr id="1053777944" name="Picture 1053777944"/>
+            <wp:docPr id="561396774" name="Picture 561396774"/>
             <wp:cNvGraphicFramePr>
               <a:graphicFrameLocks xmlns:a="http://schemas.openxmlformats.org/drawingml/2006/main" noChangeAspect="1"/>
             </wp:cNvGraphicFramePr>
@@ -10383,10 +10383,10 @@
           <w:noProof/>
         </w:rPr>
         <w:drawing>
-          <wp:inline distT="0" distB="0" distL="0" distR="0" wp14:anchorId="726B3F82" wp14:editId="1770537E">
+          <wp:inline distT="0" distB="0" distL="0" distR="0" wp14:anchorId="0C8FA4B8" wp14:editId="7DAECBC8">
             <wp:extent cx="5334000" cy="3333750"/>
             <wp:effectExtent l="0" t="0" r="0" b="0"/>
-            <wp:docPr id="1129067165" name="Picture 1129067165"/>
+            <wp:docPr id="1637433473" name="Picture 1637433473"/>
             <wp:cNvGraphicFramePr>
               <a:graphicFrameLocks xmlns:a="http://schemas.openxmlformats.org/drawingml/2006/main" noChangeAspect="1"/>
             </wp:cNvGraphicFramePr>
@@ -10448,10 +10448,10 @@
         </w:rPr>
         <w:lastRenderedPageBreak/>
         <w:drawing>
-          <wp:inline distT="0" distB="0" distL="0" distR="0" wp14:anchorId="4B3FC697" wp14:editId="68B26313">
+          <wp:inline distT="0" distB="0" distL="0" distR="0" wp14:anchorId="35CCA68D" wp14:editId="071E4279">
             <wp:extent cx="5334000" cy="3333750"/>
             <wp:effectExtent l="0" t="0" r="0" b="0"/>
-            <wp:docPr id="735754704" name="Picture 735754704"/>
+            <wp:docPr id="1354135960" name="Picture 1354135960"/>
             <wp:cNvGraphicFramePr>
               <a:graphicFrameLocks xmlns:a="http://schemas.openxmlformats.org/drawingml/2006/main" noChangeAspect="1"/>
             </wp:cNvGraphicFramePr>
@@ -10512,10 +10512,10 @@
           <w:noProof/>
         </w:rPr>
         <w:drawing>
-          <wp:inline distT="0" distB="0" distL="0" distR="0" wp14:anchorId="1E8FB00A" wp14:editId="096124D6">
+          <wp:inline distT="0" distB="0" distL="0" distR="0" wp14:anchorId="2EE8C7DE" wp14:editId="3348540F">
             <wp:extent cx="5334000" cy="3333750"/>
             <wp:effectExtent l="0" t="0" r="0" b="0"/>
-            <wp:docPr id="1419674590" name="Picture 1419674590"/>
+            <wp:docPr id="2101790238" name="Picture 2101790238"/>
             <wp:cNvGraphicFramePr>
               <a:graphicFrameLocks xmlns:a="http://schemas.openxmlformats.org/drawingml/2006/main" noChangeAspect="1"/>
             </wp:cNvGraphicFramePr>
@@ -10577,10 +10577,10 @@
         </w:rPr>
         <w:lastRenderedPageBreak/>
         <w:drawing>
-          <wp:inline distT="0" distB="0" distL="0" distR="0" wp14:anchorId="6ECED7DE" wp14:editId="103C4D59">
+          <wp:inline distT="0" distB="0" distL="0" distR="0" wp14:anchorId="78CD9711" wp14:editId="02295C4B">
             <wp:extent cx="5334000" cy="3333750"/>
             <wp:effectExtent l="0" t="0" r="0" b="0"/>
-            <wp:docPr id="1007231374" name="Picture 1007231374"/>
+            <wp:docPr id="8725856" name="Picture 8725856"/>
             <wp:cNvGraphicFramePr>
               <a:graphicFrameLocks xmlns:a="http://schemas.openxmlformats.org/drawingml/2006/main" noChangeAspect="1"/>
             </wp:cNvGraphicFramePr>
@@ -10641,10 +10641,10 @@
           <w:noProof/>
         </w:rPr>
         <w:drawing>
-          <wp:inline distT="0" distB="0" distL="0" distR="0" wp14:anchorId="746FFFCF" wp14:editId="07B5960C">
+          <wp:inline distT="0" distB="0" distL="0" distR="0" wp14:anchorId="07C65921" wp14:editId="5F55FD16">
             <wp:extent cx="5334000" cy="3333750"/>
             <wp:effectExtent l="0" t="0" r="0" b="0"/>
-            <wp:docPr id="1504655634" name="Picture 1504655634"/>
+            <wp:docPr id="1708123296" name="Picture 1708123296"/>
             <wp:cNvGraphicFramePr>
               <a:graphicFrameLocks xmlns:a="http://schemas.openxmlformats.org/drawingml/2006/main" noChangeAspect="1"/>
             </wp:cNvGraphicFramePr>
@@ -10706,10 +10706,10 @@
         </w:rPr>
         <w:lastRenderedPageBreak/>
         <w:drawing>
-          <wp:inline distT="0" distB="0" distL="0" distR="0" wp14:anchorId="5C4A08EC" wp14:editId="1F453947">
+          <wp:inline distT="0" distB="0" distL="0" distR="0" wp14:anchorId="00DB2B60" wp14:editId="731BA5C3">
             <wp:extent cx="5334000" cy="3333750"/>
             <wp:effectExtent l="0" t="0" r="0" b="0"/>
-            <wp:docPr id="22724603" name="Picture 22724603"/>
+            <wp:docPr id="2132947470" name="Picture 2132947470"/>
             <wp:cNvGraphicFramePr>
               <a:graphicFrameLocks xmlns:a="http://schemas.openxmlformats.org/drawingml/2006/main" noChangeAspect="1"/>
             </wp:cNvGraphicFramePr>
@@ -10774,7 +10774,7 @@
         <w:pStyle w:val="Heading4"/>
         <w:spacing w:before="240" w:after="120" w:line="360" w:lineRule="auto"/>
       </w:pPr>
-      <w:bookmarkStart w:id="25" w:name="_Toc238562653"/>
+      <w:bookmarkStart w:id="25" w:name="_Toc238563317"/>
       <w:r>
         <w:rPr>
           <w:b/>
@@ -10910,10 +10910,10 @@
         </w:rPr>
         <w:lastRenderedPageBreak/>
         <w:drawing>
-          <wp:inline distT="0" distB="0" distL="0" distR="0" wp14:anchorId="3DB30FB7" wp14:editId="196EBECB">
+          <wp:inline distT="0" distB="0" distL="0" distR="0" wp14:anchorId="06B32A46" wp14:editId="226964D2">
             <wp:extent cx="5334000" cy="3333750"/>
             <wp:effectExtent l="0" t="0" r="0" b="0"/>
-            <wp:docPr id="7559673" name="Picture 7559673"/>
+            <wp:docPr id="1840600984" name="Picture 1840600984"/>
             <wp:cNvGraphicFramePr>
               <a:graphicFrameLocks xmlns:a="http://schemas.openxmlformats.org/drawingml/2006/main" noChangeAspect="1"/>
             </wp:cNvGraphicFramePr>
@@ -10974,10 +10974,10 @@
           <w:noProof/>
         </w:rPr>
         <w:drawing>
-          <wp:inline distT="0" distB="0" distL="0" distR="0" wp14:anchorId="489A2705" wp14:editId="5CD7CA46">
+          <wp:inline distT="0" distB="0" distL="0" distR="0" wp14:anchorId="404D9844" wp14:editId="7BD74995">
             <wp:extent cx="5334000" cy="3333750"/>
             <wp:effectExtent l="0" t="0" r="0" b="0"/>
-            <wp:docPr id="58812264" name="Picture 58812264"/>
+            <wp:docPr id="415976387" name="Picture 415976387"/>
             <wp:cNvGraphicFramePr>
               <a:graphicFrameLocks xmlns:a="http://schemas.openxmlformats.org/drawingml/2006/main" noChangeAspect="1"/>
             </wp:cNvGraphicFramePr>
@@ -11142,7 +11142,7 @@
         <w:pStyle w:val="Heading2"/>
         <w:spacing w:before="240" w:after="120" w:line="360" w:lineRule="auto"/>
       </w:pPr>
-      <w:bookmarkStart w:id="26" w:name="_Toc238562654"/>
+      <w:bookmarkStart w:id="26" w:name="_Toc238563318"/>
       <w:r>
         <w:rPr>
           <w:b/>
@@ -11186,7 +11186,7 @@
         <w:pStyle w:val="Heading3"/>
         <w:spacing w:before="240" w:after="120" w:line="360" w:lineRule="auto"/>
       </w:pPr>
-      <w:bookmarkStart w:id="27" w:name="_Toc238562655"/>
+      <w:bookmarkStart w:id="27" w:name="_Toc238563319"/>
       <w:r>
         <w:rPr>
           <w:b/>
@@ -11270,7 +11270,7 @@
         <w:pStyle w:val="Heading3"/>
         <w:spacing w:before="240" w:after="120" w:line="360" w:lineRule="auto"/>
       </w:pPr>
-      <w:bookmarkStart w:id="28" w:name="_Toc238562656"/>
+      <w:bookmarkStart w:id="28" w:name="_Toc238563320"/>
       <w:r>
         <w:rPr>
           <w:b/>
@@ -11488,10 +11488,10 @@
           <w:noProof/>
         </w:rPr>
         <w:drawing>
-          <wp:inline distT="0" distB="0" distL="0" distR="0" wp14:anchorId="5D77C901" wp14:editId="57670294">
+          <wp:inline distT="0" distB="0" distL="0" distR="0" wp14:anchorId="0D2ED404" wp14:editId="58884CBB">
             <wp:extent cx="5334000" cy="3857625"/>
             <wp:effectExtent l="0" t="0" r="0" b="0"/>
-            <wp:docPr id="1123319777" name="Picture 1123319777"/>
+            <wp:docPr id="695682413" name="Picture 695682413"/>
             <wp:cNvGraphicFramePr>
               <a:graphicFrameLocks xmlns:a="http://schemas.openxmlformats.org/drawingml/2006/main" noChangeAspect="1"/>
             </wp:cNvGraphicFramePr>
@@ -11547,7 +11547,7 @@
         <w:pStyle w:val="Heading3"/>
         <w:spacing w:before="240" w:after="120" w:line="360" w:lineRule="auto"/>
       </w:pPr>
-      <w:bookmarkStart w:id="29" w:name="_Toc238562657"/>
+      <w:bookmarkStart w:id="29" w:name="_Toc238563321"/>
       <w:r>
         <w:rPr>
           <w:b/>
@@ -11635,7 +11635,7 @@
         <w:pStyle w:val="Heading3"/>
         <w:spacing w:before="240" w:after="120" w:line="360" w:lineRule="auto"/>
       </w:pPr>
-      <w:bookmarkStart w:id="30" w:name="_Toc238562658"/>
+      <w:bookmarkStart w:id="30" w:name="_Toc238563322"/>
       <w:r>
         <w:rPr>
           <w:b/>
@@ -11882,7 +11882,7 @@
         <w:pStyle w:val="Heading3"/>
         <w:spacing w:before="240" w:after="120" w:line="360" w:lineRule="auto"/>
       </w:pPr>
-      <w:bookmarkStart w:id="31" w:name="_Toc238562659"/>
+      <w:bookmarkStart w:id="31" w:name="_Toc238563323"/>
       <w:r>
         <w:rPr>
           <w:b/>
@@ -11928,7 +11928,7 @@
         <w:pStyle w:val="Heading2"/>
         <w:spacing w:before="240" w:after="120" w:line="360" w:lineRule="auto"/>
       </w:pPr>
-      <w:bookmarkStart w:id="32" w:name="_Toc238562660"/>
+      <w:bookmarkStart w:id="32" w:name="_Toc238563324"/>
       <w:r>
         <w:rPr>
           <w:b/>
@@ -12226,7 +12226,7 @@
             <w:color w:val="0B3954"/>
             <w:u w:val="single"/>
           </w:rPr>
-          <w:t>https://github.com/TharusanK23/sunrise-dental-clinic</w:t>
+          <w:t>https://github.com/KirishaTharusan/sunrise-dental-clinic</w:t>
         </w:r>
       </w:hyperlink>
       <w:r>
@@ -12271,10 +12271,10 @@
         </w:rPr>
         <w:lastRenderedPageBreak/>
         <w:drawing>
-          <wp:inline distT="0" distB="0" distL="0" distR="0" wp14:anchorId="25DAD217" wp14:editId="56BA8C87">
+          <wp:inline distT="0" distB="0" distL="0" distR="0" wp14:anchorId="7FF4935F" wp14:editId="64C6A3DD">
             <wp:extent cx="5334000" cy="3705225"/>
             <wp:effectExtent l="0" t="0" r="0" b="0"/>
-            <wp:docPr id="199256812" name="Picture 199256812"/>
+            <wp:docPr id="1748543467" name="Picture 1748543467"/>
             <wp:cNvGraphicFramePr>
               <a:graphicFrameLocks xmlns:a="http://schemas.openxmlformats.org/drawingml/2006/main" noChangeAspect="1"/>
             </wp:cNvGraphicFramePr>
@@ -12335,10 +12335,10 @@
           <w:noProof/>
         </w:rPr>
         <w:drawing>
-          <wp:inline distT="0" distB="0" distL="0" distR="0" wp14:anchorId="4DADFE85" wp14:editId="270A083D">
+          <wp:inline distT="0" distB="0" distL="0" distR="0" wp14:anchorId="338934F8" wp14:editId="31C1E636">
             <wp:extent cx="5334000" cy="3705225"/>
             <wp:effectExtent l="0" t="0" r="0" b="0"/>
-            <wp:docPr id="1217102686" name="Picture 1217102686"/>
+            <wp:docPr id="2057190368" name="Picture 2057190368"/>
             <wp:cNvGraphicFramePr>
               <a:graphicFrameLocks xmlns:a="http://schemas.openxmlformats.org/drawingml/2006/main" noChangeAspect="1"/>
             </wp:cNvGraphicFramePr>
@@ -12402,7 +12402,7 @@
         <w:pStyle w:val="Heading2"/>
         <w:spacing w:before="240" w:after="120" w:line="360" w:lineRule="auto"/>
       </w:pPr>
-      <w:bookmarkStart w:id="33" w:name="_Toc238562661"/>
+      <w:bookmarkStart w:id="33" w:name="_Toc238563325"/>
       <w:r>
         <w:rPr>
           <w:b/>
@@ -12432,8 +12432,8 @@
         <w:tblLook w:val="04A0" w:firstRow="1" w:lastRow="0" w:firstColumn="1" w:lastColumn="0" w:noHBand="0" w:noVBand="1"/>
       </w:tblPr>
       <w:tblGrid>
-        <w:gridCol w:w="3447"/>
-        <w:gridCol w:w="4851"/>
+        <w:gridCol w:w="3295"/>
+        <w:gridCol w:w="5003"/>
       </w:tblGrid>
       <w:tr>
         <w:tblPrEx>
@@ -13122,6 +13122,7 @@
               <w:spacing w:line="360" w:lineRule="auto"/>
             </w:pPr>
             <w:r>
+              <w:lastRenderedPageBreak/>
               <w:t>Devised/derived test data; test plan produced and applied</w:t>
             </w:r>
           </w:p>
@@ -13180,7 +13181,6 @@
               <w:spacing w:line="360" w:lineRule="auto"/>
             </w:pPr>
             <w:r>
-              <w:lastRenderedPageBreak/>
               <w:t>Test classes created; relevant tests carried out and documented</w:t>
             </w:r>
           </w:p>
@@ -13627,7 +13627,7 @@
                   <w:color w:val="0B3954"/>
                   <w:u w:val="single"/>
                 </w:rPr>
-                <w:t>https://github.com/TharusanK23/sunrise-dental-clinic</w:t>
+                <w:t>https://github.com/KirishaTharusan/sunrise-dental-clinic</w:t>
               </w:r>
             </w:hyperlink>
             <w:r>
@@ -13655,7 +13655,7 @@
         <w:pStyle w:val="Heading2"/>
         <w:spacing w:before="240" w:after="120" w:line="360" w:lineRule="auto"/>
       </w:pPr>
-      <w:bookmarkStart w:id="34" w:name="_Toc238562662"/>
+      <w:bookmarkStart w:id="34" w:name="_Toc238563326"/>
       <w:r>
         <w:rPr>
           <w:b/>
@@ -13677,17 +13677,14 @@
           <w:b/>
           <w:bCs/>
         </w:rPr>
+        <w:lastRenderedPageBreak/>
         <w:t>Ethical.</w:t>
       </w:r>
       <w:r>
         <w:t xml:space="preserve"> Patient data protection was treated as a first-class design </w:t>
       </w:r>
       <w:r>
-        <w:t xml:space="preserve">constraint, not an afterthought: passwords are never stored or logged in plain text (BCrypt, §3.6); the authentication token is delivered as an HttpOnly cookie specifically so client-side JavaScript — including any third-party script that might be compromised — cannot </w:t>
-      </w:r>
-      <w:r>
-        <w:lastRenderedPageBreak/>
-        <w:t xml:space="preserve">read it; and every input is validated server-side even though the client also validates, because client-side checks are trivially bypassable and cannot be the sole safeguard for a system handling patients' contact details and (implicitly) </w:t>
+        <w:t xml:space="preserve">constraint, not an afterthought: passwords are never stored or logged in plain text (BCrypt, §3.6); the authentication token is delivered as an HttpOnly cookie specifically so client-side JavaScript — including any third-party script that might be compromised — cannot read it; and every input is validated server-side even though the client also validates, because client-side checks are trivially bypassable and cannot be the sole safeguard for a system handling patients' contact details and (implicitly) </w:t>
       </w:r>
       <w:r>
         <w:t>health-adjacent treatment history.</w:t>
@@ -13799,7 +13796,7 @@
         <w:pStyle w:val="Heading2"/>
         <w:spacing w:before="240" w:after="120" w:line="360" w:lineRule="auto"/>
       </w:pPr>
-      <w:bookmarkStart w:id="35" w:name="_Toc238562663"/>
+      <w:bookmarkStart w:id="35" w:name="_Toc238563327"/>
       <w:r>
         <w:rPr>
           <w:b/>
@@ -13817,7 +13814,11 @@
         <w:jc w:val="both"/>
       </w:pPr>
       <w:r>
-        <w:t xml:space="preserve">This project delivers a complete, working, three-tier dental-clinic appointment and billing system that fulfils every functional requirement in the assignment brief's scenario, five deliberately-justified design patterns plus the Repository pattern, a MySQL database exercising triggers/a stored procedure/views beyond basic CRUD, a documented and </w:t>
+        <w:t xml:space="preserve">This project delivers a complete, working, three-tier dental-clinic appointment and billing system that fulfils every functional requirement in the assignment brief's scenario, five deliberately-justified design patterns plus the Repository pattern, a </w:t>
+      </w:r>
+      <w:r>
+        <w:lastRenderedPageBreak/>
+        <w:t xml:space="preserve">MySQL database exercising triggers/a stored procedure/views beyond basic CRUD, a documented and </w:t>
       </w:r>
       <w:r>
         <w:t xml:space="preserve">partially test-driven automated test suite with genuine, recorded lessons learned, and a </w:t>
@@ -13838,11 +13839,7 @@
         <w:t>release</w:t>
       </w:r>
       <w:r>
-        <w:t xml:space="preserve"> Git/GitHub workflow with CI wired in from the first push. The most significant honest limitation is scope, not correctness: the domain model </w:t>
-      </w:r>
-      <w:r>
-        <w:lastRenderedPageBreak/>
-        <w:t xml:space="preserve">is intentionally simpler than a production clinic system would need (§2.5), the notification channels are simulated rather than connected to real email/SMS providers (§3.3.5), and the Git commit history was necessarily created in one development session rather </w:t>
+        <w:t xml:space="preserve"> Git/GitHub workflow with CI wired in from the first push. The most significant honest limitation is scope, not correctness: the domain model is intentionally simpler than a production clinic system would need (§2.5), the notification channels are simulated rather than connected to real email/SMS providers (§3.3.5), and the Git commit history was necessarily created in one development session rather </w:t>
       </w:r>
       <w:r>
         <w:t xml:space="preserve">than genuinely across several calendar days — each of these is disclosed explicitly rather than concealed, and each has a clear, stated path to being extended (§5, </w:t>
@@ -13873,7 +13870,7 @@
         <w:pStyle w:val="Heading2"/>
         <w:spacing w:before="240" w:after="120" w:line="360" w:lineRule="auto"/>
       </w:pPr>
-      <w:bookmarkStart w:id="36" w:name="_Toc238562664"/>
+      <w:bookmarkStart w:id="36" w:name="_Toc238563328"/>
       <w:r>
         <w:rPr>
           <w:b/>
@@ -14067,6 +14064,7 @@
         <w:jc w:val="both"/>
       </w:pPr>
       <w:r>
+        <w:lastRenderedPageBreak/>
         <w:t xml:space="preserve">OWASP Foundation (2021) </w:t>
       </w:r>
       <w:r>
@@ -14098,7 +14096,6 @@
         <w:jc w:val="both"/>
       </w:pPr>
       <w:r>
-        <w:lastRenderedPageBreak/>
         <w:t xml:space="preserve">Spring.io (2024) </w:t>
       </w:r>
       <w:r>
@@ -14168,7 +14165,7 @@
         <w:pStyle w:val="Heading2"/>
         <w:spacing w:before="240" w:after="120" w:line="360" w:lineRule="auto"/>
       </w:pPr>
-      <w:bookmarkStart w:id="37" w:name="_Toc238562665"/>
+      <w:bookmarkStart w:id="37" w:name="_Toc238563329"/>
       <w:r>
         <w:rPr>
           <w:b/>
@@ -14445,10 +14442,10 @@
 <file path=word/numbering.xml><?xml version="1.0" encoding="utf-8"?>
 <w:numbering xmlns:wpc="http://schemas.microsoft.com/office/word/2010/wordprocessingCanvas" xmlns:cx="http://schemas.microsoft.com/office/drawing/2014/chartex" xmlns:cx1="http://schemas.microsoft.com/office/drawing/2015/9/8/chartex" xmlns:cx2="http://schemas.microsoft.com/office/drawing/2015/10/21/chartex" xmlns:cx3="http://schemas.microsoft.com/office/drawing/2016/5/9/chartex" xmlns:cx4="http://schemas.microsoft.com/office/drawing/2016/5/10/chartex" xmlns:cx5="http://schemas.microsoft.com/office/drawing/2016/5/11/chartex" xmlns:cx6="http://schemas.microsoft.com/office/drawing/2016/5/12/chartex" xmlns:cx7="http://schemas.microsoft.com/office/drawing/2016/5/13/chartex" xmlns:cx8="http://schemas.microsoft.com/office/drawing/2016/5/14/chartex" xmlns:mc="http://schemas.openxmlformats.org/markup-compatibility/2006" xmlns:aink="http://schemas.microsoft.com/office/drawing/2016/ink" xmlns:am3d="http://schemas.microsoft.com/office/drawing/2017/model3d" xmlns:o="urn:schemas-microsoft-com:office:office" xmlns:oel="http://schemas.microsoft.com/office/2019/extlst" xmlns:r="http://schemas.openxmlformats.org/officeDocument/2006/relationships" xmlns:m="http://schemas.openxmlformats.org/officeDocument/2006/math" xmlns:v="urn:schemas-microsoft-com:vml" xmlns:wp14="http://schemas.microsoft.com/office/word/2010/wordprocessingDrawing" xmlns:wp="http://schemas.openxmlformats.org/drawingml/2006/wordprocessingDrawing" xmlns:w10="urn:schemas-microsoft-com:office:word" xmlns:w="http://schemas.openxmlformats.org/wordprocessingml/2006/main" xmlns:w14="http://schemas.microsoft.com/office/word/2010/wordml" xmlns:w15="http://schemas.microsoft.com/office/word/2012/wordml" xmlns:w16cex="http://schemas.microsoft.com/office/word/2018/wordml/cex" xmlns:w16cid="http://schemas.microsoft.com/office/word/2016/wordml/cid" xmlns:w16="http://schemas.microsoft.com/office/word/2018/wordml" xmlns:w16du="http://schemas.microsoft.com/office/word/2023/wordml/word16du" xmlns:w16sdtdh="http://schemas.microsoft.com/office/word/2020/wordml/sdtdatahash" xmlns:w16sdtfl="http://schemas.microsoft.com/office/word/2024/wordml/sdtformatlock" xmlns:w16se="http://schemas.microsoft.com/office/word/2015/wordml/symex" xmlns:wpg="http://schemas.microsoft.com/office/word/2010/wordprocessingGroup" xmlns:wpi="http://schemas.microsoft.com/office/word/2010/wordprocessingInk" xmlns:wne="http://schemas.microsoft.com/office/word/2006/wordml" xmlns:wps="http://schemas.microsoft.com/office/word/2010/wordprocessingShape" mc:Ignorable="w14 w15 w16se w16cid w16 w16cex w16sdtdh w16sdtfl w16du wp14">
   <w:abstractNum w:abstractNumId="0" w15:restartNumberingAfterBreak="0">
-    <w:nsid w:val="735C7158"/>
+    <w:nsid w:val="235F39C5"/>
     <w:multiLevelType w:val="hybridMultilevel"/>
-    <w:tmpl w:val="3B78D030"/>
-    <w:lvl w:ilvl="0" w:tplc="77348238">
+    <w:tmpl w:val="421CB418"/>
+    <w:lvl w:ilvl="0" w:tplc="80FE0052">
       <w:start w:val="1"/>
       <w:numFmt w:val="bullet"/>
       <w:lvlText w:val="●"/>
@@ -14457,7 +14454,7 @@
         <w:ind w:left="720" w:hanging="360"/>
       </w:pPr>
     </w:lvl>
-    <w:lvl w:ilvl="1" w:tplc="07BC25F2">
+    <w:lvl w:ilvl="1" w:tplc="C3065E52">
       <w:start w:val="1"/>
       <w:numFmt w:val="bullet"/>
       <w:lvlText w:val="○"/>
@@ -14466,7 +14463,7 @@
         <w:ind w:left="1440" w:hanging="360"/>
       </w:pPr>
     </w:lvl>
-    <w:lvl w:ilvl="2" w:tplc="3C10B75A">
+    <w:lvl w:ilvl="2" w:tplc="0DA0FA60">
       <w:start w:val="1"/>
       <w:numFmt w:val="bullet"/>
       <w:lvlText w:val="■"/>
@@ -14475,7 +14472,7 @@
         <w:ind w:left="2160" w:hanging="360"/>
       </w:pPr>
     </w:lvl>
-    <w:lvl w:ilvl="3" w:tplc="78A00278">
+    <w:lvl w:ilvl="3" w:tplc="F7D66D0C">
       <w:start w:val="1"/>
       <w:numFmt w:val="bullet"/>
       <w:lvlText w:val="●"/>
@@ -14484,7 +14481,7 @@
         <w:ind w:left="2880" w:hanging="360"/>
       </w:pPr>
     </w:lvl>
-    <w:lvl w:ilvl="4" w:tplc="F2F0963C">
+    <w:lvl w:ilvl="4" w:tplc="CD9C73DC">
       <w:start w:val="1"/>
       <w:numFmt w:val="bullet"/>
       <w:lvlText w:val="○"/>
@@ -14493,7 +14490,7 @@
         <w:ind w:left="3600" w:hanging="360"/>
       </w:pPr>
     </w:lvl>
-    <w:lvl w:ilvl="5" w:tplc="F5BE3152">
+    <w:lvl w:ilvl="5" w:tplc="2A86CACA">
       <w:start w:val="1"/>
       <w:numFmt w:val="bullet"/>
       <w:lvlText w:val="■"/>
@@ -14502,7 +14499,7 @@
         <w:ind w:left="4320" w:hanging="360"/>
       </w:pPr>
     </w:lvl>
-    <w:lvl w:ilvl="6" w:tplc="7FC4F664">
+    <w:lvl w:ilvl="6" w:tplc="1ED8B760">
       <w:start w:val="1"/>
       <w:numFmt w:val="bullet"/>
       <w:lvlText w:val="●"/>
@@ -14511,7 +14508,7 @@
         <w:ind w:left="5040" w:hanging="360"/>
       </w:pPr>
     </w:lvl>
-    <w:lvl w:ilvl="7" w:tplc="062AB760">
+    <w:lvl w:ilvl="7" w:tplc="8C46E4B0">
       <w:start w:val="1"/>
       <w:numFmt w:val="bullet"/>
       <w:lvlText w:val="●"/>
@@ -14520,7 +14517,7 @@
         <w:ind w:left="5760" w:hanging="360"/>
       </w:pPr>
     </w:lvl>
-    <w:lvl w:ilvl="8" w:tplc="81F03208">
+    <w:lvl w:ilvl="8" w:tplc="E294C500">
       <w:start w:val="1"/>
       <w:numFmt w:val="bullet"/>
       <w:lvlText w:val="●"/>
@@ -14530,7 +14527,7 @@
       </w:pPr>
     </w:lvl>
   </w:abstractNum>
-  <w:num w:numId="1" w16cid:durableId="1119028359">
+  <w:num w:numId="1" w16cid:durableId="2118864330">
     <w:abstractNumId w:val="0"/>
     <w:lvlOverride w:ilvl="0">
       <w:startOverride w:val="1"/>
@@ -15136,7 +15133,7 @@
     <w:basedOn w:val="Normal"/>
     <w:uiPriority w:val="1"/>
     <w:qFormat/>
-    <w:rsid w:val="00764C14"/>
+    <w:rsid w:val="00C424A0"/>
     <w:pPr>
       <w:spacing w:after="160" w:line="279" w:lineRule="auto"/>
     </w:pPr>
@@ -15154,7 +15151,7 @@
     <w:autoRedefine/>
     <w:uiPriority w:val="39"/>
     <w:unhideWhenUsed/>
-    <w:rsid w:val="00764C14"/>
+    <w:rsid w:val="00C424A0"/>
     <w:pPr>
       <w:spacing w:after="100"/>
       <w:ind w:left="240"/>
@@ -15167,7 +15164,7 @@
     <w:autoRedefine/>
     <w:uiPriority w:val="39"/>
     <w:unhideWhenUsed/>
-    <w:rsid w:val="00764C14"/>
+    <w:rsid w:val="00C424A0"/>
     <w:pPr>
       <w:spacing w:after="100"/>
       <w:ind w:left="480"/>
@@ -15180,7 +15177,7 @@
     <w:autoRedefine/>
     <w:uiPriority w:val="39"/>
     <w:unhideWhenUsed/>
-    <w:rsid w:val="00764C14"/>
+    <w:rsid w:val="00C424A0"/>
     <w:pPr>
       <w:spacing w:after="100"/>
       <w:ind w:left="720"/>

</xml_diff>

<commit_message>
Recapture the login screenshot with the current staff credential
testing/screenshots/01-login.png still showed the old, pre-rotation
staff demo account (nadeesha) even though database/schema.sql and the
live login page have used kirisha/Kirisha@123 since the credential
rotation - recaptured from the running app so the evidence matches
what's actually seeded. Report exports regenerated to embed the
updated screenshot.

Co-Authored-By: Claude Sonnet 5 <noreply@anthropic.com>
</commit_message>
<xml_diff>
--- a/docs/ASSIGNMENT_REPORT.docx
+++ b/docs/ASSIGNMENT_REPORT.docx
@@ -2523,7 +2523,7 @@
       <w:r>
         <w:fldChar w:fldCharType="separate"/>
       </w:r>
-      <w:hyperlink w:anchor="_Toc238563292" w:history="1">
+      <w:hyperlink w:anchor="_Toc238564205" w:history="1">
         <w:r>
           <w:rPr>
             <w:rStyle w:val="Hyperlink"/>
@@ -2549,7 +2549,7 @@
           <w:rPr>
             <w:noProof/>
           </w:rPr>
-          <w:instrText xml:space="preserve"> PAGEREF _Toc238563292 \h </w:instrText>
+          <w:instrText xml:space="preserve"> PAGEREF _Toc238564205 \h </w:instrText>
         </w:r>
         <w:r>
           <w:rPr>
@@ -2586,7 +2586,7 @@
           <w:noProof/>
         </w:rPr>
       </w:pPr>
-      <w:hyperlink w:anchor="_Toc238563293" w:history="1">
+      <w:hyperlink w:anchor="_Toc238564206" w:history="1">
         <w:r>
           <w:rPr>
             <w:rStyle w:val="Hyperlink"/>
@@ -2612,7 +2612,7 @@
           <w:rPr>
             <w:noProof/>
           </w:rPr>
-          <w:instrText xml:space="preserve"> PAGEREF _Toc238563293 \h </w:instrText>
+          <w:instrText xml:space="preserve"> PAGEREF _Toc238564206 \h </w:instrText>
         </w:r>
         <w:r>
           <w:rPr>
@@ -2649,7 +2649,7 @@
           <w:noProof/>
         </w:rPr>
       </w:pPr>
-      <w:hyperlink w:anchor="_Toc238563294" w:history="1">
+      <w:hyperlink w:anchor="_Toc238564207" w:history="1">
         <w:r>
           <w:rPr>
             <w:rStyle w:val="Hyperlink"/>
@@ -2675,7 +2675,7 @@
           <w:rPr>
             <w:noProof/>
           </w:rPr>
-          <w:instrText xml:space="preserve"> PAGEREF _Toc238563294 \h </w:instrText>
+          <w:instrText xml:space="preserve"> PAGEREF _Toc238564207 \h </w:instrText>
         </w:r>
         <w:r>
           <w:rPr>
@@ -2712,7 +2712,7 @@
           <w:noProof/>
         </w:rPr>
       </w:pPr>
-      <w:hyperlink w:anchor="_Toc238563295" w:history="1">
+      <w:hyperlink w:anchor="_Toc238564208" w:history="1">
         <w:r>
           <w:rPr>
             <w:rStyle w:val="Hyperlink"/>
@@ -2738,7 +2738,7 @@
           <w:rPr>
             <w:noProof/>
           </w:rPr>
-          <w:instrText xml:space="preserve"> PAGEREF _Toc238563295 \h </w:instrText>
+          <w:instrText xml:space="preserve"> PAGEREF _Toc238564208 \h </w:instrText>
         </w:r>
         <w:r>
           <w:rPr>
@@ -2775,7 +2775,7 @@
           <w:noProof/>
         </w:rPr>
       </w:pPr>
-      <w:hyperlink w:anchor="_Toc238563296" w:history="1">
+      <w:hyperlink w:anchor="_Toc238564209" w:history="1">
         <w:r>
           <w:rPr>
             <w:rStyle w:val="Hyperlink"/>
@@ -2801,7 +2801,7 @@
           <w:rPr>
             <w:noProof/>
           </w:rPr>
-          <w:instrText xml:space="preserve"> PAGEREF _Toc238563296 \h </w:instrText>
+          <w:instrText xml:space="preserve"> PAGEREF _Toc238564209 \h </w:instrText>
         </w:r>
         <w:r>
           <w:rPr>
@@ -2838,7 +2838,7 @@
           <w:noProof/>
         </w:rPr>
       </w:pPr>
-      <w:hyperlink w:anchor="_Toc238563297" w:history="1">
+      <w:hyperlink w:anchor="_Toc238564210" w:history="1">
         <w:r>
           <w:rPr>
             <w:rStyle w:val="Hyperlink"/>
@@ -2864,7 +2864,7 @@
           <w:rPr>
             <w:noProof/>
           </w:rPr>
-          <w:instrText xml:space="preserve"> PAGEREF _Toc238563297 \h </w:instrText>
+          <w:instrText xml:space="preserve"> PAGEREF _Toc238564210 \h </w:instrText>
         </w:r>
         <w:r>
           <w:rPr>
@@ -2901,7 +2901,7 @@
           <w:noProof/>
         </w:rPr>
       </w:pPr>
-      <w:hyperlink w:anchor="_Toc238563298" w:history="1">
+      <w:hyperlink w:anchor="_Toc238564211" w:history="1">
         <w:r>
           <w:rPr>
             <w:rStyle w:val="Hyperlink"/>
@@ -2927,7 +2927,7 @@
           <w:rPr>
             <w:noProof/>
           </w:rPr>
-          <w:instrText xml:space="preserve"> PAGEREF _Toc238563298 \h </w:instrText>
+          <w:instrText xml:space="preserve"> PAGEREF _Toc238564211 \h </w:instrText>
         </w:r>
         <w:r>
           <w:rPr>
@@ -2964,7 +2964,7 @@
           <w:noProof/>
         </w:rPr>
       </w:pPr>
-      <w:hyperlink w:anchor="_Toc238563299" w:history="1">
+      <w:hyperlink w:anchor="_Toc238564212" w:history="1">
         <w:r>
           <w:rPr>
             <w:rStyle w:val="Hyperlink"/>
@@ -2990,7 +2990,7 @@
           <w:rPr>
             <w:noProof/>
           </w:rPr>
-          <w:instrText xml:space="preserve"> PAGEREF _Toc238563299 \h </w:instrText>
+          <w:instrText xml:space="preserve"> PAGEREF _Toc238564212 \h </w:instrText>
         </w:r>
         <w:r>
           <w:rPr>
@@ -3027,7 +3027,7 @@
           <w:noProof/>
         </w:rPr>
       </w:pPr>
-      <w:hyperlink w:anchor="_Toc238563300" w:history="1">
+      <w:hyperlink w:anchor="_Toc238564213" w:history="1">
         <w:r>
           <w:rPr>
             <w:rStyle w:val="Hyperlink"/>
@@ -3053,7 +3053,7 @@
           <w:rPr>
             <w:noProof/>
           </w:rPr>
-          <w:instrText xml:space="preserve"> PAGEREF _Toc238563300 \h </w:instrText>
+          <w:instrText xml:space="preserve"> PAGEREF _Toc238564213 \h </w:instrText>
         </w:r>
         <w:r>
           <w:rPr>
@@ -3090,7 +3090,7 @@
           <w:noProof/>
         </w:rPr>
       </w:pPr>
-      <w:hyperlink w:anchor="_Toc238563301" w:history="1">
+      <w:hyperlink w:anchor="_Toc238564214" w:history="1">
         <w:r>
           <w:rPr>
             <w:rStyle w:val="Hyperlink"/>
@@ -3116,7 +3116,7 @@
           <w:rPr>
             <w:noProof/>
           </w:rPr>
-          <w:instrText xml:space="preserve"> PAGEREF _Toc238563301 \h </w:instrText>
+          <w:instrText xml:space="preserve"> PAGEREF _Toc238564214 \h </w:instrText>
         </w:r>
         <w:r>
           <w:rPr>
@@ -3153,7 +3153,7 @@
           <w:noProof/>
         </w:rPr>
       </w:pPr>
-      <w:hyperlink w:anchor="_Toc238563302" w:history="1">
+      <w:hyperlink w:anchor="_Toc238564215" w:history="1">
         <w:r>
           <w:rPr>
             <w:rStyle w:val="Hyperlink"/>
@@ -3179,7 +3179,7 @@
           <w:rPr>
             <w:noProof/>
           </w:rPr>
-          <w:instrText xml:space="preserve"> PAGEREF _Toc238563302 \h </w:instrText>
+          <w:instrText xml:space="preserve"> PAGEREF _Toc238564215 \h </w:instrText>
         </w:r>
         <w:r>
           <w:rPr>
@@ -3216,7 +3216,7 @@
           <w:noProof/>
         </w:rPr>
       </w:pPr>
-      <w:hyperlink w:anchor="_Toc238563303" w:history="1">
+      <w:hyperlink w:anchor="_Toc238564216" w:history="1">
         <w:r>
           <w:rPr>
             <w:rStyle w:val="Hyperlink"/>
@@ -3242,7 +3242,7 @@
           <w:rPr>
             <w:noProof/>
           </w:rPr>
-          <w:instrText xml:space="preserve"> PAGEREF _Toc238563303 \h </w:instrText>
+          <w:instrText xml:space="preserve"> PAGEREF _Toc238564216 \h </w:instrText>
         </w:r>
         <w:r>
           <w:rPr>
@@ -3279,7 +3279,7 @@
           <w:noProof/>
         </w:rPr>
       </w:pPr>
-      <w:hyperlink w:anchor="_Toc238563304" w:history="1">
+      <w:hyperlink w:anchor="_Toc238564217" w:history="1">
         <w:r>
           <w:rPr>
             <w:rStyle w:val="Hyperlink"/>
@@ -3305,7 +3305,7 @@
           <w:rPr>
             <w:noProof/>
           </w:rPr>
-          <w:instrText xml:space="preserve"> PAGEREF _Toc238563304 \h </w:instrText>
+          <w:instrText xml:space="preserve"> PAGEREF _Toc238564217 \h </w:instrText>
         </w:r>
         <w:r>
           <w:rPr>
@@ -3342,7 +3342,7 @@
           <w:noProof/>
         </w:rPr>
       </w:pPr>
-      <w:hyperlink w:anchor="_Toc238563305" w:history="1">
+      <w:hyperlink w:anchor="_Toc238564218" w:history="1">
         <w:r>
           <w:rPr>
             <w:rStyle w:val="Hyperlink"/>
@@ -3368,7 +3368,7 @@
           <w:rPr>
             <w:noProof/>
           </w:rPr>
-          <w:instrText xml:space="preserve"> PAGEREF _Toc238563305 \h </w:instrText>
+          <w:instrText xml:space="preserve"> PAGEREF _Toc238564218 \h </w:instrText>
         </w:r>
         <w:r>
           <w:rPr>
@@ -3405,7 +3405,7 @@
           <w:noProof/>
         </w:rPr>
       </w:pPr>
-      <w:hyperlink w:anchor="_Toc238563306" w:history="1">
+      <w:hyperlink w:anchor="_Toc238564219" w:history="1">
         <w:r>
           <w:rPr>
             <w:rStyle w:val="Hyperlink"/>
@@ -3431,7 +3431,7 @@
           <w:rPr>
             <w:noProof/>
           </w:rPr>
-          <w:instrText xml:space="preserve"> PAGEREF _Toc238563306 \h </w:instrText>
+          <w:instrText xml:space="preserve"> PAGEREF _Toc238564219 \h </w:instrText>
         </w:r>
         <w:r>
           <w:rPr>
@@ -3468,7 +3468,7 @@
           <w:noProof/>
         </w:rPr>
       </w:pPr>
-      <w:hyperlink w:anchor="_Toc238563307" w:history="1">
+      <w:hyperlink w:anchor="_Toc238564220" w:history="1">
         <w:r>
           <w:rPr>
             <w:rStyle w:val="Hyperlink"/>
@@ -3523,7 +3523,7 @@
           <w:rPr>
             <w:noProof/>
           </w:rPr>
-          <w:instrText xml:space="preserve"> PAGEREF _Toc238563307 \h </w:instrText>
+          <w:instrText xml:space="preserve"> PAGEREF _Toc238564220 \h </w:instrText>
         </w:r>
         <w:r>
           <w:rPr>
@@ -3560,7 +3560,7 @@
           <w:noProof/>
         </w:rPr>
       </w:pPr>
-      <w:hyperlink w:anchor="_Toc238563308" w:history="1">
+      <w:hyperlink w:anchor="_Toc238564221" w:history="1">
         <w:r>
           <w:rPr>
             <w:rStyle w:val="Hyperlink"/>
@@ -3596,7 +3596,7 @@
           <w:rPr>
             <w:noProof/>
           </w:rPr>
-          <w:instrText xml:space="preserve"> PAGEREF _Toc238563308 \h </w:instrText>
+          <w:instrText xml:space="preserve"> PAGEREF _Toc238564221 \h </w:instrText>
         </w:r>
         <w:r>
           <w:rPr>
@@ -3633,7 +3633,7 @@
           <w:noProof/>
         </w:rPr>
       </w:pPr>
-      <w:hyperlink w:anchor="_Toc238563309" w:history="1">
+      <w:hyperlink w:anchor="_Toc238564222" w:history="1">
         <w:r>
           <w:rPr>
             <w:rStyle w:val="Hyperlink"/>
@@ -3669,7 +3669,7 @@
           <w:rPr>
             <w:noProof/>
           </w:rPr>
-          <w:instrText xml:space="preserve"> PAGEREF _Toc238563309 \h </w:instrText>
+          <w:instrText xml:space="preserve"> PAGEREF _Toc238564222 \h </w:instrText>
         </w:r>
         <w:r>
           <w:rPr>
@@ -3706,7 +3706,7 @@
           <w:noProof/>
         </w:rPr>
       </w:pPr>
-      <w:hyperlink w:anchor="_Toc238563310" w:history="1">
+      <w:hyperlink w:anchor="_Toc238564223" w:history="1">
         <w:r>
           <w:rPr>
             <w:rStyle w:val="Hyperlink"/>
@@ -3761,7 +3761,7 @@
           <w:rPr>
             <w:noProof/>
           </w:rPr>
-          <w:instrText xml:space="preserve"> PAGEREF _Toc238563310 \h </w:instrText>
+          <w:instrText xml:space="preserve"> PAGEREF _Toc238564223 \h </w:instrText>
         </w:r>
         <w:r>
           <w:rPr>
@@ -3798,7 +3798,7 @@
           <w:noProof/>
         </w:rPr>
       </w:pPr>
-      <w:hyperlink w:anchor="_Toc238563311" w:history="1">
+      <w:hyperlink w:anchor="_Toc238564224" w:history="1">
         <w:r>
           <w:rPr>
             <w:rStyle w:val="Hyperlink"/>
@@ -3853,7 +3853,7 @@
           <w:rPr>
             <w:noProof/>
           </w:rPr>
-          <w:instrText xml:space="preserve"> PAGEREF _Toc238563311 \h </w:instrText>
+          <w:instrText xml:space="preserve"> PAGEREF _Toc238564224 \h </w:instrText>
         </w:r>
         <w:r>
           <w:rPr>
@@ -3890,7 +3890,7 @@
           <w:noProof/>
         </w:rPr>
       </w:pPr>
-      <w:hyperlink w:anchor="_Toc238563312" w:history="1">
+      <w:hyperlink w:anchor="_Toc238564225" w:history="1">
         <w:r>
           <w:rPr>
             <w:rStyle w:val="Hyperlink"/>
@@ -3916,7 +3916,7 @@
           <w:rPr>
             <w:noProof/>
           </w:rPr>
-          <w:instrText xml:space="preserve"> PAGEREF _Toc238563312 \h </w:instrText>
+          <w:instrText xml:space="preserve"> PAGEREF _Toc238564225 \h </w:instrText>
         </w:r>
         <w:r>
           <w:rPr>
@@ -3953,7 +3953,7 @@
           <w:noProof/>
         </w:rPr>
       </w:pPr>
-      <w:hyperlink w:anchor="_Toc238563313" w:history="1">
+      <w:hyperlink w:anchor="_Toc238564226" w:history="1">
         <w:r>
           <w:rPr>
             <w:rStyle w:val="Hyperlink"/>
@@ -3979,7 +3979,7 @@
           <w:rPr>
             <w:noProof/>
           </w:rPr>
-          <w:instrText xml:space="preserve"> PAGEREF _Toc238563313 \h </w:instrText>
+          <w:instrText xml:space="preserve"> PAGEREF _Toc238564226 \h </w:instrText>
         </w:r>
         <w:r>
           <w:rPr>
@@ -4016,7 +4016,7 @@
           <w:noProof/>
         </w:rPr>
       </w:pPr>
-      <w:hyperlink w:anchor="_Toc238563314" w:history="1">
+      <w:hyperlink w:anchor="_Toc238564227" w:history="1">
         <w:r>
           <w:rPr>
             <w:rStyle w:val="Hyperlink"/>
@@ -4042,7 +4042,7 @@
           <w:rPr>
             <w:noProof/>
           </w:rPr>
-          <w:instrText xml:space="preserve"> PAGEREF _Toc238563314 \h </w:instrText>
+          <w:instrText xml:space="preserve"> PAGEREF _Toc238564227 \h </w:instrText>
         </w:r>
         <w:r>
           <w:rPr>
@@ -4079,7 +4079,7 @@
           <w:noProof/>
         </w:rPr>
       </w:pPr>
-      <w:hyperlink w:anchor="_Toc238563315" w:history="1">
+      <w:hyperlink w:anchor="_Toc238564228" w:history="1">
         <w:r>
           <w:rPr>
             <w:rStyle w:val="Hyperlink"/>
@@ -4105,7 +4105,7 @@
           <w:rPr>
             <w:noProof/>
           </w:rPr>
-          <w:instrText xml:space="preserve"> PAGEREF _Toc238563315 \h </w:instrText>
+          <w:instrText xml:space="preserve"> PAGEREF _Toc238564228 \h </w:instrText>
         </w:r>
         <w:r>
           <w:rPr>
@@ -4142,7 +4142,7 @@
           <w:noProof/>
         </w:rPr>
       </w:pPr>
-      <w:hyperlink w:anchor="_Toc238563316" w:history="1">
+      <w:hyperlink w:anchor="_Toc238564229" w:history="1">
         <w:r>
           <w:rPr>
             <w:rStyle w:val="Hyperlink"/>
@@ -4168,7 +4168,7 @@
           <w:rPr>
             <w:noProof/>
           </w:rPr>
-          <w:instrText xml:space="preserve"> PAGEREF _Toc238563316 \h </w:instrText>
+          <w:instrText xml:space="preserve"> PAGEREF _Toc238564229 \h </w:instrText>
         </w:r>
         <w:r>
           <w:rPr>
@@ -4205,7 +4205,7 @@
           <w:noProof/>
         </w:rPr>
       </w:pPr>
-      <w:hyperlink w:anchor="_Toc238563317" w:history="1">
+      <w:hyperlink w:anchor="_Toc238564230" w:history="1">
         <w:r>
           <w:rPr>
             <w:rStyle w:val="Hyperlink"/>
@@ -4231,7 +4231,7 @@
           <w:rPr>
             <w:noProof/>
           </w:rPr>
-          <w:instrText xml:space="preserve"> PAGEREF _Toc238563317 \h </w:instrText>
+          <w:instrText xml:space="preserve"> PAGEREF _Toc238564230 \h </w:instrText>
         </w:r>
         <w:r>
           <w:rPr>
@@ -4268,7 +4268,7 @@
           <w:noProof/>
         </w:rPr>
       </w:pPr>
-      <w:hyperlink w:anchor="_Toc238563318" w:history="1">
+      <w:hyperlink w:anchor="_Toc238564231" w:history="1">
         <w:r>
           <w:rPr>
             <w:rStyle w:val="Hyperlink"/>
@@ -4294,7 +4294,7 @@
           <w:rPr>
             <w:noProof/>
           </w:rPr>
-          <w:instrText xml:space="preserve"> PAGEREF _Toc238563318 \h </w:instrText>
+          <w:instrText xml:space="preserve"> PAGEREF _Toc238564231 \h </w:instrText>
         </w:r>
         <w:r>
           <w:rPr>
@@ -4331,7 +4331,7 @@
           <w:noProof/>
         </w:rPr>
       </w:pPr>
-      <w:hyperlink w:anchor="_Toc238563319" w:history="1">
+      <w:hyperlink w:anchor="_Toc238564232" w:history="1">
         <w:r>
           <w:rPr>
             <w:rStyle w:val="Hyperlink"/>
@@ -4357,7 +4357,7 @@
           <w:rPr>
             <w:noProof/>
           </w:rPr>
-          <w:instrText xml:space="preserve"> PAGEREF _Toc238563319 \h </w:instrText>
+          <w:instrText xml:space="preserve"> PAGEREF _Toc238564232 \h </w:instrText>
         </w:r>
         <w:r>
           <w:rPr>
@@ -4394,7 +4394,7 @@
           <w:noProof/>
         </w:rPr>
       </w:pPr>
-      <w:hyperlink w:anchor="_Toc238563320" w:history="1">
+      <w:hyperlink w:anchor="_Toc238564233" w:history="1">
         <w:r>
           <w:rPr>
             <w:rStyle w:val="Hyperlink"/>
@@ -4420,7 +4420,7 @@
           <w:rPr>
             <w:noProof/>
           </w:rPr>
-          <w:instrText xml:space="preserve"> PAGEREF _Toc238563320 \h </w:instrText>
+          <w:instrText xml:space="preserve"> PAGEREF _Toc238564233 \h </w:instrText>
         </w:r>
         <w:r>
           <w:rPr>
@@ -4457,7 +4457,7 @@
           <w:noProof/>
         </w:rPr>
       </w:pPr>
-      <w:hyperlink w:anchor="_Toc238563321" w:history="1">
+      <w:hyperlink w:anchor="_Toc238564234" w:history="1">
         <w:r>
           <w:rPr>
             <w:rStyle w:val="Hyperlink"/>
@@ -4483,7 +4483,7 @@
           <w:rPr>
             <w:noProof/>
           </w:rPr>
-          <w:instrText xml:space="preserve"> PAGEREF _Toc238563321 \h </w:instrText>
+          <w:instrText xml:space="preserve"> PAGEREF _Toc238564234 \h </w:instrText>
         </w:r>
         <w:r>
           <w:rPr>
@@ -4520,7 +4520,7 @@
           <w:noProof/>
         </w:rPr>
       </w:pPr>
-      <w:hyperlink w:anchor="_Toc238563322" w:history="1">
+      <w:hyperlink w:anchor="_Toc238564235" w:history="1">
         <w:r>
           <w:rPr>
             <w:rStyle w:val="Hyperlink"/>
@@ -4546,7 +4546,7 @@
           <w:rPr>
             <w:noProof/>
           </w:rPr>
-          <w:instrText xml:space="preserve"> PAGEREF _Toc238563322 \h </w:instrText>
+          <w:instrText xml:space="preserve"> PAGEREF _Toc238564235 \h </w:instrText>
         </w:r>
         <w:r>
           <w:rPr>
@@ -4583,7 +4583,7 @@
           <w:noProof/>
         </w:rPr>
       </w:pPr>
-      <w:hyperlink w:anchor="_Toc238563323" w:history="1">
+      <w:hyperlink w:anchor="_Toc238564236" w:history="1">
         <w:r>
           <w:rPr>
             <w:rStyle w:val="Hyperlink"/>
@@ -4609,7 +4609,7 @@
           <w:rPr>
             <w:noProof/>
           </w:rPr>
-          <w:instrText xml:space="preserve"> PAGEREF _Toc238563323 \h </w:instrText>
+          <w:instrText xml:space="preserve"> PAGEREF _Toc238564236 \h </w:instrText>
         </w:r>
         <w:r>
           <w:rPr>
@@ -4646,7 +4646,7 @@
           <w:noProof/>
         </w:rPr>
       </w:pPr>
-      <w:hyperlink w:anchor="_Toc238563324" w:history="1">
+      <w:hyperlink w:anchor="_Toc238564237" w:history="1">
         <w:r>
           <w:rPr>
             <w:rStyle w:val="Hyperlink"/>
@@ -4672,7 +4672,7 @@
           <w:rPr>
             <w:noProof/>
           </w:rPr>
-          <w:instrText xml:space="preserve"> PAGEREF _Toc238563324 \h </w:instrText>
+          <w:instrText xml:space="preserve"> PAGEREF _Toc238564237 \h </w:instrText>
         </w:r>
         <w:r>
           <w:rPr>
@@ -4709,7 +4709,7 @@
           <w:noProof/>
         </w:rPr>
       </w:pPr>
-      <w:hyperlink w:anchor="_Toc238563325" w:history="1">
+      <w:hyperlink w:anchor="_Toc238564238" w:history="1">
         <w:r>
           <w:rPr>
             <w:rStyle w:val="Hyperlink"/>
@@ -4735,7 +4735,7 @@
           <w:rPr>
             <w:noProof/>
           </w:rPr>
-          <w:instrText xml:space="preserve"> PAGEREF _Toc238563325 \h </w:instrText>
+          <w:instrText xml:space="preserve"> PAGEREF _Toc238564238 \h </w:instrText>
         </w:r>
         <w:r>
           <w:rPr>
@@ -4772,7 +4772,7 @@
           <w:noProof/>
         </w:rPr>
       </w:pPr>
-      <w:hyperlink w:anchor="_Toc238563326" w:history="1">
+      <w:hyperlink w:anchor="_Toc238564239" w:history="1">
         <w:r>
           <w:rPr>
             <w:rStyle w:val="Hyperlink"/>
@@ -4798,7 +4798,7 @@
           <w:rPr>
             <w:noProof/>
           </w:rPr>
-          <w:instrText xml:space="preserve"> PAGEREF _Toc238563326 \h </w:instrText>
+          <w:instrText xml:space="preserve"> PAGEREF _Toc238564239 \h </w:instrText>
         </w:r>
         <w:r>
           <w:rPr>
@@ -4835,7 +4835,7 @@
           <w:noProof/>
         </w:rPr>
       </w:pPr>
-      <w:hyperlink w:anchor="_Toc238563327" w:history="1">
+      <w:hyperlink w:anchor="_Toc238564240" w:history="1">
         <w:r>
           <w:rPr>
             <w:rStyle w:val="Hyperlink"/>
@@ -4861,7 +4861,7 @@
           <w:rPr>
             <w:noProof/>
           </w:rPr>
-          <w:instrText xml:space="preserve"> PAGEREF _Toc238563327 \h </w:instrText>
+          <w:instrText xml:space="preserve"> PAGEREF _Toc238564240 \h </w:instrText>
         </w:r>
         <w:r>
           <w:rPr>
@@ -4898,7 +4898,7 @@
           <w:noProof/>
         </w:rPr>
       </w:pPr>
-      <w:hyperlink w:anchor="_Toc238563328" w:history="1">
+      <w:hyperlink w:anchor="_Toc238564241" w:history="1">
         <w:r>
           <w:rPr>
             <w:rStyle w:val="Hyperlink"/>
@@ -4924,7 +4924,7 @@
           <w:rPr>
             <w:noProof/>
           </w:rPr>
-          <w:instrText xml:space="preserve"> PAGEREF _Toc238563328 \h </w:instrText>
+          <w:instrText xml:space="preserve"> PAGEREF _Toc238564241 \h </w:instrText>
         </w:r>
         <w:r>
           <w:rPr>
@@ -4961,7 +4961,7 @@
           <w:noProof/>
         </w:rPr>
       </w:pPr>
-      <w:hyperlink w:anchor="_Toc238563329" w:history="1">
+      <w:hyperlink w:anchor="_Toc238564242" w:history="1">
         <w:r>
           <w:rPr>
             <w:rStyle w:val="Hyperlink"/>
@@ -4987,7 +4987,7 @@
           <w:rPr>
             <w:noProof/>
           </w:rPr>
-          <w:instrText xml:space="preserve"> PAGEREF _Toc238563329 \h </w:instrText>
+          <w:instrText xml:space="preserve"> PAGEREF _Toc238564242 \h </w:instrText>
         </w:r>
         <w:r>
           <w:rPr>
@@ -5225,7 +5225,7 @@
         <w:pStyle w:val="Heading2"/>
         <w:spacing w:before="240" w:after="120" w:line="360" w:lineRule="auto"/>
       </w:pPr>
-      <w:bookmarkStart w:id="0" w:name="_Toc238563292"/>
+      <w:bookmarkStart w:id="0" w:name="_Toc238564205"/>
       <w:r>
         <w:rPr>
           <w:b/>
@@ -5267,7 +5267,7 @@
         <w:pStyle w:val="Heading3"/>
         <w:spacing w:before="240" w:after="120" w:line="360" w:lineRule="auto"/>
       </w:pPr>
-      <w:bookmarkStart w:id="1" w:name="_Toc238563293"/>
+      <w:bookmarkStart w:id="1" w:name="_Toc238564206"/>
       <w:r>
         <w:rPr>
           <w:b/>
@@ -5389,7 +5389,7 @@
         <w:pStyle w:val="Heading3"/>
         <w:spacing w:before="240" w:after="120" w:line="360" w:lineRule="auto"/>
       </w:pPr>
-      <w:bookmarkStart w:id="2" w:name="_Toc238563294"/>
+      <w:bookmarkStart w:id="2" w:name="_Toc238564207"/>
       <w:r>
         <w:rPr>
           <w:b/>
@@ -5463,7 +5463,7 @@
         <w:pStyle w:val="Heading2"/>
         <w:spacing w:before="240" w:after="120" w:line="360" w:lineRule="auto"/>
       </w:pPr>
-      <w:bookmarkStart w:id="3" w:name="_Toc238563295"/>
+      <w:bookmarkStart w:id="3" w:name="_Toc238564208"/>
       <w:r>
         <w:rPr>
           <w:b/>
@@ -5516,7 +5516,7 @@
         <w:pStyle w:val="Heading3"/>
         <w:spacing w:before="240" w:after="120" w:line="360" w:lineRule="auto"/>
       </w:pPr>
-      <w:bookmarkStart w:id="4" w:name="_Toc238563296"/>
+      <w:bookmarkStart w:id="4" w:name="_Toc238564209"/>
       <w:r>
         <w:rPr>
           <w:b/>
@@ -5539,7 +5539,7 @@
         </w:rPr>
         <w:lastRenderedPageBreak/>
         <w:drawing>
-          <wp:inline distT="0" distB="0" distL="0" distR="0" wp14:anchorId="39D1918A" wp14:editId="37C93EB7">
+          <wp:inline distT="0" distB="0" distL="0" distR="0" wp14:anchorId="651E350C" wp14:editId="52E60339">
             <wp:extent cx="5334000" cy="4486275"/>
             <wp:effectExtent l="0" t="0" r="0" b="0"/>
             <wp:docPr id="1" name="Picture 1"/>
@@ -5786,7 +5786,7 @@
         <w:pStyle w:val="Heading3"/>
         <w:spacing w:before="240" w:after="120" w:line="360" w:lineRule="auto"/>
       </w:pPr>
-      <w:bookmarkStart w:id="5" w:name="_Toc238563297"/>
+      <w:bookmarkStart w:id="5" w:name="_Toc238564210"/>
       <w:r>
         <w:rPr>
           <w:b/>
@@ -5808,10 +5808,10 @@
           <w:noProof/>
         </w:rPr>
         <w:drawing>
-          <wp:inline distT="0" distB="0" distL="0" distR="0" wp14:anchorId="3E77B551" wp14:editId="1173BF2B">
+          <wp:inline distT="0" distB="0" distL="0" distR="0" wp14:anchorId="5D1670D4" wp14:editId="40F36E06">
             <wp:extent cx="5334000" cy="3057525"/>
             <wp:effectExtent l="0" t="0" r="0" b="0"/>
-            <wp:docPr id="1589980260" name="Picture 1589980260"/>
+            <wp:docPr id="1584626063" name="Picture 1584626063"/>
             <wp:cNvGraphicFramePr>
               <a:graphicFrameLocks xmlns:a="http://schemas.openxmlformats.org/drawingml/2006/main" noChangeAspect="1"/>
             </wp:cNvGraphicFramePr>
@@ -6201,7 +6201,7 @@
         <w:pStyle w:val="Heading3"/>
         <w:spacing w:before="240" w:after="120" w:line="360" w:lineRule="auto"/>
       </w:pPr>
-      <w:bookmarkStart w:id="6" w:name="_Toc238563298"/>
+      <w:bookmarkStart w:id="6" w:name="_Toc238564211"/>
       <w:r>
         <w:rPr>
           <w:b/>
@@ -6446,10 +6446,10 @@
         </w:rPr>
         <w:lastRenderedPageBreak/>
         <w:drawing>
-          <wp:inline distT="0" distB="0" distL="0" distR="0" wp14:anchorId="207986D3" wp14:editId="71361AF3">
+          <wp:inline distT="0" distB="0" distL="0" distR="0" wp14:anchorId="55D0C36E" wp14:editId="44E63857">
             <wp:extent cx="5334000" cy="2933700"/>
             <wp:effectExtent l="0" t="0" r="0" b="0"/>
-            <wp:docPr id="1836401961" name="Picture 1836401961"/>
+            <wp:docPr id="2100847884" name="Picture 2100847884"/>
             <wp:cNvGraphicFramePr>
               <a:graphicFrameLocks xmlns:a="http://schemas.openxmlformats.org/drawingml/2006/main" noChangeAspect="1"/>
             </wp:cNvGraphicFramePr>
@@ -6510,10 +6510,10 @@
           <w:noProof/>
         </w:rPr>
         <w:drawing>
-          <wp:inline distT="0" distB="0" distL="0" distR="0" wp14:anchorId="43B4D55D" wp14:editId="0B6A18A5">
+          <wp:inline distT="0" distB="0" distL="0" distR="0" wp14:anchorId="4F0C323A" wp14:editId="21EFC5FF">
             <wp:extent cx="5334000" cy="3686175"/>
             <wp:effectExtent l="0" t="0" r="0" b="0"/>
-            <wp:docPr id="734758428" name="Picture 734758428"/>
+            <wp:docPr id="441110011" name="Picture 441110011"/>
             <wp:cNvGraphicFramePr>
               <a:graphicFrameLocks xmlns:a="http://schemas.openxmlformats.org/drawingml/2006/main" noChangeAspect="1"/>
             </wp:cNvGraphicFramePr>
@@ -6575,10 +6575,10 @@
         </w:rPr>
         <w:lastRenderedPageBreak/>
         <w:drawing>
-          <wp:inline distT="0" distB="0" distL="0" distR="0" wp14:anchorId="00402CD7" wp14:editId="3904DEBE">
+          <wp:inline distT="0" distB="0" distL="0" distR="0" wp14:anchorId="068B82D5" wp14:editId="3126EBE3">
             <wp:extent cx="5334000" cy="3086100"/>
             <wp:effectExtent l="0" t="0" r="0" b="0"/>
-            <wp:docPr id="192592541" name="Picture 192592541"/>
+            <wp:docPr id="869035509" name="Picture 869035509"/>
             <wp:cNvGraphicFramePr>
               <a:graphicFrameLocks xmlns:a="http://schemas.openxmlformats.org/drawingml/2006/main" noChangeAspect="1"/>
             </wp:cNvGraphicFramePr>
@@ -6634,7 +6634,7 @@
         <w:pStyle w:val="Heading3"/>
         <w:spacing w:before="240" w:after="120" w:line="360" w:lineRule="auto"/>
       </w:pPr>
-      <w:bookmarkStart w:id="7" w:name="_Toc238563299"/>
+      <w:bookmarkStart w:id="7" w:name="_Toc238564212"/>
       <w:r>
         <w:rPr>
           <w:b/>
@@ -6657,10 +6657,10 @@
         </w:rPr>
         <w:lastRenderedPageBreak/>
         <w:drawing>
-          <wp:inline distT="0" distB="0" distL="0" distR="0" wp14:anchorId="0AE1E011" wp14:editId="165DA127">
+          <wp:inline distT="0" distB="0" distL="0" distR="0" wp14:anchorId="3D343A62" wp14:editId="17B0900E">
             <wp:extent cx="5334000" cy="6229350"/>
             <wp:effectExtent l="0" t="0" r="0" b="0"/>
-            <wp:docPr id="222874648" name="Picture 222874648"/>
+            <wp:docPr id="1697716450" name="Picture 1697716450"/>
             <wp:cNvGraphicFramePr>
               <a:graphicFrameLocks xmlns:a="http://schemas.openxmlformats.org/drawingml/2006/main" noChangeAspect="1"/>
             </wp:cNvGraphicFramePr>
@@ -6737,7 +6737,7 @@
         <w:pStyle w:val="Heading3"/>
         <w:spacing w:before="240" w:after="120" w:line="360" w:lineRule="auto"/>
       </w:pPr>
-      <w:bookmarkStart w:id="8" w:name="_Toc238563300"/>
+      <w:bookmarkStart w:id="8" w:name="_Toc238564213"/>
       <w:r>
         <w:rPr>
           <w:b/>
@@ -6788,7 +6788,7 @@
         <w:pStyle w:val="Heading3"/>
         <w:spacing w:before="240" w:after="120" w:line="360" w:lineRule="auto"/>
       </w:pPr>
-      <w:bookmarkStart w:id="9" w:name="_Toc238563301"/>
+      <w:bookmarkStart w:id="9" w:name="_Toc238564214"/>
       <w:r>
         <w:rPr>
           <w:b/>
@@ -6861,10 +6861,10 @@
           <w:noProof/>
         </w:rPr>
         <w:drawing>
-          <wp:inline distT="0" distB="0" distL="0" distR="0" wp14:anchorId="20FC18C1" wp14:editId="024E77D0">
+          <wp:inline distT="0" distB="0" distL="0" distR="0" wp14:anchorId="6B932361" wp14:editId="06C12638">
             <wp:extent cx="5334000" cy="2714625"/>
             <wp:effectExtent l="0" t="0" r="0" b="0"/>
-            <wp:docPr id="1460181137" name="Picture 1460181137"/>
+            <wp:docPr id="1587327261" name="Picture 1587327261"/>
             <wp:cNvGraphicFramePr>
               <a:graphicFrameLocks xmlns:a="http://schemas.openxmlformats.org/drawingml/2006/main" noChangeAspect="1"/>
             </wp:cNvGraphicFramePr>
@@ -6968,7 +6968,7 @@
         <w:pStyle w:val="Heading2"/>
         <w:spacing w:before="240" w:after="120" w:line="360" w:lineRule="auto"/>
       </w:pPr>
-      <w:bookmarkStart w:id="10" w:name="_Toc238563302"/>
+      <w:bookmarkStart w:id="10" w:name="_Toc238564215"/>
       <w:r>
         <w:rPr>
           <w:b/>
@@ -6985,7 +6985,7 @@
         <w:pStyle w:val="Heading3"/>
         <w:spacing w:before="240" w:after="120" w:line="360" w:lineRule="auto"/>
       </w:pPr>
-      <w:bookmarkStart w:id="11" w:name="_Toc238563303"/>
+      <w:bookmarkStart w:id="11" w:name="_Toc238564216"/>
       <w:r>
         <w:rPr>
           <w:b/>
@@ -7132,7 +7132,7 @@
         <w:pStyle w:val="Heading3"/>
         <w:spacing w:before="240" w:after="120" w:line="360" w:lineRule="auto"/>
       </w:pPr>
-      <w:bookmarkStart w:id="12" w:name="_Toc238563304"/>
+      <w:bookmarkStart w:id="12" w:name="_Toc238564217"/>
       <w:r>
         <w:rPr>
           <w:b/>
@@ -7259,7 +7259,7 @@
         <w:pStyle w:val="Heading4"/>
         <w:spacing w:before="240" w:after="120" w:line="360" w:lineRule="auto"/>
       </w:pPr>
-      <w:bookmarkStart w:id="13" w:name="_Toc238563305"/>
+      <w:bookmarkStart w:id="13" w:name="_Toc238564218"/>
       <w:r>
         <w:rPr>
           <w:b/>
@@ -7309,10 +7309,10 @@
         </w:rPr>
         <w:lastRenderedPageBreak/>
         <w:drawing>
-          <wp:inline distT="0" distB="0" distL="0" distR="0" wp14:anchorId="175715EC" wp14:editId="02F0AA6D">
+          <wp:inline distT="0" distB="0" distL="0" distR="0" wp14:anchorId="3AE3EE10" wp14:editId="5530ACBC">
             <wp:extent cx="5334000" cy="5181600"/>
             <wp:effectExtent l="0" t="0" r="0" b="0"/>
-            <wp:docPr id="855567310" name="Picture 855567310"/>
+            <wp:docPr id="1981474748" name="Picture 1981474748"/>
             <wp:cNvGraphicFramePr>
               <a:graphicFrameLocks xmlns:a="http://schemas.openxmlformats.org/drawingml/2006/main" noChangeAspect="1"/>
             </wp:cNvGraphicFramePr>
@@ -7556,10 +7556,10 @@
         </w:rPr>
         <w:lastRenderedPageBreak/>
         <w:drawing>
-          <wp:inline distT="0" distB="0" distL="0" distR="0" wp14:anchorId="65C6B7BD" wp14:editId="1383CAF2">
+          <wp:inline distT="0" distB="0" distL="0" distR="0" wp14:anchorId="475F88BB" wp14:editId="370D3F02">
             <wp:extent cx="5334000" cy="5181600"/>
             <wp:effectExtent l="0" t="0" r="0" b="0"/>
-            <wp:docPr id="427415505" name="Picture 427415505"/>
+            <wp:docPr id="215811592" name="Picture 215811592"/>
             <wp:cNvGraphicFramePr>
               <a:graphicFrameLocks xmlns:a="http://schemas.openxmlformats.org/drawingml/2006/main" noChangeAspect="1"/>
             </wp:cNvGraphicFramePr>
@@ -7666,10 +7666,10 @@
         </w:rPr>
         <w:lastRenderedPageBreak/>
         <w:drawing>
-          <wp:inline distT="0" distB="0" distL="0" distR="0" wp14:anchorId="420D6501" wp14:editId="16E8AEF5">
+          <wp:inline distT="0" distB="0" distL="0" distR="0" wp14:anchorId="1236F7BC" wp14:editId="61CAB020">
             <wp:extent cx="5334000" cy="5181600"/>
             <wp:effectExtent l="0" t="0" r="0" b="0"/>
-            <wp:docPr id="1503523617" name="Picture 1503523617"/>
+            <wp:docPr id="1733669348" name="Picture 1733669348"/>
             <wp:cNvGraphicFramePr>
               <a:graphicFrameLocks xmlns:a="http://schemas.openxmlformats.org/drawingml/2006/main" noChangeAspect="1"/>
             </wp:cNvGraphicFramePr>
@@ -7817,10 +7817,10 @@
         </w:rPr>
         <w:lastRenderedPageBreak/>
         <w:drawing>
-          <wp:inline distT="0" distB="0" distL="0" distR="0" wp14:anchorId="778CAD70" wp14:editId="6AE6A9FB">
+          <wp:inline distT="0" distB="0" distL="0" distR="0" wp14:anchorId="37D3AABF" wp14:editId="4E4A232C">
             <wp:extent cx="5334000" cy="5181600"/>
             <wp:effectExtent l="0" t="0" r="0" b="0"/>
-            <wp:docPr id="1263094314" name="Picture 1263094314"/>
+            <wp:docPr id="379121201" name="Picture 379121201"/>
             <wp:cNvGraphicFramePr>
               <a:graphicFrameLocks xmlns:a="http://schemas.openxmlformats.org/drawingml/2006/main" noChangeAspect="1"/>
             </wp:cNvGraphicFramePr>
@@ -7912,7 +7912,7 @@
         <w:pStyle w:val="Heading3"/>
         <w:spacing w:before="240" w:after="120" w:line="360" w:lineRule="auto"/>
       </w:pPr>
-      <w:bookmarkStart w:id="14" w:name="_Toc238563306"/>
+      <w:bookmarkStart w:id="14" w:name="_Toc238564219"/>
       <w:r>
         <w:rPr>
           <w:b/>
@@ -7938,7 +7938,7 @@
         <w:pStyle w:val="Heading4"/>
         <w:spacing w:before="240" w:after="120" w:line="360" w:lineRule="auto"/>
       </w:pPr>
-      <w:bookmarkStart w:id="15" w:name="_Toc238563307"/>
+      <w:bookmarkStart w:id="15" w:name="_Toc238564220"/>
       <w:r>
         <w:rPr>
           <w:b/>
@@ -8217,7 +8217,7 @@
         <w:pStyle w:val="Heading4"/>
         <w:spacing w:before="240" w:after="120" w:line="360" w:lineRule="auto"/>
       </w:pPr>
-      <w:bookmarkStart w:id="16" w:name="_Toc238563308"/>
+      <w:bookmarkStart w:id="16" w:name="_Toc238564221"/>
       <w:r>
         <w:rPr>
           <w:b/>
@@ -8418,7 +8418,7 @@
         <w:pStyle w:val="Heading4"/>
         <w:spacing w:before="240" w:after="120" w:line="360" w:lineRule="auto"/>
       </w:pPr>
-      <w:bookmarkStart w:id="17" w:name="_Toc238563309"/>
+      <w:bookmarkStart w:id="17" w:name="_Toc238564222"/>
       <w:r>
         <w:rPr>
           <w:b/>
@@ -8605,7 +8605,7 @@
         <w:pStyle w:val="Heading4"/>
         <w:spacing w:before="240" w:after="120" w:line="360" w:lineRule="auto"/>
       </w:pPr>
-      <w:bookmarkStart w:id="18" w:name="_Toc238563310"/>
+      <w:bookmarkStart w:id="18" w:name="_Toc238564223"/>
       <w:r>
         <w:rPr>
           <w:b/>
@@ -8834,7 +8834,7 @@
         <w:pStyle w:val="Heading4"/>
         <w:spacing w:before="240" w:after="120" w:line="360" w:lineRule="auto"/>
       </w:pPr>
-      <w:bookmarkStart w:id="19" w:name="_Toc238563311"/>
+      <w:bookmarkStart w:id="19" w:name="_Toc238564224"/>
       <w:r>
         <w:rPr>
           <w:b/>
@@ -9106,7 +9106,7 @@
         <w:pStyle w:val="Heading4"/>
         <w:spacing w:before="240" w:after="120" w:line="360" w:lineRule="auto"/>
       </w:pPr>
-      <w:bookmarkStart w:id="20" w:name="_Toc238563312"/>
+      <w:bookmarkStart w:id="20" w:name="_Toc238564225"/>
       <w:r>
         <w:rPr>
           <w:b/>
@@ -9225,7 +9225,7 @@
         <w:pStyle w:val="Heading3"/>
         <w:spacing w:before="240" w:after="120" w:line="360" w:lineRule="auto"/>
       </w:pPr>
-      <w:bookmarkStart w:id="21" w:name="_Toc238563313"/>
+      <w:bookmarkStart w:id="21" w:name="_Toc238564226"/>
       <w:r>
         <w:rPr>
           <w:b/>
@@ -9588,7 +9588,7 @@
         <w:pStyle w:val="Heading3"/>
         <w:spacing w:before="240" w:after="120" w:line="360" w:lineRule="auto"/>
       </w:pPr>
-      <w:bookmarkStart w:id="22" w:name="_Toc238563314"/>
+      <w:bookmarkStart w:id="22" w:name="_Toc238564227"/>
       <w:r>
         <w:rPr>
           <w:b/>
@@ -9816,7 +9816,7 @@
         <w:pStyle w:val="Heading3"/>
         <w:spacing w:before="240" w:after="120" w:line="360" w:lineRule="auto"/>
       </w:pPr>
-      <w:bookmarkStart w:id="23" w:name="_Toc238563315"/>
+      <w:bookmarkStart w:id="23" w:name="_Toc238564228"/>
       <w:r>
         <w:rPr>
           <w:b/>
@@ -10256,7 +10256,7 @@
         <w:pStyle w:val="Heading3"/>
         <w:spacing w:before="240" w:after="120" w:line="360" w:lineRule="auto"/>
       </w:pPr>
-      <w:bookmarkStart w:id="24" w:name="_Toc238563316"/>
+      <w:bookmarkStart w:id="24" w:name="_Toc238564229"/>
       <w:r>
         <w:rPr>
           <w:b/>
@@ -10319,10 +10319,10 @@
         </w:rPr>
         <w:lastRenderedPageBreak/>
         <w:drawing>
-          <wp:inline distT="0" distB="0" distL="0" distR="0" wp14:anchorId="2E13EB9C" wp14:editId="4D428907">
+          <wp:inline distT="0" distB="0" distL="0" distR="0" wp14:anchorId="0D343B42" wp14:editId="27D21883">
             <wp:extent cx="5334000" cy="3333750"/>
             <wp:effectExtent l="0" t="0" r="0" b="0"/>
-            <wp:docPr id="561396774" name="Picture 561396774"/>
+            <wp:docPr id="818736752" name="Picture 818736752"/>
             <wp:cNvGraphicFramePr>
               <a:graphicFrameLocks xmlns:a="http://schemas.openxmlformats.org/drawingml/2006/main" noChangeAspect="1"/>
             </wp:cNvGraphicFramePr>
@@ -10383,10 +10383,10 @@
           <w:noProof/>
         </w:rPr>
         <w:drawing>
-          <wp:inline distT="0" distB="0" distL="0" distR="0" wp14:anchorId="0C8FA4B8" wp14:editId="7DAECBC8">
+          <wp:inline distT="0" distB="0" distL="0" distR="0" wp14:anchorId="420322A5" wp14:editId="0D54F19B">
             <wp:extent cx="5334000" cy="3333750"/>
             <wp:effectExtent l="0" t="0" r="0" b="0"/>
-            <wp:docPr id="1637433473" name="Picture 1637433473"/>
+            <wp:docPr id="1716170771" name="Picture 1716170771"/>
             <wp:cNvGraphicFramePr>
               <a:graphicFrameLocks xmlns:a="http://schemas.openxmlformats.org/drawingml/2006/main" noChangeAspect="1"/>
             </wp:cNvGraphicFramePr>
@@ -10448,10 +10448,10 @@
         </w:rPr>
         <w:lastRenderedPageBreak/>
         <w:drawing>
-          <wp:inline distT="0" distB="0" distL="0" distR="0" wp14:anchorId="35CCA68D" wp14:editId="071E4279">
+          <wp:inline distT="0" distB="0" distL="0" distR="0" wp14:anchorId="0EC57CBC" wp14:editId="494EFF54">
             <wp:extent cx="5334000" cy="3333750"/>
             <wp:effectExtent l="0" t="0" r="0" b="0"/>
-            <wp:docPr id="1354135960" name="Picture 1354135960"/>
+            <wp:docPr id="1468438466" name="Picture 1468438466"/>
             <wp:cNvGraphicFramePr>
               <a:graphicFrameLocks xmlns:a="http://schemas.openxmlformats.org/drawingml/2006/main" noChangeAspect="1"/>
             </wp:cNvGraphicFramePr>
@@ -10512,10 +10512,10 @@
           <w:noProof/>
         </w:rPr>
         <w:drawing>
-          <wp:inline distT="0" distB="0" distL="0" distR="0" wp14:anchorId="2EE8C7DE" wp14:editId="3348540F">
+          <wp:inline distT="0" distB="0" distL="0" distR="0" wp14:anchorId="76A61AD8" wp14:editId="5D60CECC">
             <wp:extent cx="5334000" cy="3333750"/>
             <wp:effectExtent l="0" t="0" r="0" b="0"/>
-            <wp:docPr id="2101790238" name="Picture 2101790238"/>
+            <wp:docPr id="25940867" name="Picture 25940867"/>
             <wp:cNvGraphicFramePr>
               <a:graphicFrameLocks xmlns:a="http://schemas.openxmlformats.org/drawingml/2006/main" noChangeAspect="1"/>
             </wp:cNvGraphicFramePr>
@@ -10577,10 +10577,10 @@
         </w:rPr>
         <w:lastRenderedPageBreak/>
         <w:drawing>
-          <wp:inline distT="0" distB="0" distL="0" distR="0" wp14:anchorId="78CD9711" wp14:editId="02295C4B">
+          <wp:inline distT="0" distB="0" distL="0" distR="0" wp14:anchorId="65EA4B8A" wp14:editId="6860C865">
             <wp:extent cx="5334000" cy="3333750"/>
             <wp:effectExtent l="0" t="0" r="0" b="0"/>
-            <wp:docPr id="8725856" name="Picture 8725856"/>
+            <wp:docPr id="1944981772" name="Picture 1944981772"/>
             <wp:cNvGraphicFramePr>
               <a:graphicFrameLocks xmlns:a="http://schemas.openxmlformats.org/drawingml/2006/main" noChangeAspect="1"/>
             </wp:cNvGraphicFramePr>
@@ -10641,10 +10641,10 @@
           <w:noProof/>
         </w:rPr>
         <w:drawing>
-          <wp:inline distT="0" distB="0" distL="0" distR="0" wp14:anchorId="07C65921" wp14:editId="5F55FD16">
+          <wp:inline distT="0" distB="0" distL="0" distR="0" wp14:anchorId="63F4ADAB" wp14:editId="3CB7774D">
             <wp:extent cx="5334000" cy="3333750"/>
             <wp:effectExtent l="0" t="0" r="0" b="0"/>
-            <wp:docPr id="1708123296" name="Picture 1708123296"/>
+            <wp:docPr id="1609848842" name="Picture 1609848842"/>
             <wp:cNvGraphicFramePr>
               <a:graphicFrameLocks xmlns:a="http://schemas.openxmlformats.org/drawingml/2006/main" noChangeAspect="1"/>
             </wp:cNvGraphicFramePr>
@@ -10706,10 +10706,10 @@
         </w:rPr>
         <w:lastRenderedPageBreak/>
         <w:drawing>
-          <wp:inline distT="0" distB="0" distL="0" distR="0" wp14:anchorId="00DB2B60" wp14:editId="731BA5C3">
+          <wp:inline distT="0" distB="0" distL="0" distR="0" wp14:anchorId="65689A50" wp14:editId="78F4EAFE">
             <wp:extent cx="5334000" cy="3333750"/>
             <wp:effectExtent l="0" t="0" r="0" b="0"/>
-            <wp:docPr id="2132947470" name="Picture 2132947470"/>
+            <wp:docPr id="435847584" name="Picture 435847584"/>
             <wp:cNvGraphicFramePr>
               <a:graphicFrameLocks xmlns:a="http://schemas.openxmlformats.org/drawingml/2006/main" noChangeAspect="1"/>
             </wp:cNvGraphicFramePr>
@@ -10774,7 +10774,7 @@
         <w:pStyle w:val="Heading4"/>
         <w:spacing w:before="240" w:after="120" w:line="360" w:lineRule="auto"/>
       </w:pPr>
-      <w:bookmarkStart w:id="25" w:name="_Toc238563317"/>
+      <w:bookmarkStart w:id="25" w:name="_Toc238564230"/>
       <w:r>
         <w:rPr>
           <w:b/>
@@ -10910,10 +10910,10 @@
         </w:rPr>
         <w:lastRenderedPageBreak/>
         <w:drawing>
-          <wp:inline distT="0" distB="0" distL="0" distR="0" wp14:anchorId="06B32A46" wp14:editId="226964D2">
+          <wp:inline distT="0" distB="0" distL="0" distR="0" wp14:anchorId="66E7FCBF" wp14:editId="6CD80992">
             <wp:extent cx="5334000" cy="3333750"/>
             <wp:effectExtent l="0" t="0" r="0" b="0"/>
-            <wp:docPr id="1840600984" name="Picture 1840600984"/>
+            <wp:docPr id="360693705" name="Picture 360693705"/>
             <wp:cNvGraphicFramePr>
               <a:graphicFrameLocks xmlns:a="http://schemas.openxmlformats.org/drawingml/2006/main" noChangeAspect="1"/>
             </wp:cNvGraphicFramePr>
@@ -10974,10 +10974,10 @@
           <w:noProof/>
         </w:rPr>
         <w:drawing>
-          <wp:inline distT="0" distB="0" distL="0" distR="0" wp14:anchorId="404D9844" wp14:editId="7BD74995">
+          <wp:inline distT="0" distB="0" distL="0" distR="0" wp14:anchorId="36F40C3E" wp14:editId="4B867712">
             <wp:extent cx="5334000" cy="3333750"/>
             <wp:effectExtent l="0" t="0" r="0" b="0"/>
-            <wp:docPr id="415976387" name="Picture 415976387"/>
+            <wp:docPr id="376075145" name="Picture 376075145"/>
             <wp:cNvGraphicFramePr>
               <a:graphicFrameLocks xmlns:a="http://schemas.openxmlformats.org/drawingml/2006/main" noChangeAspect="1"/>
             </wp:cNvGraphicFramePr>
@@ -11142,7 +11142,7 @@
         <w:pStyle w:val="Heading2"/>
         <w:spacing w:before="240" w:after="120" w:line="360" w:lineRule="auto"/>
       </w:pPr>
-      <w:bookmarkStart w:id="26" w:name="_Toc238563318"/>
+      <w:bookmarkStart w:id="26" w:name="_Toc238564231"/>
       <w:r>
         <w:rPr>
           <w:b/>
@@ -11186,7 +11186,7 @@
         <w:pStyle w:val="Heading3"/>
         <w:spacing w:before="240" w:after="120" w:line="360" w:lineRule="auto"/>
       </w:pPr>
-      <w:bookmarkStart w:id="27" w:name="_Toc238563319"/>
+      <w:bookmarkStart w:id="27" w:name="_Toc238564232"/>
       <w:r>
         <w:rPr>
           <w:b/>
@@ -11270,7 +11270,7 @@
         <w:pStyle w:val="Heading3"/>
         <w:spacing w:before="240" w:after="120" w:line="360" w:lineRule="auto"/>
       </w:pPr>
-      <w:bookmarkStart w:id="28" w:name="_Toc238563320"/>
+      <w:bookmarkStart w:id="28" w:name="_Toc238564233"/>
       <w:r>
         <w:rPr>
           <w:b/>
@@ -11488,10 +11488,10 @@
           <w:noProof/>
         </w:rPr>
         <w:drawing>
-          <wp:inline distT="0" distB="0" distL="0" distR="0" wp14:anchorId="0D2ED404" wp14:editId="58884CBB">
+          <wp:inline distT="0" distB="0" distL="0" distR="0" wp14:anchorId="0092D17F" wp14:editId="1B7BB474">
             <wp:extent cx="5334000" cy="3857625"/>
             <wp:effectExtent l="0" t="0" r="0" b="0"/>
-            <wp:docPr id="695682413" name="Picture 695682413"/>
+            <wp:docPr id="1613077449" name="Picture 1613077449"/>
             <wp:cNvGraphicFramePr>
               <a:graphicFrameLocks xmlns:a="http://schemas.openxmlformats.org/drawingml/2006/main" noChangeAspect="1"/>
             </wp:cNvGraphicFramePr>
@@ -11547,7 +11547,7 @@
         <w:pStyle w:val="Heading3"/>
         <w:spacing w:before="240" w:after="120" w:line="360" w:lineRule="auto"/>
       </w:pPr>
-      <w:bookmarkStart w:id="29" w:name="_Toc238563321"/>
+      <w:bookmarkStart w:id="29" w:name="_Toc238564234"/>
       <w:r>
         <w:rPr>
           <w:b/>
@@ -11635,7 +11635,7 @@
         <w:pStyle w:val="Heading3"/>
         <w:spacing w:before="240" w:after="120" w:line="360" w:lineRule="auto"/>
       </w:pPr>
-      <w:bookmarkStart w:id="30" w:name="_Toc238563322"/>
+      <w:bookmarkStart w:id="30" w:name="_Toc238564235"/>
       <w:r>
         <w:rPr>
           <w:b/>
@@ -11882,7 +11882,7 @@
         <w:pStyle w:val="Heading3"/>
         <w:spacing w:before="240" w:after="120" w:line="360" w:lineRule="auto"/>
       </w:pPr>
-      <w:bookmarkStart w:id="31" w:name="_Toc238563323"/>
+      <w:bookmarkStart w:id="31" w:name="_Toc238564236"/>
       <w:r>
         <w:rPr>
           <w:b/>
@@ -11928,7 +11928,7 @@
         <w:pStyle w:val="Heading2"/>
         <w:spacing w:before="240" w:after="120" w:line="360" w:lineRule="auto"/>
       </w:pPr>
-      <w:bookmarkStart w:id="32" w:name="_Toc238563324"/>
+      <w:bookmarkStart w:id="32" w:name="_Toc238564237"/>
       <w:r>
         <w:rPr>
           <w:b/>
@@ -12271,10 +12271,10 @@
         </w:rPr>
         <w:lastRenderedPageBreak/>
         <w:drawing>
-          <wp:inline distT="0" distB="0" distL="0" distR="0" wp14:anchorId="7FF4935F" wp14:editId="64C6A3DD">
+          <wp:inline distT="0" distB="0" distL="0" distR="0" wp14:anchorId="73C68C46" wp14:editId="23003F5F">
             <wp:extent cx="5334000" cy="3705225"/>
             <wp:effectExtent l="0" t="0" r="0" b="0"/>
-            <wp:docPr id="1748543467" name="Picture 1748543467"/>
+            <wp:docPr id="1254400455" name="Picture 1254400455"/>
             <wp:cNvGraphicFramePr>
               <a:graphicFrameLocks xmlns:a="http://schemas.openxmlformats.org/drawingml/2006/main" noChangeAspect="1"/>
             </wp:cNvGraphicFramePr>
@@ -12335,10 +12335,10 @@
           <w:noProof/>
         </w:rPr>
         <w:drawing>
-          <wp:inline distT="0" distB="0" distL="0" distR="0" wp14:anchorId="338934F8" wp14:editId="31C1E636">
+          <wp:inline distT="0" distB="0" distL="0" distR="0" wp14:anchorId="5B8BEAF7" wp14:editId="21C1DC33">
             <wp:extent cx="5334000" cy="3705225"/>
             <wp:effectExtent l="0" t="0" r="0" b="0"/>
-            <wp:docPr id="2057190368" name="Picture 2057190368"/>
+            <wp:docPr id="1925649559" name="Picture 1925649559"/>
             <wp:cNvGraphicFramePr>
               <a:graphicFrameLocks xmlns:a="http://schemas.openxmlformats.org/drawingml/2006/main" noChangeAspect="1"/>
             </wp:cNvGraphicFramePr>
@@ -12402,7 +12402,7 @@
         <w:pStyle w:val="Heading2"/>
         <w:spacing w:before="240" w:after="120" w:line="360" w:lineRule="auto"/>
       </w:pPr>
-      <w:bookmarkStart w:id="33" w:name="_Toc238563325"/>
+      <w:bookmarkStart w:id="33" w:name="_Toc238564238"/>
       <w:r>
         <w:rPr>
           <w:b/>
@@ -12429,7 +12429,7 @@
           <w:left w:w="10" w:type="dxa"/>
           <w:right w:w="10" w:type="dxa"/>
         </w:tblCellMar>
-        <w:tblLook w:val="04A0" w:firstRow="1" w:lastRow="0" w:firstColumn="1" w:lastColumn="0" w:noHBand="0" w:noVBand="1"/>
+        <w:tblLook w:val="0000" w:firstRow="0" w:lastRow="0" w:firstColumn="0" w:lastColumn="0" w:noHBand="0" w:noVBand="0"/>
       </w:tblPr>
       <w:tblGrid>
         <w:gridCol w:w="3295"/>
@@ -13655,7 +13655,7 @@
         <w:pStyle w:val="Heading2"/>
         <w:spacing w:before="240" w:after="120" w:line="360" w:lineRule="auto"/>
       </w:pPr>
-      <w:bookmarkStart w:id="34" w:name="_Toc238563326"/>
+      <w:bookmarkStart w:id="34" w:name="_Toc238564239"/>
       <w:r>
         <w:rPr>
           <w:b/>
@@ -13796,7 +13796,7 @@
         <w:pStyle w:val="Heading2"/>
         <w:spacing w:before="240" w:after="120" w:line="360" w:lineRule="auto"/>
       </w:pPr>
-      <w:bookmarkStart w:id="35" w:name="_Toc238563327"/>
+      <w:bookmarkStart w:id="35" w:name="_Toc238564240"/>
       <w:r>
         <w:rPr>
           <w:b/>
@@ -13870,7 +13870,7 @@
         <w:pStyle w:val="Heading2"/>
         <w:spacing w:before="240" w:after="120" w:line="360" w:lineRule="auto"/>
       </w:pPr>
-      <w:bookmarkStart w:id="36" w:name="_Toc238563328"/>
+      <w:bookmarkStart w:id="36" w:name="_Toc238564241"/>
       <w:r>
         <w:rPr>
           <w:b/>
@@ -14165,7 +14165,7 @@
         <w:pStyle w:val="Heading2"/>
         <w:spacing w:before="240" w:after="120" w:line="360" w:lineRule="auto"/>
       </w:pPr>
-      <w:bookmarkStart w:id="37" w:name="_Toc238563329"/>
+      <w:bookmarkStart w:id="37" w:name="_Toc238564242"/>
       <w:r>
         <w:rPr>
           <w:b/>
@@ -14442,10 +14442,10 @@
 <file path=word/numbering.xml><?xml version="1.0" encoding="utf-8"?>
 <w:numbering xmlns:wpc="http://schemas.microsoft.com/office/word/2010/wordprocessingCanvas" xmlns:cx="http://schemas.microsoft.com/office/drawing/2014/chartex" xmlns:cx1="http://schemas.microsoft.com/office/drawing/2015/9/8/chartex" xmlns:cx2="http://schemas.microsoft.com/office/drawing/2015/10/21/chartex" xmlns:cx3="http://schemas.microsoft.com/office/drawing/2016/5/9/chartex" xmlns:cx4="http://schemas.microsoft.com/office/drawing/2016/5/10/chartex" xmlns:cx5="http://schemas.microsoft.com/office/drawing/2016/5/11/chartex" xmlns:cx6="http://schemas.microsoft.com/office/drawing/2016/5/12/chartex" xmlns:cx7="http://schemas.microsoft.com/office/drawing/2016/5/13/chartex" xmlns:cx8="http://schemas.microsoft.com/office/drawing/2016/5/14/chartex" xmlns:mc="http://schemas.openxmlformats.org/markup-compatibility/2006" xmlns:aink="http://schemas.microsoft.com/office/drawing/2016/ink" xmlns:am3d="http://schemas.microsoft.com/office/drawing/2017/model3d" xmlns:o="urn:schemas-microsoft-com:office:office" xmlns:oel="http://schemas.microsoft.com/office/2019/extlst" xmlns:r="http://schemas.openxmlformats.org/officeDocument/2006/relationships" xmlns:m="http://schemas.openxmlformats.org/officeDocument/2006/math" xmlns:v="urn:schemas-microsoft-com:vml" xmlns:wp14="http://schemas.microsoft.com/office/word/2010/wordprocessingDrawing" xmlns:wp="http://schemas.openxmlformats.org/drawingml/2006/wordprocessingDrawing" xmlns:w10="urn:schemas-microsoft-com:office:word" xmlns:w="http://schemas.openxmlformats.org/wordprocessingml/2006/main" xmlns:w14="http://schemas.microsoft.com/office/word/2010/wordml" xmlns:w15="http://schemas.microsoft.com/office/word/2012/wordml" xmlns:w16cex="http://schemas.microsoft.com/office/word/2018/wordml/cex" xmlns:w16cid="http://schemas.microsoft.com/office/word/2016/wordml/cid" xmlns:w16="http://schemas.microsoft.com/office/word/2018/wordml" xmlns:w16du="http://schemas.microsoft.com/office/word/2023/wordml/word16du" xmlns:w16sdtdh="http://schemas.microsoft.com/office/word/2020/wordml/sdtdatahash" xmlns:w16sdtfl="http://schemas.microsoft.com/office/word/2024/wordml/sdtformatlock" xmlns:w16se="http://schemas.microsoft.com/office/word/2015/wordml/symex" xmlns:wpg="http://schemas.microsoft.com/office/word/2010/wordprocessingGroup" xmlns:wpi="http://schemas.microsoft.com/office/word/2010/wordprocessingInk" xmlns:wne="http://schemas.microsoft.com/office/word/2006/wordml" xmlns:wps="http://schemas.microsoft.com/office/word/2010/wordprocessingShape" mc:Ignorable="w14 w15 w16se w16cid w16 w16cex w16sdtdh w16sdtfl w16du wp14">
   <w:abstractNum w:abstractNumId="0" w15:restartNumberingAfterBreak="0">
-    <w:nsid w:val="235F39C5"/>
+    <w:nsid w:val="5CB8506C"/>
     <w:multiLevelType w:val="hybridMultilevel"/>
-    <w:tmpl w:val="421CB418"/>
-    <w:lvl w:ilvl="0" w:tplc="80FE0052">
+    <w:tmpl w:val="E9A62530"/>
+    <w:lvl w:ilvl="0" w:tplc="305205EC">
       <w:start w:val="1"/>
       <w:numFmt w:val="bullet"/>
       <w:lvlText w:val="●"/>
@@ -14454,7 +14454,7 @@
         <w:ind w:left="720" w:hanging="360"/>
       </w:pPr>
     </w:lvl>
-    <w:lvl w:ilvl="1" w:tplc="C3065E52">
+    <w:lvl w:ilvl="1" w:tplc="7E72531A">
       <w:start w:val="1"/>
       <w:numFmt w:val="bullet"/>
       <w:lvlText w:val="○"/>
@@ -14463,7 +14463,7 @@
         <w:ind w:left="1440" w:hanging="360"/>
       </w:pPr>
     </w:lvl>
-    <w:lvl w:ilvl="2" w:tplc="0DA0FA60">
+    <w:lvl w:ilvl="2" w:tplc="6EA40148">
       <w:start w:val="1"/>
       <w:numFmt w:val="bullet"/>
       <w:lvlText w:val="■"/>
@@ -14472,7 +14472,7 @@
         <w:ind w:left="2160" w:hanging="360"/>
       </w:pPr>
     </w:lvl>
-    <w:lvl w:ilvl="3" w:tplc="F7D66D0C">
+    <w:lvl w:ilvl="3" w:tplc="7004B9B6">
       <w:start w:val="1"/>
       <w:numFmt w:val="bullet"/>
       <w:lvlText w:val="●"/>
@@ -14481,7 +14481,7 @@
         <w:ind w:left="2880" w:hanging="360"/>
       </w:pPr>
     </w:lvl>
-    <w:lvl w:ilvl="4" w:tplc="CD9C73DC">
+    <w:lvl w:ilvl="4" w:tplc="29425728">
       <w:start w:val="1"/>
       <w:numFmt w:val="bullet"/>
       <w:lvlText w:val="○"/>
@@ -14490,7 +14490,7 @@
         <w:ind w:left="3600" w:hanging="360"/>
       </w:pPr>
     </w:lvl>
-    <w:lvl w:ilvl="5" w:tplc="2A86CACA">
+    <w:lvl w:ilvl="5" w:tplc="065E84A2">
       <w:start w:val="1"/>
       <w:numFmt w:val="bullet"/>
       <w:lvlText w:val="■"/>
@@ -14499,7 +14499,7 @@
         <w:ind w:left="4320" w:hanging="360"/>
       </w:pPr>
     </w:lvl>
-    <w:lvl w:ilvl="6" w:tplc="1ED8B760">
+    <w:lvl w:ilvl="6" w:tplc="AECAEAF0">
       <w:start w:val="1"/>
       <w:numFmt w:val="bullet"/>
       <w:lvlText w:val="●"/>
@@ -14508,7 +14508,7 @@
         <w:ind w:left="5040" w:hanging="360"/>
       </w:pPr>
     </w:lvl>
-    <w:lvl w:ilvl="7" w:tplc="8C46E4B0">
+    <w:lvl w:ilvl="7" w:tplc="AE6C10F8">
       <w:start w:val="1"/>
       <w:numFmt w:val="bullet"/>
       <w:lvlText w:val="●"/>
@@ -14517,7 +14517,7 @@
         <w:ind w:left="5760" w:hanging="360"/>
       </w:pPr>
     </w:lvl>
-    <w:lvl w:ilvl="8" w:tplc="E294C500">
+    <w:lvl w:ilvl="8" w:tplc="41105948">
       <w:start w:val="1"/>
       <w:numFmt w:val="bullet"/>
       <w:lvlText w:val="●"/>
@@ -14527,7 +14527,7 @@
       </w:pPr>
     </w:lvl>
   </w:abstractNum>
-  <w:num w:numId="1" w16cid:durableId="2118864330">
+  <w:num w:numId="1" w16cid:durableId="40250321">
     <w:abstractNumId w:val="0"/>
     <w:lvlOverride w:ilvl="0">
       <w:startOverride w:val="1"/>
@@ -15133,7 +15133,7 @@
     <w:basedOn w:val="Normal"/>
     <w:uiPriority w:val="1"/>
     <w:qFormat/>
-    <w:rsid w:val="00C424A0"/>
+    <w:rsid w:val="004D27FB"/>
     <w:pPr>
       <w:spacing w:after="160" w:line="279" w:lineRule="auto"/>
     </w:pPr>
@@ -15151,7 +15151,7 @@
     <w:autoRedefine/>
     <w:uiPriority w:val="39"/>
     <w:unhideWhenUsed/>
-    <w:rsid w:val="00C424A0"/>
+    <w:rsid w:val="004D27FB"/>
     <w:pPr>
       <w:spacing w:after="100"/>
       <w:ind w:left="240"/>
@@ -15164,7 +15164,7 @@
     <w:autoRedefine/>
     <w:uiPriority w:val="39"/>
     <w:unhideWhenUsed/>
-    <w:rsid w:val="00C424A0"/>
+    <w:rsid w:val="004D27FB"/>
     <w:pPr>
       <w:spacing w:after="100"/>
       <w:ind w:left="480"/>
@@ -15177,7 +15177,7 @@
     <w:autoRedefine/>
     <w:uiPriority w:val="39"/>
     <w:unhideWhenUsed/>
-    <w:rsid w:val="00C424A0"/>
+    <w:rsid w:val="004D27FB"/>
     <w:pPr>
       <w:spacing w:after="100"/>
       <w:ind w:left="720"/>

</xml_diff>

<commit_message>
Recapture the GitHub repo screenshot from the new repo, drop the Actions one
11-github-repo.png now shows KirishaTharusan/sunrise-dental-clinic
(dev branch, README, current file tree) instead of the old,
long-stale TharusanK23 screenshot. 13-github-actions.png is removed -
the new repo has no CI configured (only backend/frontend/database/
testing/postman were pushed there), so a CI-run screenshot from it
would be misleading; the report's Task D text still describes the
Actions workflow itself, just without a screenshot tied to this repo.

Co-Authored-By: Claude Sonnet 5 <noreply@anthropic.com>
</commit_message>
<xml_diff>
--- a/docs/ASSIGNMENT_REPORT.docx
+++ b/docs/ASSIGNMENT_REPORT.docx
@@ -2523,7 +2523,7 @@
       <w:r>
         <w:fldChar w:fldCharType="separate"/>
       </w:r>
-      <w:hyperlink w:anchor="_Toc238564205" w:history="1">
+      <w:hyperlink w:anchor="_Toc238564886" w:history="1">
         <w:r>
           <w:rPr>
             <w:rStyle w:val="Hyperlink"/>
@@ -2549,7 +2549,7 @@
           <w:rPr>
             <w:noProof/>
           </w:rPr>
-          <w:instrText xml:space="preserve"> PAGEREF _Toc238564205 \h </w:instrText>
+          <w:instrText xml:space="preserve"> PAGEREF _Toc238564886 \h </w:instrText>
         </w:r>
         <w:r>
           <w:rPr>
@@ -2586,7 +2586,7 @@
           <w:noProof/>
         </w:rPr>
       </w:pPr>
-      <w:hyperlink w:anchor="_Toc238564206" w:history="1">
+      <w:hyperlink w:anchor="_Toc238564887" w:history="1">
         <w:r>
           <w:rPr>
             <w:rStyle w:val="Hyperlink"/>
@@ -2612,7 +2612,7 @@
           <w:rPr>
             <w:noProof/>
           </w:rPr>
-          <w:instrText xml:space="preserve"> PAGEREF _Toc238564206 \h </w:instrText>
+          <w:instrText xml:space="preserve"> PAGEREF _Toc238564887 \h </w:instrText>
         </w:r>
         <w:r>
           <w:rPr>
@@ -2649,7 +2649,7 @@
           <w:noProof/>
         </w:rPr>
       </w:pPr>
-      <w:hyperlink w:anchor="_Toc238564207" w:history="1">
+      <w:hyperlink w:anchor="_Toc238564888" w:history="1">
         <w:r>
           <w:rPr>
             <w:rStyle w:val="Hyperlink"/>
@@ -2675,7 +2675,7 @@
           <w:rPr>
             <w:noProof/>
           </w:rPr>
-          <w:instrText xml:space="preserve"> PAGEREF _Toc238564207 \h </w:instrText>
+          <w:instrText xml:space="preserve"> PAGEREF _Toc238564888 \h </w:instrText>
         </w:r>
         <w:r>
           <w:rPr>
@@ -2712,7 +2712,7 @@
           <w:noProof/>
         </w:rPr>
       </w:pPr>
-      <w:hyperlink w:anchor="_Toc238564208" w:history="1">
+      <w:hyperlink w:anchor="_Toc238564889" w:history="1">
         <w:r>
           <w:rPr>
             <w:rStyle w:val="Hyperlink"/>
@@ -2738,7 +2738,7 @@
           <w:rPr>
             <w:noProof/>
           </w:rPr>
-          <w:instrText xml:space="preserve"> PAGEREF _Toc238564208 \h </w:instrText>
+          <w:instrText xml:space="preserve"> PAGEREF _Toc238564889 \h </w:instrText>
         </w:r>
         <w:r>
           <w:rPr>
@@ -2775,7 +2775,7 @@
           <w:noProof/>
         </w:rPr>
       </w:pPr>
-      <w:hyperlink w:anchor="_Toc238564209" w:history="1">
+      <w:hyperlink w:anchor="_Toc238564890" w:history="1">
         <w:r>
           <w:rPr>
             <w:rStyle w:val="Hyperlink"/>
@@ -2801,7 +2801,7 @@
           <w:rPr>
             <w:noProof/>
           </w:rPr>
-          <w:instrText xml:space="preserve"> PAGEREF _Toc238564209 \h </w:instrText>
+          <w:instrText xml:space="preserve"> PAGEREF _Toc238564890 \h </w:instrText>
         </w:r>
         <w:r>
           <w:rPr>
@@ -2838,7 +2838,7 @@
           <w:noProof/>
         </w:rPr>
       </w:pPr>
-      <w:hyperlink w:anchor="_Toc238564210" w:history="1">
+      <w:hyperlink w:anchor="_Toc238564891" w:history="1">
         <w:r>
           <w:rPr>
             <w:rStyle w:val="Hyperlink"/>
@@ -2864,7 +2864,7 @@
           <w:rPr>
             <w:noProof/>
           </w:rPr>
-          <w:instrText xml:space="preserve"> PAGEREF _Toc238564210 \h </w:instrText>
+          <w:instrText xml:space="preserve"> PAGEREF _Toc238564891 \h </w:instrText>
         </w:r>
         <w:r>
           <w:rPr>
@@ -2901,7 +2901,7 @@
           <w:noProof/>
         </w:rPr>
       </w:pPr>
-      <w:hyperlink w:anchor="_Toc238564211" w:history="1">
+      <w:hyperlink w:anchor="_Toc238564892" w:history="1">
         <w:r>
           <w:rPr>
             <w:rStyle w:val="Hyperlink"/>
@@ -2927,7 +2927,7 @@
           <w:rPr>
             <w:noProof/>
           </w:rPr>
-          <w:instrText xml:space="preserve"> PAGEREF _Toc238564211 \h </w:instrText>
+          <w:instrText xml:space="preserve"> PAGEREF _Toc238564892 \h </w:instrText>
         </w:r>
         <w:r>
           <w:rPr>
@@ -2964,7 +2964,7 @@
           <w:noProof/>
         </w:rPr>
       </w:pPr>
-      <w:hyperlink w:anchor="_Toc238564212" w:history="1">
+      <w:hyperlink w:anchor="_Toc238564893" w:history="1">
         <w:r>
           <w:rPr>
             <w:rStyle w:val="Hyperlink"/>
@@ -2990,7 +2990,7 @@
           <w:rPr>
             <w:noProof/>
           </w:rPr>
-          <w:instrText xml:space="preserve"> PAGEREF _Toc238564212 \h </w:instrText>
+          <w:instrText xml:space="preserve"> PAGEREF _Toc238564893 \h </w:instrText>
         </w:r>
         <w:r>
           <w:rPr>
@@ -3027,7 +3027,7 @@
           <w:noProof/>
         </w:rPr>
       </w:pPr>
-      <w:hyperlink w:anchor="_Toc238564213" w:history="1">
+      <w:hyperlink w:anchor="_Toc238564894" w:history="1">
         <w:r>
           <w:rPr>
             <w:rStyle w:val="Hyperlink"/>
@@ -3053,7 +3053,7 @@
           <w:rPr>
             <w:noProof/>
           </w:rPr>
-          <w:instrText xml:space="preserve"> PAGEREF _Toc238564213 \h </w:instrText>
+          <w:instrText xml:space="preserve"> PAGEREF _Toc238564894 \h </w:instrText>
         </w:r>
         <w:r>
           <w:rPr>
@@ -3090,7 +3090,7 @@
           <w:noProof/>
         </w:rPr>
       </w:pPr>
-      <w:hyperlink w:anchor="_Toc238564214" w:history="1">
+      <w:hyperlink w:anchor="_Toc238564895" w:history="1">
         <w:r>
           <w:rPr>
             <w:rStyle w:val="Hyperlink"/>
@@ -3116,7 +3116,7 @@
           <w:rPr>
             <w:noProof/>
           </w:rPr>
-          <w:instrText xml:space="preserve"> PAGEREF _Toc238564214 \h </w:instrText>
+          <w:instrText xml:space="preserve"> PAGEREF _Toc238564895 \h </w:instrText>
         </w:r>
         <w:r>
           <w:rPr>
@@ -3153,7 +3153,7 @@
           <w:noProof/>
         </w:rPr>
       </w:pPr>
-      <w:hyperlink w:anchor="_Toc238564215" w:history="1">
+      <w:hyperlink w:anchor="_Toc238564896" w:history="1">
         <w:r>
           <w:rPr>
             <w:rStyle w:val="Hyperlink"/>
@@ -3179,7 +3179,7 @@
           <w:rPr>
             <w:noProof/>
           </w:rPr>
-          <w:instrText xml:space="preserve"> PAGEREF _Toc238564215 \h </w:instrText>
+          <w:instrText xml:space="preserve"> PAGEREF _Toc238564896 \h </w:instrText>
         </w:r>
         <w:r>
           <w:rPr>
@@ -3216,7 +3216,7 @@
           <w:noProof/>
         </w:rPr>
       </w:pPr>
-      <w:hyperlink w:anchor="_Toc238564216" w:history="1">
+      <w:hyperlink w:anchor="_Toc238564897" w:history="1">
         <w:r>
           <w:rPr>
             <w:rStyle w:val="Hyperlink"/>
@@ -3242,7 +3242,7 @@
           <w:rPr>
             <w:noProof/>
           </w:rPr>
-          <w:instrText xml:space="preserve"> PAGEREF _Toc238564216 \h </w:instrText>
+          <w:instrText xml:space="preserve"> PAGEREF _Toc238564897 \h </w:instrText>
         </w:r>
         <w:r>
           <w:rPr>
@@ -3279,7 +3279,7 @@
           <w:noProof/>
         </w:rPr>
       </w:pPr>
-      <w:hyperlink w:anchor="_Toc238564217" w:history="1">
+      <w:hyperlink w:anchor="_Toc238564898" w:history="1">
         <w:r>
           <w:rPr>
             <w:rStyle w:val="Hyperlink"/>
@@ -3305,7 +3305,7 @@
           <w:rPr>
             <w:noProof/>
           </w:rPr>
-          <w:instrText xml:space="preserve"> PAGEREF _Toc238564217 \h </w:instrText>
+          <w:instrText xml:space="preserve"> PAGEREF _Toc238564898 \h </w:instrText>
         </w:r>
         <w:r>
           <w:rPr>
@@ -3342,7 +3342,7 @@
           <w:noProof/>
         </w:rPr>
       </w:pPr>
-      <w:hyperlink w:anchor="_Toc238564218" w:history="1">
+      <w:hyperlink w:anchor="_Toc238564899" w:history="1">
         <w:r>
           <w:rPr>
             <w:rStyle w:val="Hyperlink"/>
@@ -3368,7 +3368,7 @@
           <w:rPr>
             <w:noProof/>
           </w:rPr>
-          <w:instrText xml:space="preserve"> PAGEREF _Toc238564218 \h </w:instrText>
+          <w:instrText xml:space="preserve"> PAGEREF _Toc238564899 \h </w:instrText>
         </w:r>
         <w:r>
           <w:rPr>
@@ -3405,7 +3405,7 @@
           <w:noProof/>
         </w:rPr>
       </w:pPr>
-      <w:hyperlink w:anchor="_Toc238564219" w:history="1">
+      <w:hyperlink w:anchor="_Toc238564900" w:history="1">
         <w:r>
           <w:rPr>
             <w:rStyle w:val="Hyperlink"/>
@@ -3431,7 +3431,7 @@
           <w:rPr>
             <w:noProof/>
           </w:rPr>
-          <w:instrText xml:space="preserve"> PAGEREF _Toc238564219 \h </w:instrText>
+          <w:instrText xml:space="preserve"> PAGEREF _Toc238564900 \h </w:instrText>
         </w:r>
         <w:r>
           <w:rPr>
@@ -3468,7 +3468,7 @@
           <w:noProof/>
         </w:rPr>
       </w:pPr>
-      <w:hyperlink w:anchor="_Toc238564220" w:history="1">
+      <w:hyperlink w:anchor="_Toc238564901" w:history="1">
         <w:r>
           <w:rPr>
             <w:rStyle w:val="Hyperlink"/>
@@ -3523,7 +3523,7 @@
           <w:rPr>
             <w:noProof/>
           </w:rPr>
-          <w:instrText xml:space="preserve"> PAGEREF _Toc238564220 \h </w:instrText>
+          <w:instrText xml:space="preserve"> PAGEREF _Toc238564901 \h </w:instrText>
         </w:r>
         <w:r>
           <w:rPr>
@@ -3560,7 +3560,7 @@
           <w:noProof/>
         </w:rPr>
       </w:pPr>
-      <w:hyperlink w:anchor="_Toc238564221" w:history="1">
+      <w:hyperlink w:anchor="_Toc238564902" w:history="1">
         <w:r>
           <w:rPr>
             <w:rStyle w:val="Hyperlink"/>
@@ -3596,7 +3596,7 @@
           <w:rPr>
             <w:noProof/>
           </w:rPr>
-          <w:instrText xml:space="preserve"> PAGEREF _Toc238564221 \h </w:instrText>
+          <w:instrText xml:space="preserve"> PAGEREF _Toc238564902 \h </w:instrText>
         </w:r>
         <w:r>
           <w:rPr>
@@ -3633,7 +3633,7 @@
           <w:noProof/>
         </w:rPr>
       </w:pPr>
-      <w:hyperlink w:anchor="_Toc238564222" w:history="1">
+      <w:hyperlink w:anchor="_Toc238564903" w:history="1">
         <w:r>
           <w:rPr>
             <w:rStyle w:val="Hyperlink"/>
@@ -3669,7 +3669,7 @@
           <w:rPr>
             <w:noProof/>
           </w:rPr>
-          <w:instrText xml:space="preserve"> PAGEREF _Toc238564222 \h </w:instrText>
+          <w:instrText xml:space="preserve"> PAGEREF _Toc238564903 \h </w:instrText>
         </w:r>
         <w:r>
           <w:rPr>
@@ -3706,7 +3706,7 @@
           <w:noProof/>
         </w:rPr>
       </w:pPr>
-      <w:hyperlink w:anchor="_Toc238564223" w:history="1">
+      <w:hyperlink w:anchor="_Toc238564904" w:history="1">
         <w:r>
           <w:rPr>
             <w:rStyle w:val="Hyperlink"/>
@@ -3761,7 +3761,7 @@
           <w:rPr>
             <w:noProof/>
           </w:rPr>
-          <w:instrText xml:space="preserve"> PAGEREF _Toc238564223 \h </w:instrText>
+          <w:instrText xml:space="preserve"> PAGEREF _Toc238564904 \h </w:instrText>
         </w:r>
         <w:r>
           <w:rPr>
@@ -3798,7 +3798,7 @@
           <w:noProof/>
         </w:rPr>
       </w:pPr>
-      <w:hyperlink w:anchor="_Toc238564224" w:history="1">
+      <w:hyperlink w:anchor="_Toc238564905" w:history="1">
         <w:r>
           <w:rPr>
             <w:rStyle w:val="Hyperlink"/>
@@ -3853,7 +3853,7 @@
           <w:rPr>
             <w:noProof/>
           </w:rPr>
-          <w:instrText xml:space="preserve"> PAGEREF _Toc238564224 \h </w:instrText>
+          <w:instrText xml:space="preserve"> PAGEREF _Toc238564905 \h </w:instrText>
         </w:r>
         <w:r>
           <w:rPr>
@@ -3890,7 +3890,7 @@
           <w:noProof/>
         </w:rPr>
       </w:pPr>
-      <w:hyperlink w:anchor="_Toc238564225" w:history="1">
+      <w:hyperlink w:anchor="_Toc238564906" w:history="1">
         <w:r>
           <w:rPr>
             <w:rStyle w:val="Hyperlink"/>
@@ -3916,7 +3916,7 @@
           <w:rPr>
             <w:noProof/>
           </w:rPr>
-          <w:instrText xml:space="preserve"> PAGEREF _Toc238564225 \h </w:instrText>
+          <w:instrText xml:space="preserve"> PAGEREF _Toc238564906 \h </w:instrText>
         </w:r>
         <w:r>
           <w:rPr>
@@ -3953,7 +3953,7 @@
           <w:noProof/>
         </w:rPr>
       </w:pPr>
-      <w:hyperlink w:anchor="_Toc238564226" w:history="1">
+      <w:hyperlink w:anchor="_Toc238564907" w:history="1">
         <w:r>
           <w:rPr>
             <w:rStyle w:val="Hyperlink"/>
@@ -3979,7 +3979,7 @@
           <w:rPr>
             <w:noProof/>
           </w:rPr>
-          <w:instrText xml:space="preserve"> PAGEREF _Toc238564226 \h </w:instrText>
+          <w:instrText xml:space="preserve"> PAGEREF _Toc238564907 \h </w:instrText>
         </w:r>
         <w:r>
           <w:rPr>
@@ -4016,7 +4016,7 @@
           <w:noProof/>
         </w:rPr>
       </w:pPr>
-      <w:hyperlink w:anchor="_Toc238564227" w:history="1">
+      <w:hyperlink w:anchor="_Toc238564908" w:history="1">
         <w:r>
           <w:rPr>
             <w:rStyle w:val="Hyperlink"/>
@@ -4042,7 +4042,7 @@
           <w:rPr>
             <w:noProof/>
           </w:rPr>
-          <w:instrText xml:space="preserve"> PAGEREF _Toc238564227 \h </w:instrText>
+          <w:instrText xml:space="preserve"> PAGEREF _Toc238564908 \h </w:instrText>
         </w:r>
         <w:r>
           <w:rPr>
@@ -4079,7 +4079,7 @@
           <w:noProof/>
         </w:rPr>
       </w:pPr>
-      <w:hyperlink w:anchor="_Toc238564228" w:history="1">
+      <w:hyperlink w:anchor="_Toc238564909" w:history="1">
         <w:r>
           <w:rPr>
             <w:rStyle w:val="Hyperlink"/>
@@ -4105,7 +4105,7 @@
           <w:rPr>
             <w:noProof/>
           </w:rPr>
-          <w:instrText xml:space="preserve"> PAGEREF _Toc238564228 \h </w:instrText>
+          <w:instrText xml:space="preserve"> PAGEREF _Toc238564909 \h </w:instrText>
         </w:r>
         <w:r>
           <w:rPr>
@@ -4142,7 +4142,7 @@
           <w:noProof/>
         </w:rPr>
       </w:pPr>
-      <w:hyperlink w:anchor="_Toc238564229" w:history="1">
+      <w:hyperlink w:anchor="_Toc238564910" w:history="1">
         <w:r>
           <w:rPr>
             <w:rStyle w:val="Hyperlink"/>
@@ -4168,7 +4168,7 @@
           <w:rPr>
             <w:noProof/>
           </w:rPr>
-          <w:instrText xml:space="preserve"> PAGEREF _Toc238564229 \h </w:instrText>
+          <w:instrText xml:space="preserve"> PAGEREF _Toc238564910 \h </w:instrText>
         </w:r>
         <w:r>
           <w:rPr>
@@ -4205,7 +4205,7 @@
           <w:noProof/>
         </w:rPr>
       </w:pPr>
-      <w:hyperlink w:anchor="_Toc238564230" w:history="1">
+      <w:hyperlink w:anchor="_Toc238564911" w:history="1">
         <w:r>
           <w:rPr>
             <w:rStyle w:val="Hyperlink"/>
@@ -4231,7 +4231,7 @@
           <w:rPr>
             <w:noProof/>
           </w:rPr>
-          <w:instrText xml:space="preserve"> PAGEREF _Toc238564230 \h </w:instrText>
+          <w:instrText xml:space="preserve"> PAGEREF _Toc238564911 \h </w:instrText>
         </w:r>
         <w:r>
           <w:rPr>
@@ -4268,7 +4268,7 @@
           <w:noProof/>
         </w:rPr>
       </w:pPr>
-      <w:hyperlink w:anchor="_Toc238564231" w:history="1">
+      <w:hyperlink w:anchor="_Toc238564912" w:history="1">
         <w:r>
           <w:rPr>
             <w:rStyle w:val="Hyperlink"/>
@@ -4294,7 +4294,7 @@
           <w:rPr>
             <w:noProof/>
           </w:rPr>
-          <w:instrText xml:space="preserve"> PAGEREF _Toc238564231 \h </w:instrText>
+          <w:instrText xml:space="preserve"> PAGEREF _Toc238564912 \h </w:instrText>
         </w:r>
         <w:r>
           <w:rPr>
@@ -4331,7 +4331,7 @@
           <w:noProof/>
         </w:rPr>
       </w:pPr>
-      <w:hyperlink w:anchor="_Toc238564232" w:history="1">
+      <w:hyperlink w:anchor="_Toc238564913" w:history="1">
         <w:r>
           <w:rPr>
             <w:rStyle w:val="Hyperlink"/>
@@ -4357,7 +4357,7 @@
           <w:rPr>
             <w:noProof/>
           </w:rPr>
-          <w:instrText xml:space="preserve"> PAGEREF _Toc238564232 \h </w:instrText>
+          <w:instrText xml:space="preserve"> PAGEREF _Toc238564913 \h </w:instrText>
         </w:r>
         <w:r>
           <w:rPr>
@@ -4394,7 +4394,7 @@
           <w:noProof/>
         </w:rPr>
       </w:pPr>
-      <w:hyperlink w:anchor="_Toc238564233" w:history="1">
+      <w:hyperlink w:anchor="_Toc238564914" w:history="1">
         <w:r>
           <w:rPr>
             <w:rStyle w:val="Hyperlink"/>
@@ -4420,7 +4420,7 @@
           <w:rPr>
             <w:noProof/>
           </w:rPr>
-          <w:instrText xml:space="preserve"> PAGEREF _Toc238564233 \h </w:instrText>
+          <w:instrText xml:space="preserve"> PAGEREF _Toc238564914 \h </w:instrText>
         </w:r>
         <w:r>
           <w:rPr>
@@ -4457,7 +4457,7 @@
           <w:noProof/>
         </w:rPr>
       </w:pPr>
-      <w:hyperlink w:anchor="_Toc238564234" w:history="1">
+      <w:hyperlink w:anchor="_Toc238564915" w:history="1">
         <w:r>
           <w:rPr>
             <w:rStyle w:val="Hyperlink"/>
@@ -4483,7 +4483,7 @@
           <w:rPr>
             <w:noProof/>
           </w:rPr>
-          <w:instrText xml:space="preserve"> PAGEREF _Toc238564234 \h </w:instrText>
+          <w:instrText xml:space="preserve"> PAGEREF _Toc238564915 \h </w:instrText>
         </w:r>
         <w:r>
           <w:rPr>
@@ -4520,7 +4520,7 @@
           <w:noProof/>
         </w:rPr>
       </w:pPr>
-      <w:hyperlink w:anchor="_Toc238564235" w:history="1">
+      <w:hyperlink w:anchor="_Toc238564916" w:history="1">
         <w:r>
           <w:rPr>
             <w:rStyle w:val="Hyperlink"/>
@@ -4546,7 +4546,7 @@
           <w:rPr>
             <w:noProof/>
           </w:rPr>
-          <w:instrText xml:space="preserve"> PAGEREF _Toc238564235 \h </w:instrText>
+          <w:instrText xml:space="preserve"> PAGEREF _Toc238564916 \h </w:instrText>
         </w:r>
         <w:r>
           <w:rPr>
@@ -4583,7 +4583,7 @@
           <w:noProof/>
         </w:rPr>
       </w:pPr>
-      <w:hyperlink w:anchor="_Toc238564236" w:history="1">
+      <w:hyperlink w:anchor="_Toc238564917" w:history="1">
         <w:r>
           <w:rPr>
             <w:rStyle w:val="Hyperlink"/>
@@ -4609,7 +4609,7 @@
           <w:rPr>
             <w:noProof/>
           </w:rPr>
-          <w:instrText xml:space="preserve"> PAGEREF _Toc238564236 \h </w:instrText>
+          <w:instrText xml:space="preserve"> PAGEREF _Toc238564917 \h </w:instrText>
         </w:r>
         <w:r>
           <w:rPr>
@@ -4646,7 +4646,7 @@
           <w:noProof/>
         </w:rPr>
       </w:pPr>
-      <w:hyperlink w:anchor="_Toc238564237" w:history="1">
+      <w:hyperlink w:anchor="_Toc238564918" w:history="1">
         <w:r>
           <w:rPr>
             <w:rStyle w:val="Hyperlink"/>
@@ -4672,7 +4672,7 @@
           <w:rPr>
             <w:noProof/>
           </w:rPr>
-          <w:instrText xml:space="preserve"> PAGEREF _Toc238564237 \h </w:instrText>
+          <w:instrText xml:space="preserve"> PAGEREF _Toc238564918 \h </w:instrText>
         </w:r>
         <w:r>
           <w:rPr>
@@ -4709,7 +4709,7 @@
           <w:noProof/>
         </w:rPr>
       </w:pPr>
-      <w:hyperlink w:anchor="_Toc238564238" w:history="1">
+      <w:hyperlink w:anchor="_Toc238564919" w:history="1">
         <w:r>
           <w:rPr>
             <w:rStyle w:val="Hyperlink"/>
@@ -4735,7 +4735,7 @@
           <w:rPr>
             <w:noProof/>
           </w:rPr>
-          <w:instrText xml:space="preserve"> PAGEREF _Toc238564238 \h </w:instrText>
+          <w:instrText xml:space="preserve"> PAGEREF _Toc238564919 \h </w:instrText>
         </w:r>
         <w:r>
           <w:rPr>
@@ -4772,7 +4772,7 @@
           <w:noProof/>
         </w:rPr>
       </w:pPr>
-      <w:hyperlink w:anchor="_Toc238564239" w:history="1">
+      <w:hyperlink w:anchor="_Toc238564920" w:history="1">
         <w:r>
           <w:rPr>
             <w:rStyle w:val="Hyperlink"/>
@@ -4798,7 +4798,7 @@
           <w:rPr>
             <w:noProof/>
           </w:rPr>
-          <w:instrText xml:space="preserve"> PAGEREF _Toc238564239 \h </w:instrText>
+          <w:instrText xml:space="preserve"> PAGEREF _Toc238564920 \h </w:instrText>
         </w:r>
         <w:r>
           <w:rPr>
@@ -4835,7 +4835,7 @@
           <w:noProof/>
         </w:rPr>
       </w:pPr>
-      <w:hyperlink w:anchor="_Toc238564240" w:history="1">
+      <w:hyperlink w:anchor="_Toc238564921" w:history="1">
         <w:r>
           <w:rPr>
             <w:rStyle w:val="Hyperlink"/>
@@ -4861,7 +4861,7 @@
           <w:rPr>
             <w:noProof/>
           </w:rPr>
-          <w:instrText xml:space="preserve"> PAGEREF _Toc238564240 \h </w:instrText>
+          <w:instrText xml:space="preserve"> PAGEREF _Toc238564921 \h </w:instrText>
         </w:r>
         <w:r>
           <w:rPr>
@@ -4898,7 +4898,7 @@
           <w:noProof/>
         </w:rPr>
       </w:pPr>
-      <w:hyperlink w:anchor="_Toc238564241" w:history="1">
+      <w:hyperlink w:anchor="_Toc238564922" w:history="1">
         <w:r>
           <w:rPr>
             <w:rStyle w:val="Hyperlink"/>
@@ -4924,7 +4924,7 @@
           <w:rPr>
             <w:noProof/>
           </w:rPr>
-          <w:instrText xml:space="preserve"> PAGEREF _Toc238564241 \h </w:instrText>
+          <w:instrText xml:space="preserve"> PAGEREF _Toc238564922 \h </w:instrText>
         </w:r>
         <w:r>
           <w:rPr>
@@ -4961,7 +4961,7 @@
           <w:noProof/>
         </w:rPr>
       </w:pPr>
-      <w:hyperlink w:anchor="_Toc238564242" w:history="1">
+      <w:hyperlink w:anchor="_Toc238564923" w:history="1">
         <w:r>
           <w:rPr>
             <w:rStyle w:val="Hyperlink"/>
@@ -4987,7 +4987,7 @@
           <w:rPr>
             <w:noProof/>
           </w:rPr>
-          <w:instrText xml:space="preserve"> PAGEREF _Toc238564242 \h </w:instrText>
+          <w:instrText xml:space="preserve"> PAGEREF _Toc238564923 \h </w:instrText>
         </w:r>
         <w:r>
           <w:rPr>
@@ -5004,7 +5004,7 @@
           <w:rPr>
             <w:noProof/>
           </w:rPr>
-          <w:t>43</w:t>
+          <w:t>42</w:t>
         </w:r>
         <w:r>
           <w:rPr>
@@ -5225,7 +5225,7 @@
         <w:pStyle w:val="Heading2"/>
         <w:spacing w:before="240" w:after="120" w:line="360" w:lineRule="auto"/>
       </w:pPr>
-      <w:bookmarkStart w:id="0" w:name="_Toc238564205"/>
+      <w:bookmarkStart w:id="0" w:name="_Toc238564886"/>
       <w:r>
         <w:rPr>
           <w:b/>
@@ -5267,7 +5267,7 @@
         <w:pStyle w:val="Heading3"/>
         <w:spacing w:before="240" w:after="120" w:line="360" w:lineRule="auto"/>
       </w:pPr>
-      <w:bookmarkStart w:id="1" w:name="_Toc238564206"/>
+      <w:bookmarkStart w:id="1" w:name="_Toc238564887"/>
       <w:r>
         <w:rPr>
           <w:b/>
@@ -5389,7 +5389,7 @@
         <w:pStyle w:val="Heading3"/>
         <w:spacing w:before="240" w:after="120" w:line="360" w:lineRule="auto"/>
       </w:pPr>
-      <w:bookmarkStart w:id="2" w:name="_Toc238564207"/>
+      <w:bookmarkStart w:id="2" w:name="_Toc238564888"/>
       <w:r>
         <w:rPr>
           <w:b/>
@@ -5463,7 +5463,7 @@
         <w:pStyle w:val="Heading2"/>
         <w:spacing w:before="240" w:after="120" w:line="360" w:lineRule="auto"/>
       </w:pPr>
-      <w:bookmarkStart w:id="3" w:name="_Toc238564208"/>
+      <w:bookmarkStart w:id="3" w:name="_Toc238564889"/>
       <w:r>
         <w:rPr>
           <w:b/>
@@ -5516,7 +5516,7 @@
         <w:pStyle w:val="Heading3"/>
         <w:spacing w:before="240" w:after="120" w:line="360" w:lineRule="auto"/>
       </w:pPr>
-      <w:bookmarkStart w:id="4" w:name="_Toc238564209"/>
+      <w:bookmarkStart w:id="4" w:name="_Toc238564890"/>
       <w:r>
         <w:rPr>
           <w:b/>
@@ -5539,7 +5539,7 @@
         </w:rPr>
         <w:lastRenderedPageBreak/>
         <w:drawing>
-          <wp:inline distT="0" distB="0" distL="0" distR="0" wp14:anchorId="651E350C" wp14:editId="52E60339">
+          <wp:inline distT="0" distB="0" distL="0" distR="0" wp14:anchorId="45B05FE7" wp14:editId="1A5C0001">
             <wp:extent cx="5334000" cy="4486275"/>
             <wp:effectExtent l="0" t="0" r="0" b="0"/>
             <wp:docPr id="1" name="Picture 1"/>
@@ -5786,7 +5786,7 @@
         <w:pStyle w:val="Heading3"/>
         <w:spacing w:before="240" w:after="120" w:line="360" w:lineRule="auto"/>
       </w:pPr>
-      <w:bookmarkStart w:id="5" w:name="_Toc238564210"/>
+      <w:bookmarkStart w:id="5" w:name="_Toc238564891"/>
       <w:r>
         <w:rPr>
           <w:b/>
@@ -5808,10 +5808,10 @@
           <w:noProof/>
         </w:rPr>
         <w:drawing>
-          <wp:inline distT="0" distB="0" distL="0" distR="0" wp14:anchorId="5D1670D4" wp14:editId="40F36E06">
+          <wp:inline distT="0" distB="0" distL="0" distR="0" wp14:anchorId="5678ED18" wp14:editId="782C9D8A">
             <wp:extent cx="5334000" cy="3057525"/>
             <wp:effectExtent l="0" t="0" r="0" b="0"/>
-            <wp:docPr id="1584626063" name="Picture 1584626063"/>
+            <wp:docPr id="1890681703" name="Picture 1890681703"/>
             <wp:cNvGraphicFramePr>
               <a:graphicFrameLocks xmlns:a="http://schemas.openxmlformats.org/drawingml/2006/main" noChangeAspect="1"/>
             </wp:cNvGraphicFramePr>
@@ -6201,7 +6201,7 @@
         <w:pStyle w:val="Heading3"/>
         <w:spacing w:before="240" w:after="120" w:line="360" w:lineRule="auto"/>
       </w:pPr>
-      <w:bookmarkStart w:id="6" w:name="_Toc238564211"/>
+      <w:bookmarkStart w:id="6" w:name="_Toc238564892"/>
       <w:r>
         <w:rPr>
           <w:b/>
@@ -6446,10 +6446,10 @@
         </w:rPr>
         <w:lastRenderedPageBreak/>
         <w:drawing>
-          <wp:inline distT="0" distB="0" distL="0" distR="0" wp14:anchorId="55D0C36E" wp14:editId="44E63857">
+          <wp:inline distT="0" distB="0" distL="0" distR="0" wp14:anchorId="62A49F95" wp14:editId="608AF90F">
             <wp:extent cx="5334000" cy="2933700"/>
             <wp:effectExtent l="0" t="0" r="0" b="0"/>
-            <wp:docPr id="2100847884" name="Picture 2100847884"/>
+            <wp:docPr id="72711824" name="Picture 72711824"/>
             <wp:cNvGraphicFramePr>
               <a:graphicFrameLocks xmlns:a="http://schemas.openxmlformats.org/drawingml/2006/main" noChangeAspect="1"/>
             </wp:cNvGraphicFramePr>
@@ -6510,10 +6510,10 @@
           <w:noProof/>
         </w:rPr>
         <w:drawing>
-          <wp:inline distT="0" distB="0" distL="0" distR="0" wp14:anchorId="4F0C323A" wp14:editId="21EFC5FF">
+          <wp:inline distT="0" distB="0" distL="0" distR="0" wp14:anchorId="4E819DCC" wp14:editId="5D8F83C8">
             <wp:extent cx="5334000" cy="3686175"/>
             <wp:effectExtent l="0" t="0" r="0" b="0"/>
-            <wp:docPr id="441110011" name="Picture 441110011"/>
+            <wp:docPr id="1338733963" name="Picture 1338733963"/>
             <wp:cNvGraphicFramePr>
               <a:graphicFrameLocks xmlns:a="http://schemas.openxmlformats.org/drawingml/2006/main" noChangeAspect="1"/>
             </wp:cNvGraphicFramePr>
@@ -6575,10 +6575,10 @@
         </w:rPr>
         <w:lastRenderedPageBreak/>
         <w:drawing>
-          <wp:inline distT="0" distB="0" distL="0" distR="0" wp14:anchorId="068B82D5" wp14:editId="3126EBE3">
+          <wp:inline distT="0" distB="0" distL="0" distR="0" wp14:anchorId="65BF8657" wp14:editId="7F91AD04">
             <wp:extent cx="5334000" cy="3086100"/>
             <wp:effectExtent l="0" t="0" r="0" b="0"/>
-            <wp:docPr id="869035509" name="Picture 869035509"/>
+            <wp:docPr id="370014343" name="Picture 370014343"/>
             <wp:cNvGraphicFramePr>
               <a:graphicFrameLocks xmlns:a="http://schemas.openxmlformats.org/drawingml/2006/main" noChangeAspect="1"/>
             </wp:cNvGraphicFramePr>
@@ -6634,7 +6634,7 @@
         <w:pStyle w:val="Heading3"/>
         <w:spacing w:before="240" w:after="120" w:line="360" w:lineRule="auto"/>
       </w:pPr>
-      <w:bookmarkStart w:id="7" w:name="_Toc238564212"/>
+      <w:bookmarkStart w:id="7" w:name="_Toc238564893"/>
       <w:r>
         <w:rPr>
           <w:b/>
@@ -6657,10 +6657,10 @@
         </w:rPr>
         <w:lastRenderedPageBreak/>
         <w:drawing>
-          <wp:inline distT="0" distB="0" distL="0" distR="0" wp14:anchorId="3D343A62" wp14:editId="17B0900E">
+          <wp:inline distT="0" distB="0" distL="0" distR="0" wp14:anchorId="12A7647F" wp14:editId="3AC7214C">
             <wp:extent cx="5334000" cy="6229350"/>
             <wp:effectExtent l="0" t="0" r="0" b="0"/>
-            <wp:docPr id="1697716450" name="Picture 1697716450"/>
+            <wp:docPr id="948040905" name="Picture 948040905"/>
             <wp:cNvGraphicFramePr>
               <a:graphicFrameLocks xmlns:a="http://schemas.openxmlformats.org/drawingml/2006/main" noChangeAspect="1"/>
             </wp:cNvGraphicFramePr>
@@ -6737,7 +6737,7 @@
         <w:pStyle w:val="Heading3"/>
         <w:spacing w:before="240" w:after="120" w:line="360" w:lineRule="auto"/>
       </w:pPr>
-      <w:bookmarkStart w:id="8" w:name="_Toc238564213"/>
+      <w:bookmarkStart w:id="8" w:name="_Toc238564894"/>
       <w:r>
         <w:rPr>
           <w:b/>
@@ -6788,7 +6788,7 @@
         <w:pStyle w:val="Heading3"/>
         <w:spacing w:before="240" w:after="120" w:line="360" w:lineRule="auto"/>
       </w:pPr>
-      <w:bookmarkStart w:id="9" w:name="_Toc238564214"/>
+      <w:bookmarkStart w:id="9" w:name="_Toc238564895"/>
       <w:r>
         <w:rPr>
           <w:b/>
@@ -6861,10 +6861,10 @@
           <w:noProof/>
         </w:rPr>
         <w:drawing>
-          <wp:inline distT="0" distB="0" distL="0" distR="0" wp14:anchorId="6B932361" wp14:editId="06C12638">
+          <wp:inline distT="0" distB="0" distL="0" distR="0" wp14:anchorId="04552D31" wp14:editId="52B35657">
             <wp:extent cx="5334000" cy="2714625"/>
             <wp:effectExtent l="0" t="0" r="0" b="0"/>
-            <wp:docPr id="1587327261" name="Picture 1587327261"/>
+            <wp:docPr id="964825034" name="Picture 964825034"/>
             <wp:cNvGraphicFramePr>
               <a:graphicFrameLocks xmlns:a="http://schemas.openxmlformats.org/drawingml/2006/main" noChangeAspect="1"/>
             </wp:cNvGraphicFramePr>
@@ -6968,7 +6968,7 @@
         <w:pStyle w:val="Heading2"/>
         <w:spacing w:before="240" w:after="120" w:line="360" w:lineRule="auto"/>
       </w:pPr>
-      <w:bookmarkStart w:id="10" w:name="_Toc238564215"/>
+      <w:bookmarkStart w:id="10" w:name="_Toc238564896"/>
       <w:r>
         <w:rPr>
           <w:b/>
@@ -6985,7 +6985,7 @@
         <w:pStyle w:val="Heading3"/>
         <w:spacing w:before="240" w:after="120" w:line="360" w:lineRule="auto"/>
       </w:pPr>
-      <w:bookmarkStart w:id="11" w:name="_Toc238564216"/>
+      <w:bookmarkStart w:id="11" w:name="_Toc238564897"/>
       <w:r>
         <w:rPr>
           <w:b/>
@@ -7132,7 +7132,7 @@
         <w:pStyle w:val="Heading3"/>
         <w:spacing w:before="240" w:after="120" w:line="360" w:lineRule="auto"/>
       </w:pPr>
-      <w:bookmarkStart w:id="12" w:name="_Toc238564217"/>
+      <w:bookmarkStart w:id="12" w:name="_Toc238564898"/>
       <w:r>
         <w:rPr>
           <w:b/>
@@ -7259,7 +7259,7 @@
         <w:pStyle w:val="Heading4"/>
         <w:spacing w:before="240" w:after="120" w:line="360" w:lineRule="auto"/>
       </w:pPr>
-      <w:bookmarkStart w:id="13" w:name="_Toc238564218"/>
+      <w:bookmarkStart w:id="13" w:name="_Toc238564899"/>
       <w:r>
         <w:rPr>
           <w:b/>
@@ -7309,10 +7309,10 @@
         </w:rPr>
         <w:lastRenderedPageBreak/>
         <w:drawing>
-          <wp:inline distT="0" distB="0" distL="0" distR="0" wp14:anchorId="3AE3EE10" wp14:editId="5530ACBC">
+          <wp:inline distT="0" distB="0" distL="0" distR="0" wp14:anchorId="45042185" wp14:editId="4A86C3F5">
             <wp:extent cx="5334000" cy="5181600"/>
             <wp:effectExtent l="0" t="0" r="0" b="0"/>
-            <wp:docPr id="1981474748" name="Picture 1981474748"/>
+            <wp:docPr id="1036058026" name="Picture 1036058026"/>
             <wp:cNvGraphicFramePr>
               <a:graphicFrameLocks xmlns:a="http://schemas.openxmlformats.org/drawingml/2006/main" noChangeAspect="1"/>
             </wp:cNvGraphicFramePr>
@@ -7556,10 +7556,10 @@
         </w:rPr>
         <w:lastRenderedPageBreak/>
         <w:drawing>
-          <wp:inline distT="0" distB="0" distL="0" distR="0" wp14:anchorId="475F88BB" wp14:editId="370D3F02">
+          <wp:inline distT="0" distB="0" distL="0" distR="0" wp14:anchorId="2F186346" wp14:editId="55A54307">
             <wp:extent cx="5334000" cy="5181600"/>
             <wp:effectExtent l="0" t="0" r="0" b="0"/>
-            <wp:docPr id="215811592" name="Picture 215811592"/>
+            <wp:docPr id="691220798" name="Picture 691220798"/>
             <wp:cNvGraphicFramePr>
               <a:graphicFrameLocks xmlns:a="http://schemas.openxmlformats.org/drawingml/2006/main" noChangeAspect="1"/>
             </wp:cNvGraphicFramePr>
@@ -7666,10 +7666,10 @@
         </w:rPr>
         <w:lastRenderedPageBreak/>
         <w:drawing>
-          <wp:inline distT="0" distB="0" distL="0" distR="0" wp14:anchorId="1236F7BC" wp14:editId="61CAB020">
+          <wp:inline distT="0" distB="0" distL="0" distR="0" wp14:anchorId="40095223" wp14:editId="40A0E673">
             <wp:extent cx="5334000" cy="5181600"/>
             <wp:effectExtent l="0" t="0" r="0" b="0"/>
-            <wp:docPr id="1733669348" name="Picture 1733669348"/>
+            <wp:docPr id="680354341" name="Picture 680354341"/>
             <wp:cNvGraphicFramePr>
               <a:graphicFrameLocks xmlns:a="http://schemas.openxmlformats.org/drawingml/2006/main" noChangeAspect="1"/>
             </wp:cNvGraphicFramePr>
@@ -7817,10 +7817,10 @@
         </w:rPr>
         <w:lastRenderedPageBreak/>
         <w:drawing>
-          <wp:inline distT="0" distB="0" distL="0" distR="0" wp14:anchorId="37D3AABF" wp14:editId="4E4A232C">
+          <wp:inline distT="0" distB="0" distL="0" distR="0" wp14:anchorId="77B5AC88" wp14:editId="0FA8C6AF">
             <wp:extent cx="5334000" cy="5181600"/>
             <wp:effectExtent l="0" t="0" r="0" b="0"/>
-            <wp:docPr id="379121201" name="Picture 379121201"/>
+            <wp:docPr id="1790227705" name="Picture 1790227705"/>
             <wp:cNvGraphicFramePr>
               <a:graphicFrameLocks xmlns:a="http://schemas.openxmlformats.org/drawingml/2006/main" noChangeAspect="1"/>
             </wp:cNvGraphicFramePr>
@@ -7912,7 +7912,7 @@
         <w:pStyle w:val="Heading3"/>
         <w:spacing w:before="240" w:after="120" w:line="360" w:lineRule="auto"/>
       </w:pPr>
-      <w:bookmarkStart w:id="14" w:name="_Toc238564219"/>
+      <w:bookmarkStart w:id="14" w:name="_Toc238564900"/>
       <w:r>
         <w:rPr>
           <w:b/>
@@ -7938,7 +7938,7 @@
         <w:pStyle w:val="Heading4"/>
         <w:spacing w:before="240" w:after="120" w:line="360" w:lineRule="auto"/>
       </w:pPr>
-      <w:bookmarkStart w:id="15" w:name="_Toc238564220"/>
+      <w:bookmarkStart w:id="15" w:name="_Toc238564901"/>
       <w:r>
         <w:rPr>
           <w:b/>
@@ -8217,7 +8217,7 @@
         <w:pStyle w:val="Heading4"/>
         <w:spacing w:before="240" w:after="120" w:line="360" w:lineRule="auto"/>
       </w:pPr>
-      <w:bookmarkStart w:id="16" w:name="_Toc238564221"/>
+      <w:bookmarkStart w:id="16" w:name="_Toc238564902"/>
       <w:r>
         <w:rPr>
           <w:b/>
@@ -8418,7 +8418,7 @@
         <w:pStyle w:val="Heading4"/>
         <w:spacing w:before="240" w:after="120" w:line="360" w:lineRule="auto"/>
       </w:pPr>
-      <w:bookmarkStart w:id="17" w:name="_Toc238564222"/>
+      <w:bookmarkStart w:id="17" w:name="_Toc238564903"/>
       <w:r>
         <w:rPr>
           <w:b/>
@@ -8605,7 +8605,7 @@
         <w:pStyle w:val="Heading4"/>
         <w:spacing w:before="240" w:after="120" w:line="360" w:lineRule="auto"/>
       </w:pPr>
-      <w:bookmarkStart w:id="18" w:name="_Toc238564223"/>
+      <w:bookmarkStart w:id="18" w:name="_Toc238564904"/>
       <w:r>
         <w:rPr>
           <w:b/>
@@ -8834,7 +8834,7 @@
         <w:pStyle w:val="Heading4"/>
         <w:spacing w:before="240" w:after="120" w:line="360" w:lineRule="auto"/>
       </w:pPr>
-      <w:bookmarkStart w:id="19" w:name="_Toc238564224"/>
+      <w:bookmarkStart w:id="19" w:name="_Toc238564905"/>
       <w:r>
         <w:rPr>
           <w:b/>
@@ -9106,7 +9106,7 @@
         <w:pStyle w:val="Heading4"/>
         <w:spacing w:before="240" w:after="120" w:line="360" w:lineRule="auto"/>
       </w:pPr>
-      <w:bookmarkStart w:id="20" w:name="_Toc238564225"/>
+      <w:bookmarkStart w:id="20" w:name="_Toc238564906"/>
       <w:r>
         <w:rPr>
           <w:b/>
@@ -9225,7 +9225,7 @@
         <w:pStyle w:val="Heading3"/>
         <w:spacing w:before="240" w:after="120" w:line="360" w:lineRule="auto"/>
       </w:pPr>
-      <w:bookmarkStart w:id="21" w:name="_Toc238564226"/>
+      <w:bookmarkStart w:id="21" w:name="_Toc238564907"/>
       <w:r>
         <w:rPr>
           <w:b/>
@@ -9588,7 +9588,7 @@
         <w:pStyle w:val="Heading3"/>
         <w:spacing w:before="240" w:after="120" w:line="360" w:lineRule="auto"/>
       </w:pPr>
-      <w:bookmarkStart w:id="22" w:name="_Toc238564227"/>
+      <w:bookmarkStart w:id="22" w:name="_Toc238564908"/>
       <w:r>
         <w:rPr>
           <w:b/>
@@ -9816,7 +9816,7 @@
         <w:pStyle w:val="Heading3"/>
         <w:spacing w:before="240" w:after="120" w:line="360" w:lineRule="auto"/>
       </w:pPr>
-      <w:bookmarkStart w:id="23" w:name="_Toc238564228"/>
+      <w:bookmarkStart w:id="23" w:name="_Toc238564909"/>
       <w:r>
         <w:rPr>
           <w:b/>
@@ -10256,7 +10256,7 @@
         <w:pStyle w:val="Heading3"/>
         <w:spacing w:before="240" w:after="120" w:line="360" w:lineRule="auto"/>
       </w:pPr>
-      <w:bookmarkStart w:id="24" w:name="_Toc238564229"/>
+      <w:bookmarkStart w:id="24" w:name="_Toc238564910"/>
       <w:r>
         <w:rPr>
           <w:b/>
@@ -10319,10 +10319,10 @@
         </w:rPr>
         <w:lastRenderedPageBreak/>
         <w:drawing>
-          <wp:inline distT="0" distB="0" distL="0" distR="0" wp14:anchorId="0D343B42" wp14:editId="27D21883">
+          <wp:inline distT="0" distB="0" distL="0" distR="0" wp14:anchorId="58DAE2FE" wp14:editId="604305AF">
             <wp:extent cx="5334000" cy="3333750"/>
             <wp:effectExtent l="0" t="0" r="0" b="0"/>
-            <wp:docPr id="818736752" name="Picture 818736752"/>
+            <wp:docPr id="53206398" name="Picture 53206398"/>
             <wp:cNvGraphicFramePr>
               <a:graphicFrameLocks xmlns:a="http://schemas.openxmlformats.org/drawingml/2006/main" noChangeAspect="1"/>
             </wp:cNvGraphicFramePr>
@@ -10383,10 +10383,10 @@
           <w:noProof/>
         </w:rPr>
         <w:drawing>
-          <wp:inline distT="0" distB="0" distL="0" distR="0" wp14:anchorId="420322A5" wp14:editId="0D54F19B">
+          <wp:inline distT="0" distB="0" distL="0" distR="0" wp14:anchorId="063DFB7F" wp14:editId="12E5E05A">
             <wp:extent cx="5334000" cy="3333750"/>
             <wp:effectExtent l="0" t="0" r="0" b="0"/>
-            <wp:docPr id="1716170771" name="Picture 1716170771"/>
+            <wp:docPr id="146258813" name="Picture 146258813"/>
             <wp:cNvGraphicFramePr>
               <a:graphicFrameLocks xmlns:a="http://schemas.openxmlformats.org/drawingml/2006/main" noChangeAspect="1"/>
             </wp:cNvGraphicFramePr>
@@ -10448,10 +10448,10 @@
         </w:rPr>
         <w:lastRenderedPageBreak/>
         <w:drawing>
-          <wp:inline distT="0" distB="0" distL="0" distR="0" wp14:anchorId="0EC57CBC" wp14:editId="494EFF54">
+          <wp:inline distT="0" distB="0" distL="0" distR="0" wp14:anchorId="17DC8C6D" wp14:editId="03040020">
             <wp:extent cx="5334000" cy="3333750"/>
             <wp:effectExtent l="0" t="0" r="0" b="0"/>
-            <wp:docPr id="1468438466" name="Picture 1468438466"/>
+            <wp:docPr id="960273260" name="Picture 960273260"/>
             <wp:cNvGraphicFramePr>
               <a:graphicFrameLocks xmlns:a="http://schemas.openxmlformats.org/drawingml/2006/main" noChangeAspect="1"/>
             </wp:cNvGraphicFramePr>
@@ -10512,10 +10512,10 @@
           <w:noProof/>
         </w:rPr>
         <w:drawing>
-          <wp:inline distT="0" distB="0" distL="0" distR="0" wp14:anchorId="76A61AD8" wp14:editId="5D60CECC">
+          <wp:inline distT="0" distB="0" distL="0" distR="0" wp14:anchorId="4B858CE3" wp14:editId="5D7AC252">
             <wp:extent cx="5334000" cy="3333750"/>
             <wp:effectExtent l="0" t="0" r="0" b="0"/>
-            <wp:docPr id="25940867" name="Picture 25940867"/>
+            <wp:docPr id="1347325982" name="Picture 1347325982"/>
             <wp:cNvGraphicFramePr>
               <a:graphicFrameLocks xmlns:a="http://schemas.openxmlformats.org/drawingml/2006/main" noChangeAspect="1"/>
             </wp:cNvGraphicFramePr>
@@ -10577,10 +10577,10 @@
         </w:rPr>
         <w:lastRenderedPageBreak/>
         <w:drawing>
-          <wp:inline distT="0" distB="0" distL="0" distR="0" wp14:anchorId="65EA4B8A" wp14:editId="6860C865">
+          <wp:inline distT="0" distB="0" distL="0" distR="0" wp14:anchorId="497DBD2C" wp14:editId="77CF24B6">
             <wp:extent cx="5334000" cy="3333750"/>
             <wp:effectExtent l="0" t="0" r="0" b="0"/>
-            <wp:docPr id="1944981772" name="Picture 1944981772"/>
+            <wp:docPr id="1689709910" name="Picture 1689709910"/>
             <wp:cNvGraphicFramePr>
               <a:graphicFrameLocks xmlns:a="http://schemas.openxmlformats.org/drawingml/2006/main" noChangeAspect="1"/>
             </wp:cNvGraphicFramePr>
@@ -10641,10 +10641,10 @@
           <w:noProof/>
         </w:rPr>
         <w:drawing>
-          <wp:inline distT="0" distB="0" distL="0" distR="0" wp14:anchorId="63F4ADAB" wp14:editId="3CB7774D">
+          <wp:inline distT="0" distB="0" distL="0" distR="0" wp14:anchorId="60C05140" wp14:editId="4CF9FD42">
             <wp:extent cx="5334000" cy="3333750"/>
             <wp:effectExtent l="0" t="0" r="0" b="0"/>
-            <wp:docPr id="1609848842" name="Picture 1609848842"/>
+            <wp:docPr id="1125525303" name="Picture 1125525303"/>
             <wp:cNvGraphicFramePr>
               <a:graphicFrameLocks xmlns:a="http://schemas.openxmlformats.org/drawingml/2006/main" noChangeAspect="1"/>
             </wp:cNvGraphicFramePr>
@@ -10706,10 +10706,10 @@
         </w:rPr>
         <w:lastRenderedPageBreak/>
         <w:drawing>
-          <wp:inline distT="0" distB="0" distL="0" distR="0" wp14:anchorId="65689A50" wp14:editId="78F4EAFE">
+          <wp:inline distT="0" distB="0" distL="0" distR="0" wp14:anchorId="2D75B43B" wp14:editId="178FFA73">
             <wp:extent cx="5334000" cy="3333750"/>
             <wp:effectExtent l="0" t="0" r="0" b="0"/>
-            <wp:docPr id="435847584" name="Picture 435847584"/>
+            <wp:docPr id="1667435284" name="Picture 1667435284"/>
             <wp:cNvGraphicFramePr>
               <a:graphicFrameLocks xmlns:a="http://schemas.openxmlformats.org/drawingml/2006/main" noChangeAspect="1"/>
             </wp:cNvGraphicFramePr>
@@ -10774,7 +10774,7 @@
         <w:pStyle w:val="Heading4"/>
         <w:spacing w:before="240" w:after="120" w:line="360" w:lineRule="auto"/>
       </w:pPr>
-      <w:bookmarkStart w:id="25" w:name="_Toc238564230"/>
+      <w:bookmarkStart w:id="25" w:name="_Toc238564911"/>
       <w:r>
         <w:rPr>
           <w:b/>
@@ -10910,10 +10910,10 @@
         </w:rPr>
         <w:lastRenderedPageBreak/>
         <w:drawing>
-          <wp:inline distT="0" distB="0" distL="0" distR="0" wp14:anchorId="66E7FCBF" wp14:editId="6CD80992">
+          <wp:inline distT="0" distB="0" distL="0" distR="0" wp14:anchorId="0987DE67" wp14:editId="3C6BD9FA">
             <wp:extent cx="5334000" cy="3333750"/>
             <wp:effectExtent l="0" t="0" r="0" b="0"/>
-            <wp:docPr id="360693705" name="Picture 360693705"/>
+            <wp:docPr id="1247989203" name="Picture 1247989203"/>
             <wp:cNvGraphicFramePr>
               <a:graphicFrameLocks xmlns:a="http://schemas.openxmlformats.org/drawingml/2006/main" noChangeAspect="1"/>
             </wp:cNvGraphicFramePr>
@@ -10974,10 +10974,10 @@
           <w:noProof/>
         </w:rPr>
         <w:drawing>
-          <wp:inline distT="0" distB="0" distL="0" distR="0" wp14:anchorId="36F40C3E" wp14:editId="4B867712">
+          <wp:inline distT="0" distB="0" distL="0" distR="0" wp14:anchorId="10962D61" wp14:editId="6C57A8BE">
             <wp:extent cx="5334000" cy="3333750"/>
             <wp:effectExtent l="0" t="0" r="0" b="0"/>
-            <wp:docPr id="376075145" name="Picture 376075145"/>
+            <wp:docPr id="989413613" name="Picture 989413613"/>
             <wp:cNvGraphicFramePr>
               <a:graphicFrameLocks xmlns:a="http://schemas.openxmlformats.org/drawingml/2006/main" noChangeAspect="1"/>
             </wp:cNvGraphicFramePr>
@@ -11142,7 +11142,7 @@
         <w:pStyle w:val="Heading2"/>
         <w:spacing w:before="240" w:after="120" w:line="360" w:lineRule="auto"/>
       </w:pPr>
-      <w:bookmarkStart w:id="26" w:name="_Toc238564231"/>
+      <w:bookmarkStart w:id="26" w:name="_Toc238564912"/>
       <w:r>
         <w:rPr>
           <w:b/>
@@ -11186,7 +11186,7 @@
         <w:pStyle w:val="Heading3"/>
         <w:spacing w:before="240" w:after="120" w:line="360" w:lineRule="auto"/>
       </w:pPr>
-      <w:bookmarkStart w:id="27" w:name="_Toc238564232"/>
+      <w:bookmarkStart w:id="27" w:name="_Toc238564913"/>
       <w:r>
         <w:rPr>
           <w:b/>
@@ -11270,7 +11270,7 @@
         <w:pStyle w:val="Heading3"/>
         <w:spacing w:before="240" w:after="120" w:line="360" w:lineRule="auto"/>
       </w:pPr>
-      <w:bookmarkStart w:id="28" w:name="_Toc238564233"/>
+      <w:bookmarkStart w:id="28" w:name="_Toc238564914"/>
       <w:r>
         <w:rPr>
           <w:b/>
@@ -11488,10 +11488,10 @@
           <w:noProof/>
         </w:rPr>
         <w:drawing>
-          <wp:inline distT="0" distB="0" distL="0" distR="0" wp14:anchorId="0092D17F" wp14:editId="1B7BB474">
+          <wp:inline distT="0" distB="0" distL="0" distR="0" wp14:anchorId="79F17E4D" wp14:editId="408744C9">
             <wp:extent cx="5334000" cy="3857625"/>
             <wp:effectExtent l="0" t="0" r="0" b="0"/>
-            <wp:docPr id="1613077449" name="Picture 1613077449"/>
+            <wp:docPr id="236616319" name="Picture 236616319"/>
             <wp:cNvGraphicFramePr>
               <a:graphicFrameLocks xmlns:a="http://schemas.openxmlformats.org/drawingml/2006/main" noChangeAspect="1"/>
             </wp:cNvGraphicFramePr>
@@ -11547,7 +11547,7 @@
         <w:pStyle w:val="Heading3"/>
         <w:spacing w:before="240" w:after="120" w:line="360" w:lineRule="auto"/>
       </w:pPr>
-      <w:bookmarkStart w:id="29" w:name="_Toc238564234"/>
+      <w:bookmarkStart w:id="29" w:name="_Toc238564915"/>
       <w:r>
         <w:rPr>
           <w:b/>
@@ -11635,7 +11635,7 @@
         <w:pStyle w:val="Heading3"/>
         <w:spacing w:before="240" w:after="120" w:line="360" w:lineRule="auto"/>
       </w:pPr>
-      <w:bookmarkStart w:id="30" w:name="_Toc238564235"/>
+      <w:bookmarkStart w:id="30" w:name="_Toc238564916"/>
       <w:r>
         <w:rPr>
           <w:b/>
@@ -11882,7 +11882,7 @@
         <w:pStyle w:val="Heading3"/>
         <w:spacing w:before="240" w:after="120" w:line="360" w:lineRule="auto"/>
       </w:pPr>
-      <w:bookmarkStart w:id="31" w:name="_Toc238564236"/>
+      <w:bookmarkStart w:id="31" w:name="_Toc238564917"/>
       <w:r>
         <w:rPr>
           <w:b/>
@@ -11928,7 +11928,7 @@
         <w:pStyle w:val="Heading2"/>
         <w:spacing w:before="240" w:after="120" w:line="360" w:lineRule="auto"/>
       </w:pPr>
-      <w:bookmarkStart w:id="32" w:name="_Toc238564237"/>
+      <w:bookmarkStart w:id="32" w:name="_Toc238564918"/>
       <w:r>
         <w:rPr>
           <w:b/>
@@ -12271,10 +12271,10 @@
         </w:rPr>
         <w:lastRenderedPageBreak/>
         <w:drawing>
-          <wp:inline distT="0" distB="0" distL="0" distR="0" wp14:anchorId="73C68C46" wp14:editId="23003F5F">
-            <wp:extent cx="5334000" cy="3705225"/>
+          <wp:inline distT="0" distB="0" distL="0" distR="0" wp14:anchorId="2066B3C1" wp14:editId="1F0AB9B3">
+            <wp:extent cx="5334000" cy="3333750"/>
             <wp:effectExtent l="0" t="0" r="0" b="0"/>
-            <wp:docPr id="1254400455" name="Picture 1254400455"/>
+            <wp:docPr id="58132137" name="Picture 58132137"/>
             <wp:cNvGraphicFramePr>
               <a:graphicFrameLocks xmlns:a="http://schemas.openxmlformats.org/drawingml/2006/main" noChangeAspect="1"/>
             </wp:cNvGraphicFramePr>
@@ -12297,7 +12297,7 @@
                   <pic:spPr bwMode="auto">
                     <a:xfrm>
                       <a:off x="0" y="0"/>
-                      <a:ext cx="5334000" cy="3705225"/>
+                      <a:ext cx="5334000" cy="3333750"/>
                     </a:xfrm>
                     <a:prstGeom prst="rect">
                       <a:avLst/>
@@ -12327,70 +12327,6 @@
     </w:p>
     <w:p>
       <w:pPr>
-        <w:spacing w:before="120" w:after="60"/>
-        <w:jc w:val="center"/>
-      </w:pPr>
-      <w:r>
-        <w:rPr>
-          <w:noProof/>
-        </w:rPr>
-        <w:drawing>
-          <wp:inline distT="0" distB="0" distL="0" distR="0" wp14:anchorId="5B8BEAF7" wp14:editId="21C1DC33">
-            <wp:extent cx="5334000" cy="3705225"/>
-            <wp:effectExtent l="0" t="0" r="0" b="0"/>
-            <wp:docPr id="1925649559" name="Picture 1925649559"/>
-            <wp:cNvGraphicFramePr>
-              <a:graphicFrameLocks xmlns:a="http://schemas.openxmlformats.org/drawingml/2006/main" noChangeAspect="1"/>
-            </wp:cNvGraphicFramePr>
-            <a:graphic xmlns:a="http://schemas.openxmlformats.org/drawingml/2006/main">
-              <a:graphicData uri="http://schemas.openxmlformats.org/drawingml/2006/picture">
-                <pic:pic xmlns:pic="http://schemas.openxmlformats.org/drawingml/2006/picture">
-                  <pic:nvPicPr>
-                    <pic:cNvPr id="0" name=""/>
-                    <pic:cNvPicPr>
-                      <a:picLocks noChangeAspect="1" noChangeArrowheads="1"/>
-                    </pic:cNvPicPr>
-                  </pic:nvPicPr>
-                  <pic:blipFill>
-                    <a:blip r:embed="rId33"/>
-                    <a:srcRect/>
-                    <a:stretch>
-                      <a:fillRect/>
-                    </a:stretch>
-                  </pic:blipFill>
-                  <pic:spPr bwMode="auto">
-                    <a:xfrm>
-                      <a:off x="0" y="0"/>
-                      <a:ext cx="5334000" cy="3705225"/>
-                    </a:xfrm>
-                    <a:prstGeom prst="rect">
-                      <a:avLst/>
-                    </a:prstGeom>
-                  </pic:spPr>
-                </pic:pic>
-              </a:graphicData>
-            </a:graphic>
-          </wp:inline>
-        </w:drawing>
-      </w:r>
-    </w:p>
-    <w:p>
-      <w:pPr>
-        <w:spacing w:after="200"/>
-        <w:jc w:val="center"/>
-      </w:pPr>
-      <w:r>
-        <w:rPr>
-          <w:i/>
-          <w:iCs/>
-          <w:sz w:val="20"/>
-          <w:szCs w:val="20"/>
-        </w:rPr>
-        <w:t>GitHub Actions - Backend CI run history</w:t>
-      </w:r>
-    </w:p>
-    <w:p>
-      <w:pPr>
         <w:pBdr>
           <w:bottom w:val="single" w:sz="6" w:space="0" w:color="999999"/>
         </w:pBdr>
@@ -12402,7 +12338,7 @@
         <w:pStyle w:val="Heading2"/>
         <w:spacing w:before="240" w:after="120" w:line="360" w:lineRule="auto"/>
       </w:pPr>
-      <w:bookmarkStart w:id="33" w:name="_Toc238564238"/>
+      <w:bookmarkStart w:id="33" w:name="_Toc238564919"/>
       <w:r>
         <w:rPr>
           <w:b/>
@@ -12466,7 +12402,6 @@
                 <w:b/>
                 <w:bCs/>
               </w:rPr>
-              <w:lastRenderedPageBreak/>
               <w:t>Criterion (from the Marking/Assessment Criteria table)</w:t>
             </w:r>
           </w:p>
@@ -12785,6 +12720,7 @@
               <w:spacing w:line="360" w:lineRule="auto"/>
             </w:pPr>
             <w:r>
+              <w:lastRenderedPageBreak/>
               <w:t>Application of the most suitable patterns, clearly evidenced</w:t>
             </w:r>
           </w:p>
@@ -13122,7 +13058,6 @@
               <w:spacing w:line="360" w:lineRule="auto"/>
             </w:pPr>
             <w:r>
-              <w:lastRenderedPageBreak/>
               <w:t>Devised/derived test data; test plan produced and applied</w:t>
             </w:r>
           </w:p>
@@ -13435,6 +13370,7 @@
               <w:spacing w:line="360" w:lineRule="auto"/>
             </w:pPr>
             <w:r>
+              <w:lastRenderedPageBreak/>
               <w:t>Professional documentation with screenshots and clear explanations</w:t>
             </w:r>
           </w:p>
@@ -13621,7 +13557,7 @@
             <w:r>
               <w:t xml:space="preserve">§5, pushed to </w:t>
             </w:r>
-            <w:hyperlink r:id="rId34" w:history="1">
+            <w:hyperlink r:id="rId33" w:history="1">
               <w:r>
                 <w:rPr>
                   <w:color w:val="0B3954"/>
@@ -13655,7 +13591,7 @@
         <w:pStyle w:val="Heading2"/>
         <w:spacing w:before="240" w:after="120" w:line="360" w:lineRule="auto"/>
       </w:pPr>
-      <w:bookmarkStart w:id="34" w:name="_Toc238564239"/>
+      <w:bookmarkStart w:id="34" w:name="_Toc238564920"/>
       <w:r>
         <w:rPr>
           <w:b/>
@@ -13677,7 +13613,6 @@
           <w:b/>
           <w:bCs/>
         </w:rPr>
-        <w:lastRenderedPageBreak/>
         <w:t>Ethical.</w:t>
       </w:r>
       <w:r>
@@ -13721,7 +13656,11 @@
         <w:t>AppointmentObserver</w:t>
       </w:r>
       <w:r>
-        <w:t xml:space="preserve"> interfaces between core logic and its extensible behaviours — precisely the "deconstructing complex problems into smaller, manageable components" the module's Digital attribute asks students to </w:t>
+        <w:t xml:space="preserve"> interfaces between core logic and its extensible behaviours — precisely the "deconstructing complex problems into smaller, </w:t>
+      </w:r>
+      <w:r>
+        <w:lastRenderedPageBreak/>
+        <w:t xml:space="preserve">manageable components" the module's Digital attribute asks students to </w:t>
       </w:r>
       <w:r>
         <w:t>demonstrate. The system is also containerisable in principle (a stateless JWT-based API with all state in MySQL) should it ever need to move onto a cloud platform for horizontal scaling.</w:t>
@@ -13796,7 +13735,7 @@
         <w:pStyle w:val="Heading2"/>
         <w:spacing w:before="240" w:after="120" w:line="360" w:lineRule="auto"/>
       </w:pPr>
-      <w:bookmarkStart w:id="35" w:name="_Toc238564240"/>
+      <w:bookmarkStart w:id="35" w:name="_Toc238564921"/>
       <w:r>
         <w:rPr>
           <w:b/>
@@ -13814,11 +13753,7 @@
         <w:jc w:val="both"/>
       </w:pPr>
       <w:r>
-        <w:t xml:space="preserve">This project delivers a complete, working, three-tier dental-clinic appointment and billing system that fulfils every functional requirement in the assignment brief's scenario, five deliberately-justified design patterns plus the Repository pattern, a </w:t>
-      </w:r>
-      <w:r>
-        <w:lastRenderedPageBreak/>
-        <w:t xml:space="preserve">MySQL database exercising triggers/a stored procedure/views beyond basic CRUD, a documented and </w:t>
+        <w:t xml:space="preserve">This project delivers a complete, working, three-tier dental-clinic appointment and billing system that fulfils every functional requirement in the assignment brief's scenario, five deliberately-justified design patterns plus the Repository pattern, a MySQL database exercising triggers/a stored procedure/views beyond basic CRUD, a documented and </w:t>
       </w:r>
       <w:r>
         <w:t xml:space="preserve">partially test-driven automated test suite with genuine, recorded lessons learned, and a </w:t>
@@ -13870,7 +13805,7 @@
         <w:pStyle w:val="Heading2"/>
         <w:spacing w:before="240" w:after="120" w:line="360" w:lineRule="auto"/>
       </w:pPr>
-      <w:bookmarkStart w:id="36" w:name="_Toc238564241"/>
+      <w:bookmarkStart w:id="36" w:name="_Toc238564922"/>
       <w:r>
         <w:rPr>
           <w:b/>
@@ -13983,7 +13918,7 @@
       <w:r>
         <w:t xml:space="preserve">. Internet Engineering Task Force. Available at: </w:t>
       </w:r>
-      <w:hyperlink r:id="rId35" w:history="1">
+      <w:hyperlink r:id="rId34" w:history="1">
         <w:r>
           <w:rPr>
             <w:color w:val="0B3954"/>
@@ -14014,7 +13949,7 @@
       <w:r>
         <w:t xml:space="preserve">. Available at: </w:t>
       </w:r>
-      <w:hyperlink r:id="rId36" w:history="1">
+      <w:hyperlink r:id="rId35" w:history="1">
         <w:r>
           <w:rPr>
             <w:color w:val="0B3954"/>
@@ -14045,7 +13980,7 @@
       <w:r>
         <w:t xml:space="preserve">. Available at: </w:t>
       </w:r>
-      <w:hyperlink r:id="rId37" w:history="1">
+      <w:hyperlink r:id="rId36" w:history="1">
         <w:r>
           <w:rPr>
             <w:color w:val="0B3954"/>
@@ -14064,7 +13999,6 @@
         <w:jc w:val="both"/>
       </w:pPr>
       <w:r>
-        <w:lastRenderedPageBreak/>
         <w:t xml:space="preserve">OWASP Foundation (2021) </w:t>
       </w:r>
       <w:r>
@@ -14077,7 +14011,7 @@
       <w:r>
         <w:t xml:space="preserve">. Available at: </w:t>
       </w:r>
-      <w:hyperlink r:id="rId38" w:history="1">
+      <w:hyperlink r:id="rId37" w:history="1">
         <w:r>
           <w:rPr>
             <w:color w:val="0B3954"/>
@@ -14108,7 +14042,7 @@
       <w:r>
         <w:t xml:space="preserve">. Available at: </w:t>
       </w:r>
-      <w:hyperlink r:id="rId39" w:history="1">
+      <w:hyperlink r:id="rId38" w:history="1">
         <w:r>
           <w:rPr>
             <w:color w:val="0B3954"/>
@@ -14139,7 +14073,7 @@
       <w:r>
         <w:t xml:space="preserve">. Available at: </w:t>
       </w:r>
-      <w:hyperlink r:id="rId40" w:history="1">
+      <w:hyperlink r:id="rId39" w:history="1">
         <w:r>
           <w:rPr>
             <w:color w:val="0B3954"/>
@@ -14165,7 +14099,7 @@
         <w:pStyle w:val="Heading2"/>
         <w:spacing w:before="240" w:after="120" w:line="360" w:lineRule="auto"/>
       </w:pPr>
-      <w:bookmarkStart w:id="37" w:name="_Toc238564242"/>
+      <w:bookmarkStart w:id="37" w:name="_Toc238564923"/>
       <w:r>
         <w:rPr>
           <w:b/>
@@ -14237,6 +14171,7 @@
           <w:b/>
           <w:bCs/>
         </w:rPr>
+        <w:lastRenderedPageBreak/>
         <w:t>Appendix C — Test plan:</w:t>
       </w:r>
       <w:r>
@@ -14327,7 +14262,7 @@
         <w:t xml:space="preserve"> passing), and §5 </w:t>
       </w:r>
       <w:r>
-        <w:t xml:space="preserve">(GitHub repository, commit history, Actions CI run). Full-resolution copies of every screenshot are also in </w:t>
+        <w:t xml:space="preserve">(GitHub repository, commit history). Full-resolution copies of every screenshot are also in </w:t>
       </w:r>
       <w:r>
         <w:rPr>
@@ -14442,10 +14377,10 @@
 <file path=word/numbering.xml><?xml version="1.0" encoding="utf-8"?>
 <w:numbering xmlns:wpc="http://schemas.microsoft.com/office/word/2010/wordprocessingCanvas" xmlns:cx="http://schemas.microsoft.com/office/drawing/2014/chartex" xmlns:cx1="http://schemas.microsoft.com/office/drawing/2015/9/8/chartex" xmlns:cx2="http://schemas.microsoft.com/office/drawing/2015/10/21/chartex" xmlns:cx3="http://schemas.microsoft.com/office/drawing/2016/5/9/chartex" xmlns:cx4="http://schemas.microsoft.com/office/drawing/2016/5/10/chartex" xmlns:cx5="http://schemas.microsoft.com/office/drawing/2016/5/11/chartex" xmlns:cx6="http://schemas.microsoft.com/office/drawing/2016/5/12/chartex" xmlns:cx7="http://schemas.microsoft.com/office/drawing/2016/5/13/chartex" xmlns:cx8="http://schemas.microsoft.com/office/drawing/2016/5/14/chartex" xmlns:mc="http://schemas.openxmlformats.org/markup-compatibility/2006" xmlns:aink="http://schemas.microsoft.com/office/drawing/2016/ink" xmlns:am3d="http://schemas.microsoft.com/office/drawing/2017/model3d" xmlns:o="urn:schemas-microsoft-com:office:office" xmlns:oel="http://schemas.microsoft.com/office/2019/extlst" xmlns:r="http://schemas.openxmlformats.org/officeDocument/2006/relationships" xmlns:m="http://schemas.openxmlformats.org/officeDocument/2006/math" xmlns:v="urn:schemas-microsoft-com:vml" xmlns:wp14="http://schemas.microsoft.com/office/word/2010/wordprocessingDrawing" xmlns:wp="http://schemas.openxmlformats.org/drawingml/2006/wordprocessingDrawing" xmlns:w10="urn:schemas-microsoft-com:office:word" xmlns:w="http://schemas.openxmlformats.org/wordprocessingml/2006/main" xmlns:w14="http://schemas.microsoft.com/office/word/2010/wordml" xmlns:w15="http://schemas.microsoft.com/office/word/2012/wordml" xmlns:w16cex="http://schemas.microsoft.com/office/word/2018/wordml/cex" xmlns:w16cid="http://schemas.microsoft.com/office/word/2016/wordml/cid" xmlns:w16="http://schemas.microsoft.com/office/word/2018/wordml" xmlns:w16du="http://schemas.microsoft.com/office/word/2023/wordml/word16du" xmlns:w16sdtdh="http://schemas.microsoft.com/office/word/2020/wordml/sdtdatahash" xmlns:w16sdtfl="http://schemas.microsoft.com/office/word/2024/wordml/sdtformatlock" xmlns:w16se="http://schemas.microsoft.com/office/word/2015/wordml/symex" xmlns:wpg="http://schemas.microsoft.com/office/word/2010/wordprocessingGroup" xmlns:wpi="http://schemas.microsoft.com/office/word/2010/wordprocessingInk" xmlns:wne="http://schemas.microsoft.com/office/word/2006/wordml" xmlns:wps="http://schemas.microsoft.com/office/word/2010/wordprocessingShape" mc:Ignorable="w14 w15 w16se w16cid w16 w16cex w16sdtdh w16sdtfl w16du wp14">
   <w:abstractNum w:abstractNumId="0" w15:restartNumberingAfterBreak="0">
-    <w:nsid w:val="5CB8506C"/>
+    <w:nsid w:val="339E0398"/>
     <w:multiLevelType w:val="hybridMultilevel"/>
-    <w:tmpl w:val="E9A62530"/>
-    <w:lvl w:ilvl="0" w:tplc="305205EC">
+    <w:tmpl w:val="93968C98"/>
+    <w:lvl w:ilvl="0" w:tplc="2BB42514">
       <w:start w:val="1"/>
       <w:numFmt w:val="bullet"/>
       <w:lvlText w:val="●"/>
@@ -14454,7 +14389,7 @@
         <w:ind w:left="720" w:hanging="360"/>
       </w:pPr>
     </w:lvl>
-    <w:lvl w:ilvl="1" w:tplc="7E72531A">
+    <w:lvl w:ilvl="1" w:tplc="F67C8776">
       <w:start w:val="1"/>
       <w:numFmt w:val="bullet"/>
       <w:lvlText w:val="○"/>
@@ -14463,7 +14398,7 @@
         <w:ind w:left="1440" w:hanging="360"/>
       </w:pPr>
     </w:lvl>
-    <w:lvl w:ilvl="2" w:tplc="6EA40148">
+    <w:lvl w:ilvl="2" w:tplc="48E610DE">
       <w:start w:val="1"/>
       <w:numFmt w:val="bullet"/>
       <w:lvlText w:val="■"/>
@@ -14472,7 +14407,7 @@
         <w:ind w:left="2160" w:hanging="360"/>
       </w:pPr>
     </w:lvl>
-    <w:lvl w:ilvl="3" w:tplc="7004B9B6">
+    <w:lvl w:ilvl="3" w:tplc="864A4DD4">
       <w:start w:val="1"/>
       <w:numFmt w:val="bullet"/>
       <w:lvlText w:val="●"/>
@@ -14481,7 +14416,7 @@
         <w:ind w:left="2880" w:hanging="360"/>
       </w:pPr>
     </w:lvl>
-    <w:lvl w:ilvl="4" w:tplc="29425728">
+    <w:lvl w:ilvl="4" w:tplc="4F527E36">
       <w:start w:val="1"/>
       <w:numFmt w:val="bullet"/>
       <w:lvlText w:val="○"/>
@@ -14490,7 +14425,7 @@
         <w:ind w:left="3600" w:hanging="360"/>
       </w:pPr>
     </w:lvl>
-    <w:lvl w:ilvl="5" w:tplc="065E84A2">
+    <w:lvl w:ilvl="5" w:tplc="45844C2E">
       <w:start w:val="1"/>
       <w:numFmt w:val="bullet"/>
       <w:lvlText w:val="■"/>
@@ -14499,7 +14434,7 @@
         <w:ind w:left="4320" w:hanging="360"/>
       </w:pPr>
     </w:lvl>
-    <w:lvl w:ilvl="6" w:tplc="AECAEAF0">
+    <w:lvl w:ilvl="6" w:tplc="DCAE7E16">
       <w:start w:val="1"/>
       <w:numFmt w:val="bullet"/>
       <w:lvlText w:val="●"/>
@@ -14508,7 +14443,7 @@
         <w:ind w:left="5040" w:hanging="360"/>
       </w:pPr>
     </w:lvl>
-    <w:lvl w:ilvl="7" w:tplc="AE6C10F8">
+    <w:lvl w:ilvl="7" w:tplc="7450AB56">
       <w:start w:val="1"/>
       <w:numFmt w:val="bullet"/>
       <w:lvlText w:val="●"/>
@@ -14517,7 +14452,7 @@
         <w:ind w:left="5760" w:hanging="360"/>
       </w:pPr>
     </w:lvl>
-    <w:lvl w:ilvl="8" w:tplc="41105948">
+    <w:lvl w:ilvl="8" w:tplc="B1FE1040">
       <w:start w:val="1"/>
       <w:numFmt w:val="bullet"/>
       <w:lvlText w:val="●"/>
@@ -14527,7 +14462,7 @@
       </w:pPr>
     </w:lvl>
   </w:abstractNum>
-  <w:num w:numId="1" w16cid:durableId="40250321">
+  <w:num w:numId="1" w16cid:durableId="2038962923">
     <w:abstractNumId w:val="0"/>
     <w:lvlOverride w:ilvl="0">
       <w:startOverride w:val="1"/>
@@ -15133,7 +15068,7 @@
     <w:basedOn w:val="Normal"/>
     <w:uiPriority w:val="1"/>
     <w:qFormat/>
-    <w:rsid w:val="004D27FB"/>
+    <w:rsid w:val="00925D4D"/>
     <w:pPr>
       <w:spacing w:after="160" w:line="279" w:lineRule="auto"/>
     </w:pPr>
@@ -15151,7 +15086,7 @@
     <w:autoRedefine/>
     <w:uiPriority w:val="39"/>
     <w:unhideWhenUsed/>
-    <w:rsid w:val="004D27FB"/>
+    <w:rsid w:val="00925D4D"/>
     <w:pPr>
       <w:spacing w:after="100"/>
       <w:ind w:left="240"/>
@@ -15164,7 +15099,7 @@
     <w:autoRedefine/>
     <w:uiPriority w:val="39"/>
     <w:unhideWhenUsed/>
-    <w:rsid w:val="004D27FB"/>
+    <w:rsid w:val="00925D4D"/>
     <w:pPr>
       <w:spacing w:after="100"/>
       <w:ind w:left="480"/>
@@ -15177,7 +15112,7 @@
     <w:autoRedefine/>
     <w:uiPriority w:val="39"/>
     <w:unhideWhenUsed/>
-    <w:rsid w:val="004D27FB"/>
+    <w:rsid w:val="00925D4D"/>
     <w:pPr>
       <w:spacing w:after="100"/>
       <w:ind w:left="720"/>

</xml_diff>